<commit_message>
Align CSE 3172 COs with BAETE taxonomy and condense print draft
- CO1: set up projects and mobile UIs (Psychomotor L3), PO5
- CO2: construct multi-screen apps (Psychomotor L4), PO5
- CO3 unchanged (Cognitive L6, PO3)
- Print draft: tick Web Material for all COs, Note book for CO2/CO3, Presentation for CO3
- Print draft: keep lab headings only; remove lab details, capstone tables, and Recommended Resources
- Lab 10 heading shortened; 'Textbooks' heading; Motivation full stop
- Markdown: 30/60/10 split, drop deprecated global expo-cli install
</commit_message>
<xml_diff>
--- a/48-CSE 3172_U.docx
+++ b/48-CSE 3172_U.docx
@@ -478,7 +478,7 @@
                 <w:szCs w:val="18"/>
                 <w:lang w:val="en"/>
               </w:rPr>
-              <w:t>Mobile applications are a primary mode of software use today. This course introduces React Native so students can extend their React.js knowledge to build cross-platform mobile apps with native UI, device APIs, and mobile deployment workflows</w:t>
+              <w:t>Mobile applications are a primary mode of software use today. This course introduces React Native so students can extend their React.js knowledge to build cross-platform mobile apps with native UI, device APIs, and mobile deployment workflows.</w:t>
             </w:r>
           </w:p>
         </w:tc>
@@ -858,7 +858,7 @@
                 <w:sz w:val="18"/>
                 <w:szCs w:val="18"/>
               </w:rPr>
-              <w:t xml:space="preserve"> a React Native / Expo project and apply React.js knowledge to mobile UI development</w:t>
+              <w:t xml:space="preserve"> React Native / Expo projects and mobile UIs using core components and Flexbox layouts</w:t>
             </w:r>
           </w:p>
         </w:tc>
@@ -946,7 +946,7 @@
                 <w:sz w:val="18"/>
                 <w:szCs w:val="18"/>
               </w:rPr>
-              <w:t>Cognitive domain – Level 3</w:t>
+              <w:t>Psychomotor domain – Level 3</w:t>
             </w:r>
           </w:p>
         </w:tc>
@@ -1075,7 +1075,7 @@
                 <w:szCs w:val="18"/>
                 <w:lang w:val="en"/>
               </w:rPr>
-              <w:t>☐</w:t>
+              <w:t>☒</w:t>
             </w:r>
             <w:r>
               <w:rPr>
@@ -1350,7 +1350,7 @@
                 <w:sz w:val="18"/>
                 <w:szCs w:val="18"/>
               </w:rPr>
-              <w:t>build</w:t>
+              <w:t>construct</w:t>
             </w:r>
             <w:r>
               <w:rPr>
@@ -1439,7 +1439,7 @@
                 <w:sz w:val="18"/>
                 <w:szCs w:val="18"/>
               </w:rPr>
-              <w:t>Cognitive domain – Level 6</w:t>
+              <w:t>Psychomotor domain – Level 4</w:t>
             </w:r>
           </w:p>
         </w:tc>
@@ -1568,7 +1568,7 @@
                 <w:szCs w:val="18"/>
                 <w:lang w:val="en"/>
               </w:rPr>
-              <w:t>☐</w:t>
+              <w:t>☒</w:t>
             </w:r>
             <w:r>
               <w:rPr>
@@ -1736,7 +1736,7 @@
                 <w:szCs w:val="18"/>
                 <w:lang w:val="en"/>
               </w:rPr>
-              <w:t>☐</w:t>
+              <w:t>☒</w:t>
             </w:r>
             <w:r>
               <w:rPr>
@@ -2061,7 +2061,7 @@
                 <w:szCs w:val="18"/>
                 <w:lang w:val="en"/>
               </w:rPr>
-              <w:t>☐</w:t>
+              <w:t>☒</w:t>
             </w:r>
             <w:r>
               <w:rPr>
@@ -2229,7 +2229,7 @@
                 <w:szCs w:val="18"/>
                 <w:lang w:val="en"/>
               </w:rPr>
-              <w:t>☐</w:t>
+              <w:t>☒</w:t>
             </w:r>
             <w:r>
               <w:rPr>
@@ -2258,7 +2258,7 @@
                 <w:szCs w:val="18"/>
                 <w:lang w:val="en"/>
               </w:rPr>
-              <w:t>☐</w:t>
+              <w:t>☒</w:t>
             </w:r>
             <w:r>
               <w:rPr>
@@ -2416,591 +2416,6 @@
     </w:p>
     <w:p>
       <w:pPr>
-        <w:pStyle w:val="ListBullet"/>
-        <w:tabs>
-          <w:tab w:val="clear" w:pos="360"/>
-          <w:tab w:val="num" w:pos="1152"/>
-        </w:tabs>
-        <w:spacing w:after="40"/>
-        <w:ind w:left="1080"/>
-        <w:rPr>
-          <w:rFonts w:cs="Arial"/>
-          <w:sz w:val="18"/>
-          <w:szCs w:val="18"/>
-        </w:rPr>
-      </w:pPr>
-      <w:r>
-        <w:rPr>
-          <w:rFonts w:cs="Arial"/>
-          <w:sz w:val="18"/>
-          <w:szCs w:val="18"/>
-        </w:rPr>
-        <w:t xml:space="preserve">Install Node.js, Expo CLI (npm install -g expo-cli), and the </w:t>
-      </w:r>
-      <w:r>
-        <w:rPr>
-          <w:rFonts w:cs="Arial"/>
-          <w:b/>
-          <w:sz w:val="18"/>
-          <w:szCs w:val="18"/>
-        </w:rPr>
-        <w:t>Expo Go</w:t>
-      </w:r>
-      <w:r>
-        <w:rPr>
-          <w:rFonts w:cs="Arial"/>
-          <w:sz w:val="18"/>
-          <w:szCs w:val="18"/>
-        </w:rPr>
-        <w:t xml:space="preserve"> app on a physical device</w:t>
-      </w:r>
-    </w:p>
-    <w:p>
-      <w:pPr>
-        <w:pStyle w:val="ListBullet"/>
-        <w:tabs>
-          <w:tab w:val="clear" w:pos="360"/>
-          <w:tab w:val="num" w:pos="432"/>
-        </w:tabs>
-        <w:spacing w:after="40"/>
-        <w:ind w:left="1080"/>
-        <w:rPr>
-          <w:rFonts w:cs="Arial"/>
-          <w:sz w:val="18"/>
-          <w:szCs w:val="18"/>
-        </w:rPr>
-      </w:pPr>
-      <w:r>
-        <w:rPr>
-          <w:rFonts w:cs="Arial"/>
-          <w:sz w:val="18"/>
-          <w:szCs w:val="18"/>
-        </w:rPr>
-        <w:t>Create a new project: npx create-expo-app MealExplorer</w:t>
-      </w:r>
-    </w:p>
-    <w:p>
-      <w:pPr>
-        <w:pStyle w:val="ListBullet"/>
-        <w:tabs>
-          <w:tab w:val="clear" w:pos="360"/>
-          <w:tab w:val="num" w:pos="432"/>
-        </w:tabs>
-        <w:spacing w:after="40"/>
-        <w:ind w:left="1080"/>
-        <w:rPr>
-          <w:rFonts w:cs="Arial"/>
-          <w:sz w:val="18"/>
-          <w:szCs w:val="18"/>
-        </w:rPr>
-      </w:pPr>
-      <w:r>
-        <w:rPr>
-          <w:rFonts w:cs="Arial"/>
-          <w:sz w:val="18"/>
-          <w:szCs w:val="18"/>
-        </w:rPr>
-        <w:t>Project structure: app.json, App.js, assets/, node_modules/</w:t>
-      </w:r>
-    </w:p>
-    <w:p>
-      <w:pPr>
-        <w:pStyle w:val="ListBullet"/>
-        <w:tabs>
-          <w:tab w:val="clear" w:pos="360"/>
-          <w:tab w:val="num" w:pos="432"/>
-        </w:tabs>
-        <w:spacing w:after="40"/>
-        <w:ind w:left="1080"/>
-        <w:rPr>
-          <w:rFonts w:cs="Arial"/>
-          <w:sz w:val="18"/>
-          <w:szCs w:val="18"/>
-        </w:rPr>
-      </w:pPr>
-      <w:r>
-        <w:rPr>
-          <w:rFonts w:cs="Arial"/>
-          <w:sz w:val="18"/>
-          <w:szCs w:val="18"/>
-        </w:rPr>
-        <w:t>React Native vs. React web — key differences:</w:t>
-      </w:r>
-    </w:p>
-    <w:tbl>
-      <w:tblPr>
-        <w:tblW w:w="0" w:type="auto"/>
-        <w:jc w:val="center"/>
-        <w:tblBorders>
-          <w:top w:val="single" w:sz="8" w:space="0" w:color="CFCFCF"/>
-          <w:left w:val="single" w:sz="8" w:space="0" w:color="CFCFCF"/>
-          <w:bottom w:val="single" w:sz="8" w:space="0" w:color="CFCFCF"/>
-          <w:right w:val="single" w:sz="8" w:space="0" w:color="CFCFCF"/>
-          <w:insideH w:val="single" w:sz="8" w:space="0" w:color="CFCFCF"/>
-          <w:insideV w:val="single" w:sz="8" w:space="0" w:color="CFCFCF"/>
-        </w:tblBorders>
-        <w:tblLook w:val="04A0" w:firstRow="1" w:lastRow="0" w:firstColumn="1" w:lastColumn="0" w:noHBand="0" w:noVBand="1"/>
-      </w:tblPr>
-      <w:tblGrid>
-        <w:gridCol w:w="2471"/>
-        <w:gridCol w:w="2581"/>
-      </w:tblGrid>
-      <w:tr>
-        <w:trPr>
-          <w:jc w:val="center"/>
-        </w:trPr>
-        <w:tc>
-          <w:tcPr>
-            <w:tcW w:w="0" w:type="auto"/>
-            <w:shd w:val="clear" w:color="auto" w:fill="F5F5F5"/>
-            <w:tcMar>
-              <w:top w:w="80" w:type="dxa"/>
-              <w:left w:w="100" w:type="dxa"/>
-              <w:bottom w:w="80" w:type="dxa"/>
-              <w:right w:w="100" w:type="dxa"/>
-            </w:tcMar>
-          </w:tcPr>
-          <w:p>
-            <w:pPr>
-              <w:spacing w:after="0"/>
-              <w:ind w:left="720"/>
-              <w:rPr>
-                <w:rFonts w:cs="Arial"/>
-                <w:sz w:val="18"/>
-                <w:szCs w:val="18"/>
-              </w:rPr>
-            </w:pPr>
-            <w:r>
-              <w:rPr>
-                <w:rFonts w:cs="Arial"/>
-                <w:b/>
-                <w:sz w:val="18"/>
-                <w:szCs w:val="18"/>
-              </w:rPr>
-              <w:t>React (Web)</w:t>
-            </w:r>
-          </w:p>
-        </w:tc>
-        <w:tc>
-          <w:tcPr>
-            <w:tcW w:w="0" w:type="auto"/>
-            <w:shd w:val="clear" w:color="auto" w:fill="F5F5F5"/>
-            <w:tcMar>
-              <w:top w:w="80" w:type="dxa"/>
-              <w:left w:w="100" w:type="dxa"/>
-              <w:bottom w:w="80" w:type="dxa"/>
-              <w:right w:w="100" w:type="dxa"/>
-            </w:tcMar>
-          </w:tcPr>
-          <w:p>
-            <w:pPr>
-              <w:spacing w:after="0"/>
-              <w:ind w:left="720"/>
-              <w:rPr>
-                <w:rFonts w:cs="Arial"/>
-                <w:sz w:val="18"/>
-                <w:szCs w:val="18"/>
-              </w:rPr>
-            </w:pPr>
-            <w:r>
-              <w:rPr>
-                <w:rFonts w:cs="Arial"/>
-                <w:b/>
-                <w:sz w:val="18"/>
-                <w:szCs w:val="18"/>
-              </w:rPr>
-              <w:t>React Native</w:t>
-            </w:r>
-          </w:p>
-        </w:tc>
-      </w:tr>
-      <w:tr>
-        <w:trPr>
-          <w:jc w:val="center"/>
-        </w:trPr>
-        <w:tc>
-          <w:tcPr>
-            <w:tcW w:w="0" w:type="auto"/>
-            <w:tcMar>
-              <w:top w:w="80" w:type="dxa"/>
-              <w:left w:w="100" w:type="dxa"/>
-              <w:bottom w:w="80" w:type="dxa"/>
-              <w:right w:w="100" w:type="dxa"/>
-            </w:tcMar>
-          </w:tcPr>
-          <w:p>
-            <w:pPr>
-              <w:spacing w:after="0"/>
-              <w:ind w:left="720"/>
-              <w:rPr>
-                <w:rFonts w:cs="Arial"/>
-                <w:sz w:val="18"/>
-                <w:szCs w:val="18"/>
-              </w:rPr>
-            </w:pPr>
-            <w:r>
-              <w:rPr>
-                <w:rFonts w:cs="Arial"/>
-                <w:sz w:val="18"/>
-                <w:szCs w:val="18"/>
-              </w:rPr>
-              <w:t>&lt;div&gt;</w:t>
-            </w:r>
-          </w:p>
-        </w:tc>
-        <w:tc>
-          <w:tcPr>
-            <w:tcW w:w="0" w:type="auto"/>
-            <w:tcMar>
-              <w:top w:w="80" w:type="dxa"/>
-              <w:left w:w="100" w:type="dxa"/>
-              <w:bottom w:w="80" w:type="dxa"/>
-              <w:right w:w="100" w:type="dxa"/>
-            </w:tcMar>
-          </w:tcPr>
-          <w:p>
-            <w:pPr>
-              <w:spacing w:after="0"/>
-              <w:ind w:left="720"/>
-              <w:rPr>
-                <w:rFonts w:cs="Arial"/>
-                <w:sz w:val="18"/>
-                <w:szCs w:val="18"/>
-              </w:rPr>
-            </w:pPr>
-            <w:r>
-              <w:rPr>
-                <w:rFonts w:cs="Arial"/>
-                <w:sz w:val="18"/>
-                <w:szCs w:val="18"/>
-              </w:rPr>
-              <w:t>&lt;View&gt;</w:t>
-            </w:r>
-          </w:p>
-        </w:tc>
-      </w:tr>
-      <w:tr>
-        <w:trPr>
-          <w:jc w:val="center"/>
-        </w:trPr>
-        <w:tc>
-          <w:tcPr>
-            <w:tcW w:w="0" w:type="auto"/>
-            <w:tcMar>
-              <w:top w:w="80" w:type="dxa"/>
-              <w:left w:w="100" w:type="dxa"/>
-              <w:bottom w:w="80" w:type="dxa"/>
-              <w:right w:w="100" w:type="dxa"/>
-            </w:tcMar>
-          </w:tcPr>
-          <w:p>
-            <w:pPr>
-              <w:spacing w:after="0"/>
-              <w:ind w:left="720"/>
-              <w:rPr>
-                <w:rFonts w:cs="Arial"/>
-                <w:sz w:val="18"/>
-                <w:szCs w:val="18"/>
-              </w:rPr>
-            </w:pPr>
-            <w:r>
-              <w:rPr>
-                <w:rFonts w:cs="Arial"/>
-                <w:sz w:val="18"/>
-                <w:szCs w:val="18"/>
-              </w:rPr>
-              <w:t>&lt;p&gt;, &lt;span&gt;</w:t>
-            </w:r>
-          </w:p>
-        </w:tc>
-        <w:tc>
-          <w:tcPr>
-            <w:tcW w:w="0" w:type="auto"/>
-            <w:tcMar>
-              <w:top w:w="80" w:type="dxa"/>
-              <w:left w:w="100" w:type="dxa"/>
-              <w:bottom w:w="80" w:type="dxa"/>
-              <w:right w:w="100" w:type="dxa"/>
-            </w:tcMar>
-          </w:tcPr>
-          <w:p>
-            <w:pPr>
-              <w:spacing w:after="0"/>
-              <w:ind w:left="720"/>
-              <w:rPr>
-                <w:rFonts w:cs="Arial"/>
-                <w:sz w:val="18"/>
-                <w:szCs w:val="18"/>
-              </w:rPr>
-            </w:pPr>
-            <w:r>
-              <w:rPr>
-                <w:rFonts w:cs="Arial"/>
-                <w:sz w:val="18"/>
-                <w:szCs w:val="18"/>
-              </w:rPr>
-              <w:t>&lt;Text&gt;</w:t>
-            </w:r>
-          </w:p>
-        </w:tc>
-      </w:tr>
-      <w:tr>
-        <w:trPr>
-          <w:jc w:val="center"/>
-        </w:trPr>
-        <w:tc>
-          <w:tcPr>
-            <w:tcW w:w="0" w:type="auto"/>
-            <w:tcMar>
-              <w:top w:w="80" w:type="dxa"/>
-              <w:left w:w="100" w:type="dxa"/>
-              <w:bottom w:w="80" w:type="dxa"/>
-              <w:right w:w="100" w:type="dxa"/>
-            </w:tcMar>
-          </w:tcPr>
-          <w:p>
-            <w:pPr>
-              <w:spacing w:after="0"/>
-              <w:ind w:left="720"/>
-              <w:rPr>
-                <w:rFonts w:cs="Arial"/>
-                <w:sz w:val="18"/>
-                <w:szCs w:val="18"/>
-              </w:rPr>
-            </w:pPr>
-            <w:r>
-              <w:rPr>
-                <w:rFonts w:cs="Arial"/>
-                <w:sz w:val="18"/>
-                <w:szCs w:val="18"/>
-              </w:rPr>
-              <w:t>&lt;img&gt;</w:t>
-            </w:r>
-          </w:p>
-        </w:tc>
-        <w:tc>
-          <w:tcPr>
-            <w:tcW w:w="0" w:type="auto"/>
-            <w:tcMar>
-              <w:top w:w="80" w:type="dxa"/>
-              <w:left w:w="100" w:type="dxa"/>
-              <w:bottom w:w="80" w:type="dxa"/>
-              <w:right w:w="100" w:type="dxa"/>
-            </w:tcMar>
-          </w:tcPr>
-          <w:p>
-            <w:pPr>
-              <w:spacing w:after="0"/>
-              <w:ind w:left="720"/>
-              <w:rPr>
-                <w:rFonts w:cs="Arial"/>
-                <w:sz w:val="18"/>
-                <w:szCs w:val="18"/>
-              </w:rPr>
-            </w:pPr>
-            <w:r>
-              <w:rPr>
-                <w:rFonts w:cs="Arial"/>
-                <w:sz w:val="18"/>
-                <w:szCs w:val="18"/>
-              </w:rPr>
-              <w:t>&lt;Image&gt;</w:t>
-            </w:r>
-          </w:p>
-        </w:tc>
-      </w:tr>
-      <w:tr>
-        <w:trPr>
-          <w:jc w:val="center"/>
-        </w:trPr>
-        <w:tc>
-          <w:tcPr>
-            <w:tcW w:w="0" w:type="auto"/>
-            <w:tcMar>
-              <w:top w:w="80" w:type="dxa"/>
-              <w:left w:w="100" w:type="dxa"/>
-              <w:bottom w:w="80" w:type="dxa"/>
-              <w:right w:w="100" w:type="dxa"/>
-            </w:tcMar>
-          </w:tcPr>
-          <w:p>
-            <w:pPr>
-              <w:spacing w:after="0"/>
-              <w:ind w:left="720"/>
-              <w:rPr>
-                <w:rFonts w:cs="Arial"/>
-                <w:sz w:val="18"/>
-                <w:szCs w:val="18"/>
-              </w:rPr>
-            </w:pPr>
-            <w:r>
-              <w:rPr>
-                <w:rFonts w:cs="Arial"/>
-                <w:sz w:val="18"/>
-                <w:szCs w:val="18"/>
-              </w:rPr>
-              <w:lastRenderedPageBreak/>
-              <w:t>CSS files / Tailwind</w:t>
-            </w:r>
-          </w:p>
-        </w:tc>
-        <w:tc>
-          <w:tcPr>
-            <w:tcW w:w="0" w:type="auto"/>
-            <w:tcMar>
-              <w:top w:w="80" w:type="dxa"/>
-              <w:left w:w="100" w:type="dxa"/>
-              <w:bottom w:w="80" w:type="dxa"/>
-              <w:right w:w="100" w:type="dxa"/>
-            </w:tcMar>
-          </w:tcPr>
-          <w:p>
-            <w:pPr>
-              <w:spacing w:after="0"/>
-              <w:ind w:left="720"/>
-              <w:rPr>
-                <w:rFonts w:cs="Arial"/>
-                <w:sz w:val="18"/>
-                <w:szCs w:val="18"/>
-              </w:rPr>
-            </w:pPr>
-            <w:r>
-              <w:rPr>
-                <w:rFonts w:cs="Arial"/>
-                <w:sz w:val="18"/>
-                <w:szCs w:val="18"/>
-              </w:rPr>
-              <w:t>StyleSheet.create({})</w:t>
-            </w:r>
-          </w:p>
-        </w:tc>
-      </w:tr>
-      <w:tr>
-        <w:trPr>
-          <w:jc w:val="center"/>
-        </w:trPr>
-        <w:tc>
-          <w:tcPr>
-            <w:tcW w:w="0" w:type="auto"/>
-            <w:tcMar>
-              <w:top w:w="80" w:type="dxa"/>
-              <w:left w:w="100" w:type="dxa"/>
-              <w:bottom w:w="80" w:type="dxa"/>
-              <w:right w:w="100" w:type="dxa"/>
-            </w:tcMar>
-          </w:tcPr>
-          <w:p>
-            <w:pPr>
-              <w:spacing w:after="0"/>
-              <w:ind w:left="720"/>
-              <w:rPr>
-                <w:rFonts w:cs="Arial"/>
-                <w:sz w:val="18"/>
-                <w:szCs w:val="18"/>
-              </w:rPr>
-            </w:pPr>
-            <w:r>
-              <w:rPr>
-                <w:rFonts w:cs="Arial"/>
-                <w:sz w:val="18"/>
-                <w:szCs w:val="18"/>
-              </w:rPr>
-              <w:t>onClick</w:t>
-            </w:r>
-          </w:p>
-        </w:tc>
-        <w:tc>
-          <w:tcPr>
-            <w:tcW w:w="0" w:type="auto"/>
-            <w:tcMar>
-              <w:top w:w="80" w:type="dxa"/>
-              <w:left w:w="100" w:type="dxa"/>
-              <w:bottom w:w="80" w:type="dxa"/>
-              <w:right w:w="100" w:type="dxa"/>
-            </w:tcMar>
-          </w:tcPr>
-          <w:p>
-            <w:pPr>
-              <w:spacing w:after="0"/>
-              <w:ind w:left="720"/>
-              <w:rPr>
-                <w:rFonts w:cs="Arial"/>
-                <w:sz w:val="18"/>
-                <w:szCs w:val="18"/>
-              </w:rPr>
-            </w:pPr>
-            <w:r>
-              <w:rPr>
-                <w:rFonts w:cs="Arial"/>
-                <w:sz w:val="18"/>
-                <w:szCs w:val="18"/>
-              </w:rPr>
-              <w:t>onPress</w:t>
-            </w:r>
-          </w:p>
-        </w:tc>
-      </w:tr>
-    </w:tbl>
-    <w:p>
-      <w:pPr>
-        <w:ind w:left="792"/>
-        <w:rPr>
-          <w:rFonts w:cs="Arial"/>
-          <w:sz w:val="18"/>
-          <w:szCs w:val="18"/>
-        </w:rPr>
-      </w:pPr>
-    </w:p>
-    <w:p>
-      <w:pPr>
-        <w:pStyle w:val="ListBullet"/>
-        <w:tabs>
-          <w:tab w:val="clear" w:pos="360"/>
-          <w:tab w:val="num" w:pos="432"/>
-        </w:tabs>
-        <w:spacing w:after="40"/>
-        <w:ind w:left="1080"/>
-        <w:rPr>
-          <w:rFonts w:cs="Arial"/>
-          <w:sz w:val="18"/>
-          <w:szCs w:val="18"/>
-        </w:rPr>
-      </w:pPr>
-      <w:r>
-        <w:rPr>
-          <w:rFonts w:cs="Arial"/>
-          <w:sz w:val="18"/>
-          <w:szCs w:val="18"/>
-        </w:rPr>
-        <w:t>Run on device via Expo Go (scan QR code) and on emulator (Android Studio AVD / iOS Simulator)</w:t>
-      </w:r>
-    </w:p>
-    <w:p>
-      <w:pPr>
-        <w:pStyle w:val="ListBullet"/>
-        <w:tabs>
-          <w:tab w:val="clear" w:pos="360"/>
-          <w:tab w:val="num" w:pos="432"/>
-        </w:tabs>
-        <w:spacing w:after="40"/>
-        <w:ind w:left="1080"/>
-        <w:rPr>
-          <w:rFonts w:cs="Arial"/>
-          <w:sz w:val="18"/>
-          <w:szCs w:val="18"/>
-        </w:rPr>
-      </w:pPr>
-      <w:r>
-        <w:rPr>
-          <w:rFonts w:cs="Arial"/>
-          <w:sz w:val="18"/>
-          <w:szCs w:val="18"/>
-        </w:rPr>
-        <w:t>Hot reload and fast refresh workflow</w:t>
-      </w:r>
-    </w:p>
-    <w:p>
-      <w:pPr>
         <w:pStyle w:val="CustomHeading2"/>
         <w:ind w:left="720"/>
         <w:rPr>
@@ -3016,102 +2431,6 @@
           <w:szCs w:val="18"/>
         </w:rPr>
         <w:t>Lab 2 — Core Components and Layouts</w:t>
-      </w:r>
-    </w:p>
-    <w:p>
-      <w:pPr>
-        <w:pStyle w:val="ListBullet"/>
-        <w:tabs>
-          <w:tab w:val="clear" w:pos="360"/>
-          <w:tab w:val="num" w:pos="432"/>
-        </w:tabs>
-        <w:spacing w:after="40"/>
-        <w:ind w:left="1080"/>
-        <w:rPr>
-          <w:rFonts w:cs="Arial"/>
-          <w:sz w:val="18"/>
-          <w:szCs w:val="18"/>
-        </w:rPr>
-      </w:pPr>
-      <w:r>
-        <w:rPr>
-          <w:rFonts w:cs="Arial"/>
-          <w:sz w:val="18"/>
-          <w:szCs w:val="18"/>
-        </w:rPr>
-        <w:t>&lt;View&gt;, &lt;Text&gt;, &lt;Image&gt;, &lt;TextInput&gt;, &lt;Button&gt;, &lt;Pressable&gt;, &lt;TouchableOpacity&gt;</w:t>
-      </w:r>
-    </w:p>
-    <w:p>
-      <w:pPr>
-        <w:pStyle w:val="ListBullet"/>
-        <w:tabs>
-          <w:tab w:val="clear" w:pos="360"/>
-          <w:tab w:val="num" w:pos="432"/>
-        </w:tabs>
-        <w:spacing w:after="40"/>
-        <w:ind w:left="1080"/>
-        <w:rPr>
-          <w:rFonts w:cs="Arial"/>
-          <w:sz w:val="18"/>
-          <w:szCs w:val="18"/>
-        </w:rPr>
-      </w:pPr>
-      <w:r>
-        <w:rPr>
-          <w:rFonts w:cs="Arial"/>
-          <w:sz w:val="18"/>
-          <w:szCs w:val="18"/>
-        </w:rPr>
-        <w:t>Scrollable content: &lt;ScrollView&gt; vs. &lt;FlatList&gt; (performance difference, keyExtractor, renderItem)</w:t>
-      </w:r>
-    </w:p>
-    <w:p>
-      <w:pPr>
-        <w:pStyle w:val="ListBullet"/>
-        <w:tabs>
-          <w:tab w:val="clear" w:pos="360"/>
-          <w:tab w:val="num" w:pos="432"/>
-        </w:tabs>
-        <w:spacing w:after="40"/>
-        <w:ind w:left="1080"/>
-        <w:rPr>
-          <w:rFonts w:cs="Arial"/>
-          <w:sz w:val="18"/>
-          <w:szCs w:val="18"/>
-        </w:rPr>
-      </w:pPr>
-      <w:r>
-        <w:rPr>
-          <w:rFonts w:cs="Arial"/>
-          <w:sz w:val="18"/>
-          <w:szCs w:val="18"/>
-        </w:rPr>
-        <w:t>&lt;SafeAreaView&gt; and handling notches/status bars</w:t>
-      </w:r>
-    </w:p>
-    <w:p>
-      <w:pPr>
-        <w:pStyle w:val="ListBullet"/>
-        <w:tabs>
-          <w:tab w:val="clear" w:pos="360"/>
-          <w:tab w:val="num" w:pos="432"/>
-        </w:tabs>
-        <w:spacing w:after="40"/>
-        <w:ind w:left="1080"/>
-        <w:rPr>
-          <w:rFonts w:cs="Arial"/>
-          <w:sz w:val="18"/>
-          <w:szCs w:val="18"/>
-        </w:rPr>
-      </w:pPr>
-      <w:r>
-        <w:rPr>
-          <w:rFonts w:cs="Arial"/>
-          <w:sz w:val="18"/>
-          <w:szCs w:val="18"/>
-        </w:rPr>
-        <w:t>&lt;StatusBar&gt; customisation</w:t>
       </w:r>
     </w:p>
     <w:p>
@@ -3135,126 +2454,6 @@
     </w:p>
     <w:p>
       <w:pPr>
-        <w:pStyle w:val="ListBullet"/>
-        <w:tabs>
-          <w:tab w:val="clear" w:pos="360"/>
-          <w:tab w:val="num" w:pos="432"/>
-        </w:tabs>
-        <w:spacing w:after="40"/>
-        <w:ind w:left="1080"/>
-        <w:rPr>
-          <w:rFonts w:cs="Arial"/>
-          <w:sz w:val="18"/>
-          <w:szCs w:val="18"/>
-        </w:rPr>
-      </w:pPr>
-      <w:r>
-        <w:rPr>
-          <w:rFonts w:cs="Arial"/>
-          <w:sz w:val="18"/>
-          <w:szCs w:val="18"/>
-        </w:rPr>
-        <w:t>StyleSheet.create(): why it is preferred over inline styles</w:t>
-      </w:r>
-    </w:p>
-    <w:p>
-      <w:pPr>
-        <w:pStyle w:val="ListBullet"/>
-        <w:tabs>
-          <w:tab w:val="clear" w:pos="360"/>
-          <w:tab w:val="num" w:pos="432"/>
-        </w:tabs>
-        <w:spacing w:after="40"/>
-        <w:ind w:left="1080"/>
-        <w:rPr>
-          <w:rFonts w:cs="Arial"/>
-          <w:sz w:val="18"/>
-          <w:szCs w:val="18"/>
-        </w:rPr>
-      </w:pPr>
-      <w:r>
-        <w:rPr>
-          <w:rFonts w:cs="Arial"/>
-          <w:sz w:val="18"/>
-          <w:szCs w:val="18"/>
-        </w:rPr>
-        <w:t>React Native Flexbox: flexDirection defaults to column (unlike CSS); justifyContent, alignItems, flex</w:t>
-      </w:r>
-    </w:p>
-    <w:p>
-      <w:pPr>
-        <w:pStyle w:val="ListBullet"/>
-        <w:tabs>
-          <w:tab w:val="clear" w:pos="360"/>
-          <w:tab w:val="num" w:pos="432"/>
-        </w:tabs>
-        <w:spacing w:after="40"/>
-        <w:ind w:left="1080"/>
-        <w:rPr>
-          <w:rFonts w:cs="Arial"/>
-          <w:sz w:val="18"/>
-          <w:szCs w:val="18"/>
-        </w:rPr>
-      </w:pPr>
-      <w:r>
-        <w:rPr>
-          <w:rFonts w:cs="Arial"/>
-          <w:sz w:val="18"/>
-          <w:szCs w:val="18"/>
-        </w:rPr>
-        <w:t>Dimensions API: Dimensions.get('window') for responsive sizing</w:t>
-      </w:r>
-    </w:p>
-    <w:p>
-      <w:pPr>
-        <w:pStyle w:val="ListBullet"/>
-        <w:tabs>
-          <w:tab w:val="clear" w:pos="360"/>
-          <w:tab w:val="num" w:pos="432"/>
-        </w:tabs>
-        <w:spacing w:after="40"/>
-        <w:ind w:left="1080"/>
-        <w:rPr>
-          <w:rFonts w:cs="Arial"/>
-          <w:sz w:val="18"/>
-          <w:szCs w:val="18"/>
-        </w:rPr>
-      </w:pPr>
-      <w:r>
-        <w:rPr>
-          <w:rFonts w:cs="Arial"/>
-          <w:sz w:val="18"/>
-          <w:szCs w:val="18"/>
-        </w:rPr>
-        <w:t>Platform-specific styles: Platform.OS, Platform.select({})</w:t>
-      </w:r>
-    </w:p>
-    <w:p>
-      <w:pPr>
-        <w:pStyle w:val="ListBullet"/>
-        <w:tabs>
-          <w:tab w:val="clear" w:pos="360"/>
-          <w:tab w:val="num" w:pos="432"/>
-        </w:tabs>
-        <w:spacing w:after="40"/>
-        <w:ind w:left="1080"/>
-        <w:rPr>
-          <w:rFonts w:cs="Arial"/>
-          <w:sz w:val="18"/>
-          <w:szCs w:val="18"/>
-        </w:rPr>
-      </w:pPr>
-      <w:r>
-        <w:rPr>
-          <w:rFonts w:cs="Arial"/>
-          <w:sz w:val="18"/>
-          <w:szCs w:val="18"/>
-        </w:rPr>
-        <w:t>Styling exercise: recreate a mobile card layout matching a provided Figma mockup</w:t>
-      </w:r>
-    </w:p>
-    <w:p>
-      <w:pPr>
         <w:pStyle w:val="CustomHeading2"/>
         <w:ind w:left="720"/>
         <w:rPr>
@@ -3270,144 +2469,6 @@
           <w:szCs w:val="18"/>
         </w:rPr>
         <w:t>Lab 4 — Navigation with React Navigation</w:t>
-      </w:r>
-    </w:p>
-    <w:p>
-      <w:pPr>
-        <w:pStyle w:val="ListBullet"/>
-        <w:tabs>
-          <w:tab w:val="clear" w:pos="360"/>
-          <w:tab w:val="num" w:pos="432"/>
-        </w:tabs>
-        <w:spacing w:after="40"/>
-        <w:ind w:left="1080"/>
-        <w:rPr>
-          <w:rFonts w:cs="Arial"/>
-          <w:sz w:val="18"/>
-          <w:szCs w:val="18"/>
-        </w:rPr>
-      </w:pPr>
-      <w:r>
-        <w:rPr>
-          <w:rFonts w:cs="Arial"/>
-          <w:sz w:val="18"/>
-          <w:szCs w:val="18"/>
-        </w:rPr>
-        <w:t>Install React Navigation: @react-navigation/native, @react-navigation/stack, @react-navigation/bottom-tabs</w:t>
-      </w:r>
-    </w:p>
-    <w:p>
-      <w:pPr>
-        <w:pStyle w:val="ListBullet"/>
-        <w:tabs>
-          <w:tab w:val="clear" w:pos="360"/>
-          <w:tab w:val="num" w:pos="432"/>
-        </w:tabs>
-        <w:spacing w:after="40"/>
-        <w:ind w:left="1080"/>
-        <w:rPr>
-          <w:rFonts w:cs="Arial"/>
-          <w:sz w:val="18"/>
-          <w:szCs w:val="18"/>
-        </w:rPr>
-      </w:pPr>
-      <w:r>
-        <w:rPr>
-          <w:rFonts w:cs="Arial"/>
-          <w:b/>
-          <w:sz w:val="18"/>
-          <w:szCs w:val="18"/>
-        </w:rPr>
-        <w:t>Stack Navigator:</w:t>
-      </w:r>
-      <w:r>
-        <w:rPr>
-          <w:rFonts w:cs="Arial"/>
-          <w:sz w:val="18"/>
-          <w:szCs w:val="18"/>
-        </w:rPr>
-        <w:t xml:space="preserve"> pushing and popping screens, passing params (route.params), header customisation</w:t>
-      </w:r>
-    </w:p>
-    <w:p>
-      <w:pPr>
-        <w:pStyle w:val="ListBullet"/>
-        <w:tabs>
-          <w:tab w:val="clear" w:pos="360"/>
-          <w:tab w:val="num" w:pos="432"/>
-        </w:tabs>
-        <w:spacing w:after="40"/>
-        <w:ind w:left="1080"/>
-        <w:rPr>
-          <w:rFonts w:cs="Arial"/>
-          <w:sz w:val="18"/>
-          <w:szCs w:val="18"/>
-        </w:rPr>
-      </w:pPr>
-      <w:r>
-        <w:rPr>
-          <w:rFonts w:cs="Arial"/>
-          <w:b/>
-          <w:sz w:val="18"/>
-          <w:szCs w:val="18"/>
-        </w:rPr>
-        <w:t>Bottom Tab Navigator:</w:t>
-      </w:r>
-      <w:r>
-        <w:rPr>
-          <w:rFonts w:cs="Arial"/>
-          <w:sz w:val="18"/>
-          <w:szCs w:val="18"/>
-        </w:rPr>
-        <w:t xml:space="preserve"> tab icons with @expo/vector-icons, active tab styling</w:t>
-      </w:r>
-    </w:p>
-    <w:p>
-      <w:pPr>
-        <w:pStyle w:val="ListBullet"/>
-        <w:tabs>
-          <w:tab w:val="clear" w:pos="360"/>
-          <w:tab w:val="num" w:pos="432"/>
-        </w:tabs>
-        <w:spacing w:after="40"/>
-        <w:ind w:left="1080"/>
-        <w:rPr>
-          <w:rFonts w:cs="Arial"/>
-          <w:sz w:val="18"/>
-          <w:szCs w:val="18"/>
-        </w:rPr>
-      </w:pPr>
-      <w:r>
-        <w:rPr>
-          <w:rFonts w:cs="Arial"/>
-          <w:sz w:val="18"/>
-          <w:szCs w:val="18"/>
-        </w:rPr>
-        <w:t>Combining navigators: a tab navigator where one tab contains a stack</w:t>
-      </w:r>
-    </w:p>
-    <w:p>
-      <w:pPr>
-        <w:pStyle w:val="ListBullet"/>
-        <w:tabs>
-          <w:tab w:val="clear" w:pos="360"/>
-          <w:tab w:val="num" w:pos="432"/>
-        </w:tabs>
-        <w:spacing w:after="40"/>
-        <w:ind w:left="1080"/>
-        <w:rPr>
-          <w:rFonts w:cs="Arial"/>
-          <w:sz w:val="18"/>
-          <w:szCs w:val="18"/>
-        </w:rPr>
-      </w:pPr>
-      <w:r>
-        <w:rPr>
-          <w:rFonts w:cs="Arial"/>
-          <w:sz w:val="18"/>
-          <w:szCs w:val="18"/>
-        </w:rPr>
-        <w:t>Navigation exercise: build a 3-screen app (Home → List → Detail) with back navigation</w:t>
       </w:r>
     </w:p>
     <w:p>
@@ -3431,126 +2492,6 @@
     </w:p>
     <w:p>
       <w:pPr>
-        <w:pStyle w:val="ListBullet"/>
-        <w:tabs>
-          <w:tab w:val="clear" w:pos="360"/>
-          <w:tab w:val="num" w:pos="432"/>
-        </w:tabs>
-        <w:spacing w:after="40"/>
-        <w:ind w:left="1080"/>
-        <w:rPr>
-          <w:rFonts w:cs="Arial"/>
-          <w:sz w:val="18"/>
-          <w:szCs w:val="18"/>
-        </w:rPr>
-      </w:pPr>
-      <w:r>
-        <w:rPr>
-          <w:rFonts w:cs="Arial"/>
-          <w:sz w:val="18"/>
-          <w:szCs w:val="18"/>
-        </w:rPr>
-        <w:t>Controlled &lt;TextInput&gt;: value, onChangeText, secureTextEntry, keyboardType</w:t>
-      </w:r>
-    </w:p>
-    <w:p>
-      <w:pPr>
-        <w:pStyle w:val="ListBullet"/>
-        <w:tabs>
-          <w:tab w:val="clear" w:pos="360"/>
-          <w:tab w:val="num" w:pos="432"/>
-        </w:tabs>
-        <w:spacing w:after="40"/>
-        <w:ind w:left="1080"/>
-        <w:rPr>
-          <w:rFonts w:cs="Arial"/>
-          <w:sz w:val="18"/>
-          <w:szCs w:val="18"/>
-        </w:rPr>
-      </w:pPr>
-      <w:r>
-        <w:rPr>
-          <w:rFonts w:cs="Arial"/>
-          <w:sz w:val="18"/>
-          <w:szCs w:val="18"/>
-        </w:rPr>
-        <w:t>KeyboardAvoidingView and ScrollView to prevent keyboard overlap</w:t>
-      </w:r>
-    </w:p>
-    <w:p>
-      <w:pPr>
-        <w:pStyle w:val="ListBullet"/>
-        <w:tabs>
-          <w:tab w:val="clear" w:pos="360"/>
-          <w:tab w:val="num" w:pos="432"/>
-        </w:tabs>
-        <w:spacing w:after="40"/>
-        <w:ind w:left="1080"/>
-        <w:rPr>
-          <w:rFonts w:cs="Arial"/>
-          <w:sz w:val="18"/>
-          <w:szCs w:val="18"/>
-        </w:rPr>
-      </w:pPr>
-      <w:r>
-        <w:rPr>
-          <w:rFonts w:cs="Arial"/>
-          <w:sz w:val="18"/>
-          <w:szCs w:val="18"/>
-        </w:rPr>
-        <w:t>Basic form validation in React Native (required fields, email format)</w:t>
-      </w:r>
-    </w:p>
-    <w:p>
-      <w:pPr>
-        <w:pStyle w:val="ListBullet"/>
-        <w:tabs>
-          <w:tab w:val="clear" w:pos="360"/>
-          <w:tab w:val="num" w:pos="432"/>
-        </w:tabs>
-        <w:spacing w:after="40"/>
-        <w:ind w:left="1080"/>
-        <w:rPr>
-          <w:rFonts w:cs="Arial"/>
-          <w:sz w:val="18"/>
-          <w:szCs w:val="18"/>
-        </w:rPr>
-      </w:pPr>
-      <w:r>
-        <w:rPr>
-          <w:rFonts w:cs="Arial"/>
-          <w:sz w:val="18"/>
-          <w:szCs w:val="18"/>
-        </w:rPr>
-        <w:t>Alert.alert() for native confirmation dialogs</w:t>
-      </w:r>
-    </w:p>
-    <w:p>
-      <w:pPr>
-        <w:pStyle w:val="ListBullet"/>
-        <w:tabs>
-          <w:tab w:val="clear" w:pos="360"/>
-          <w:tab w:val="num" w:pos="432"/>
-        </w:tabs>
-        <w:spacing w:after="40"/>
-        <w:ind w:left="1080"/>
-        <w:rPr>
-          <w:rFonts w:cs="Arial"/>
-          <w:sz w:val="18"/>
-          <w:szCs w:val="18"/>
-        </w:rPr>
-      </w:pPr>
-      <w:r>
-        <w:rPr>
-          <w:rFonts w:cs="Arial"/>
-          <w:sz w:val="18"/>
-          <w:szCs w:val="18"/>
-        </w:rPr>
-        <w:t>TouchableOpacity vs. Pressable: pressed state feedback</w:t>
-      </w:r>
-    </w:p>
-    <w:p>
-      <w:pPr>
         <w:pStyle w:val="CustomHeading2"/>
         <w:ind w:left="720"/>
         <w:rPr>
@@ -3566,144 +2507,6 @@
           <w:szCs w:val="18"/>
         </w:rPr>
         <w:t>Lab 6 — Fetching Data and Async State</w:t>
-      </w:r>
-    </w:p>
-    <w:p>
-      <w:pPr>
-        <w:pStyle w:val="ListBullet"/>
-        <w:tabs>
-          <w:tab w:val="clear" w:pos="360"/>
-          <w:tab w:val="num" w:pos="432"/>
-        </w:tabs>
-        <w:spacing w:after="40"/>
-        <w:ind w:left="1080"/>
-        <w:rPr>
-          <w:rFonts w:cs="Arial"/>
-          <w:sz w:val="18"/>
-          <w:szCs w:val="18"/>
-        </w:rPr>
-      </w:pPr>
-      <w:r>
-        <w:rPr>
-          <w:rFonts w:cs="Arial"/>
-          <w:sz w:val="18"/>
-          <w:szCs w:val="18"/>
-        </w:rPr>
-        <w:t>useEffect + fetch in React Native (same pattern as CSE 2232 web apps)</w:t>
-      </w:r>
-    </w:p>
-    <w:p>
-      <w:pPr>
-        <w:pStyle w:val="ListBullet"/>
-        <w:tabs>
-          <w:tab w:val="clear" w:pos="360"/>
-          <w:tab w:val="num" w:pos="432"/>
-        </w:tabs>
-        <w:spacing w:after="40"/>
-        <w:ind w:left="1080"/>
-        <w:rPr>
-          <w:rFonts w:cs="Arial"/>
-          <w:sz w:val="18"/>
-          <w:szCs w:val="18"/>
-        </w:rPr>
-      </w:pPr>
-      <w:r>
-        <w:rPr>
-          <w:rFonts w:cs="Arial"/>
-          <w:sz w:val="18"/>
-          <w:szCs w:val="18"/>
-        </w:rPr>
-        <w:t>ActivityIndicator for loading states; conditional rendering for errors and empty states</w:t>
-      </w:r>
-    </w:p>
-    <w:p>
-      <w:pPr>
-        <w:pStyle w:val="ListBullet"/>
-        <w:tabs>
-          <w:tab w:val="clear" w:pos="360"/>
-          <w:tab w:val="num" w:pos="432"/>
-        </w:tabs>
-        <w:spacing w:after="40"/>
-        <w:ind w:left="1080"/>
-        <w:rPr>
-          <w:rFonts w:cs="Arial"/>
-          <w:sz w:val="18"/>
-          <w:szCs w:val="18"/>
-        </w:rPr>
-      </w:pPr>
-      <w:r>
-        <w:rPr>
-          <w:rFonts w:cs="Arial"/>
-          <w:sz w:val="18"/>
-          <w:szCs w:val="18"/>
-        </w:rPr>
-        <w:t>FlatList with fetched data: refreshing prop + pull-to-refresh (onRefresh)</w:t>
-      </w:r>
-    </w:p>
-    <w:p>
-      <w:pPr>
-        <w:pStyle w:val="ListBullet"/>
-        <w:tabs>
-          <w:tab w:val="clear" w:pos="360"/>
-          <w:tab w:val="num" w:pos="432"/>
-        </w:tabs>
-        <w:spacing w:after="40"/>
-        <w:ind w:left="1080"/>
-        <w:rPr>
-          <w:rFonts w:cs="Arial"/>
-          <w:sz w:val="18"/>
-          <w:szCs w:val="18"/>
-        </w:rPr>
-      </w:pPr>
-      <w:r>
-        <w:rPr>
-          <w:rFonts w:cs="Arial"/>
-          <w:sz w:val="18"/>
-          <w:szCs w:val="18"/>
-        </w:rPr>
-        <w:t>Caching strategy: storing last-fetched result in useState to avoid redundant calls</w:t>
-      </w:r>
-    </w:p>
-    <w:p>
-      <w:pPr>
-        <w:pStyle w:val="ListBullet"/>
-        <w:tabs>
-          <w:tab w:val="clear" w:pos="360"/>
-          <w:tab w:val="num" w:pos="432"/>
-        </w:tabs>
-        <w:spacing w:after="40"/>
-        <w:ind w:left="1080"/>
-        <w:rPr>
-          <w:rFonts w:cs="Arial"/>
-          <w:sz w:val="18"/>
-          <w:szCs w:val="18"/>
-        </w:rPr>
-      </w:pPr>
-      <w:r>
-        <w:rPr>
-          <w:rFonts w:cs="Arial"/>
-          <w:sz w:val="18"/>
-          <w:szCs w:val="18"/>
-        </w:rPr>
-        <w:t xml:space="preserve">Practice: fetch and display a list from </w:t>
-      </w:r>
-      <w:r>
-        <w:rPr>
-          <w:rFonts w:cs="Arial"/>
-          <w:color w:val="0563C1"/>
-          <w:sz w:val="18"/>
-          <w:szCs w:val="18"/>
-          <w:u w:val="single"/>
-        </w:rPr>
-        <w:t>REST Countries API</w:t>
-      </w:r>
-      <w:r>
-        <w:rPr>
-          <w:rFonts w:cs="Arial"/>
-          <w:sz w:val="18"/>
-          <w:szCs w:val="18"/>
-        </w:rPr>
-        <w:t xml:space="preserve"> (https://restcountries.com/) with a search filter</w:t>
       </w:r>
     </w:p>
     <w:p>
@@ -3727,162 +2530,6 @@
     </w:p>
     <w:p>
       <w:pPr>
-        <w:pStyle w:val="ListBullet"/>
-        <w:tabs>
-          <w:tab w:val="clear" w:pos="360"/>
-          <w:tab w:val="num" w:pos="432"/>
-        </w:tabs>
-        <w:spacing w:after="40"/>
-        <w:ind w:left="1080"/>
-        <w:rPr>
-          <w:rFonts w:cs="Arial"/>
-          <w:sz w:val="18"/>
-          <w:szCs w:val="18"/>
-        </w:rPr>
-      </w:pPr>
-      <w:r>
-        <w:rPr>
-          <w:rFonts w:cs="Arial"/>
-          <w:b/>
-          <w:sz w:val="18"/>
-          <w:szCs w:val="18"/>
-        </w:rPr>
-        <w:t>Camera / Image Picker:</w:t>
-      </w:r>
-      <w:r>
-        <w:rPr>
-          <w:rFonts w:cs="Arial"/>
-          <w:sz w:val="18"/>
-          <w:szCs w:val="18"/>
-        </w:rPr>
-        <w:t xml:space="preserve"> expo-image-picker — request permissions, pick from gallery, capture photo, display result in &lt;Image&gt;</w:t>
-      </w:r>
-    </w:p>
-    <w:p>
-      <w:pPr>
-        <w:pStyle w:val="ListBullet"/>
-        <w:tabs>
-          <w:tab w:val="clear" w:pos="360"/>
-          <w:tab w:val="num" w:pos="432"/>
-        </w:tabs>
-        <w:spacing w:after="40"/>
-        <w:ind w:left="1080"/>
-        <w:rPr>
-          <w:rFonts w:cs="Arial"/>
-          <w:sz w:val="18"/>
-          <w:szCs w:val="18"/>
-        </w:rPr>
-      </w:pPr>
-      <w:r>
-        <w:rPr>
-          <w:rFonts w:cs="Arial"/>
-          <w:b/>
-          <w:sz w:val="18"/>
-          <w:szCs w:val="18"/>
-        </w:rPr>
-        <w:t>Location:</w:t>
-      </w:r>
-      <w:r>
-        <w:rPr>
-          <w:rFonts w:cs="Arial"/>
-          <w:sz w:val="18"/>
-          <w:szCs w:val="18"/>
-        </w:rPr>
-        <w:t xml:space="preserve"> expo-location — request foreground permission, getCurrentPositionAsync(), display coordinates</w:t>
-      </w:r>
-    </w:p>
-    <w:p>
-      <w:pPr>
-        <w:pStyle w:val="ListBullet"/>
-        <w:tabs>
-          <w:tab w:val="clear" w:pos="360"/>
-          <w:tab w:val="num" w:pos="432"/>
-        </w:tabs>
-        <w:spacing w:after="40"/>
-        <w:ind w:left="1080"/>
-        <w:rPr>
-          <w:rFonts w:cs="Arial"/>
-          <w:sz w:val="18"/>
-          <w:szCs w:val="18"/>
-        </w:rPr>
-      </w:pPr>
-      <w:r>
-        <w:rPr>
-          <w:rFonts w:cs="Arial"/>
-          <w:b/>
-          <w:sz w:val="18"/>
-          <w:szCs w:val="18"/>
-        </w:rPr>
-        <w:t>Permissions model:</w:t>
-      </w:r>
-      <w:r>
-        <w:rPr>
-          <w:rFonts w:cs="Arial"/>
-          <w:sz w:val="18"/>
-          <w:szCs w:val="18"/>
-        </w:rPr>
-        <w:t xml:space="preserve"> PermissionsAndroid vs. Expo permissions API; why permissions must be requested at runtime</w:t>
-      </w:r>
-    </w:p>
-    <w:p>
-      <w:pPr>
-        <w:pStyle w:val="ListBullet"/>
-        <w:tabs>
-          <w:tab w:val="clear" w:pos="360"/>
-          <w:tab w:val="num" w:pos="432"/>
-        </w:tabs>
-        <w:spacing w:after="40"/>
-        <w:ind w:left="1080"/>
-        <w:rPr>
-          <w:rFonts w:cs="Arial"/>
-          <w:sz w:val="18"/>
-          <w:szCs w:val="18"/>
-        </w:rPr>
-      </w:pPr>
-      <w:r>
-        <w:rPr>
-          <w:rFonts w:cs="Arial"/>
-          <w:b/>
-          <w:sz w:val="18"/>
-          <w:szCs w:val="18"/>
-        </w:rPr>
-        <w:t>Linking:</w:t>
-      </w:r>
-      <w:r>
-        <w:rPr>
-          <w:rFonts w:cs="Arial"/>
-          <w:sz w:val="18"/>
-          <w:szCs w:val="18"/>
-        </w:rPr>
-        <w:t xml:space="preserve"> Linking.openURL() to open maps, phone dialler, or external browser from within the app</w:t>
-      </w:r>
-    </w:p>
-    <w:p>
-      <w:pPr>
-        <w:pStyle w:val="ListBullet"/>
-        <w:tabs>
-          <w:tab w:val="clear" w:pos="360"/>
-          <w:tab w:val="num" w:pos="432"/>
-        </w:tabs>
-        <w:spacing w:after="40"/>
-        <w:ind w:left="1080"/>
-        <w:rPr>
-          <w:rFonts w:cs="Arial"/>
-          <w:sz w:val="18"/>
-          <w:szCs w:val="18"/>
-        </w:rPr>
-      </w:pPr>
-      <w:r>
-        <w:rPr>
-          <w:rFonts w:cs="Arial"/>
-          <w:sz w:val="18"/>
-          <w:szCs w:val="18"/>
-        </w:rPr>
-        <w:t>Exercise: build a "Location Card" screen that shows current coordinates and a static map link</w:t>
-      </w:r>
-    </w:p>
-    <w:p>
-      <w:pPr>
         <w:pStyle w:val="CustomHeading2"/>
         <w:ind w:left="720"/>
         <w:rPr>
@@ -3898,97 +2545,6 @@
           <w:szCs w:val="18"/>
         </w:rPr>
         <w:t>Lab 8 — Notifications and Local Storage</w:t>
-      </w:r>
-    </w:p>
-    <w:p>
-      <w:pPr>
-        <w:pStyle w:val="ListBullet"/>
-        <w:tabs>
-          <w:tab w:val="clear" w:pos="360"/>
-          <w:tab w:val="num" w:pos="432"/>
-        </w:tabs>
-        <w:spacing w:after="40"/>
-        <w:ind w:left="1080"/>
-        <w:rPr>
-          <w:rFonts w:cs="Arial"/>
-          <w:sz w:val="18"/>
-          <w:szCs w:val="18"/>
-        </w:rPr>
-      </w:pPr>
-      <w:r>
-        <w:rPr>
-          <w:rFonts w:cs="Arial"/>
-          <w:b/>
-          <w:sz w:val="18"/>
-          <w:szCs w:val="18"/>
-        </w:rPr>
-        <w:lastRenderedPageBreak/>
-        <w:t>Push Notifications:</w:t>
-      </w:r>
-      <w:r>
-        <w:rPr>
-          <w:rFonts w:cs="Arial"/>
-          <w:sz w:val="18"/>
-          <w:szCs w:val="18"/>
-        </w:rPr>
-        <w:t xml:space="preserve"> expo-notifications — scheduling a local notification, notification channels (Android), foreground notification handler</w:t>
-      </w:r>
-    </w:p>
-    <w:p>
-      <w:pPr>
-        <w:pStyle w:val="ListBullet"/>
-        <w:tabs>
-          <w:tab w:val="clear" w:pos="360"/>
-          <w:tab w:val="num" w:pos="432"/>
-        </w:tabs>
-        <w:spacing w:after="40"/>
-        <w:ind w:left="1080"/>
-        <w:rPr>
-          <w:rFonts w:cs="Arial"/>
-          <w:sz w:val="18"/>
-          <w:szCs w:val="18"/>
-        </w:rPr>
-      </w:pPr>
-      <w:r>
-        <w:rPr>
-          <w:rFonts w:cs="Arial"/>
-          <w:b/>
-          <w:sz w:val="18"/>
-          <w:szCs w:val="18"/>
-        </w:rPr>
-        <w:t>AsyncStorage:</w:t>
-      </w:r>
-      <w:r>
-        <w:rPr>
-          <w:rFonts w:cs="Arial"/>
-          <w:sz w:val="18"/>
-          <w:szCs w:val="18"/>
-        </w:rPr>
-        <w:t xml:space="preserve"> @react-native-async-storage/async-storage — setItem, getItem, removeItem for persisting lightweight data (e.g., user favourites, last-visited screen)</w:t>
-      </w:r>
-    </w:p>
-    <w:p>
-      <w:pPr>
-        <w:pStyle w:val="ListBullet"/>
-        <w:tabs>
-          <w:tab w:val="clear" w:pos="360"/>
-          <w:tab w:val="num" w:pos="432"/>
-        </w:tabs>
-        <w:spacing w:after="40"/>
-        <w:ind w:left="1080"/>
-        <w:rPr>
-          <w:rFonts w:cs="Arial"/>
-          <w:sz w:val="18"/>
-          <w:szCs w:val="18"/>
-        </w:rPr>
-      </w:pPr>
-      <w:r>
-        <w:rPr>
-          <w:rFonts w:cs="Arial"/>
-          <w:sz w:val="18"/>
-          <w:szCs w:val="18"/>
-        </w:rPr>
-        <w:t>Exercise: add a "Save to Favourites" feature using AsyncStorage; show saved items on a dedicated Favourites screen</w:t>
       </w:r>
     </w:p>
     <w:p>
@@ -4012,191 +2568,6 @@
     </w:p>
     <w:p>
       <w:pPr>
-        <w:pStyle w:val="ListBullet"/>
-        <w:tabs>
-          <w:tab w:val="clear" w:pos="360"/>
-          <w:tab w:val="num" w:pos="432"/>
-        </w:tabs>
-        <w:spacing w:after="40"/>
-        <w:ind w:left="1080"/>
-        <w:rPr>
-          <w:rFonts w:cs="Arial"/>
-          <w:sz w:val="18"/>
-          <w:szCs w:val="18"/>
-        </w:rPr>
-      </w:pPr>
-      <w:r>
-        <w:rPr>
-          <w:rFonts w:cs="Arial"/>
-          <w:sz w:val="18"/>
-          <w:szCs w:val="18"/>
-        </w:rPr>
-        <w:t>What EAS (Expo Application Services) is and why it replaces expo build</w:t>
-      </w:r>
-    </w:p>
-    <w:p>
-      <w:pPr>
-        <w:pStyle w:val="ListBullet"/>
-        <w:tabs>
-          <w:tab w:val="clear" w:pos="360"/>
-          <w:tab w:val="num" w:pos="432"/>
-        </w:tabs>
-        <w:spacing w:after="40"/>
-        <w:ind w:left="1080"/>
-        <w:rPr>
-          <w:rFonts w:cs="Arial"/>
-          <w:sz w:val="18"/>
-          <w:szCs w:val="18"/>
-        </w:rPr>
-      </w:pPr>
-      <w:r>
-        <w:rPr>
-          <w:rFonts w:cs="Arial"/>
-          <w:sz w:val="18"/>
-          <w:szCs w:val="18"/>
-        </w:rPr>
-        <w:t>Install and configure EAS CLI: npm install -g eas-cli → eas login → eas build:configure</w:t>
-      </w:r>
-    </w:p>
-    <w:p>
-      <w:pPr>
-        <w:pStyle w:val="ListBullet"/>
-        <w:tabs>
-          <w:tab w:val="clear" w:pos="360"/>
-          <w:tab w:val="num" w:pos="432"/>
-        </w:tabs>
-        <w:spacing w:after="40"/>
-        <w:ind w:left="1080"/>
-        <w:rPr>
-          <w:rFonts w:cs="Arial"/>
-          <w:sz w:val="18"/>
-          <w:szCs w:val="18"/>
-        </w:rPr>
-      </w:pPr>
-      <w:r>
-        <w:rPr>
-          <w:rFonts w:cs="Arial"/>
-          <w:sz w:val="18"/>
-          <w:szCs w:val="18"/>
-        </w:rPr>
-        <w:t>app.json / eas.json configuration: bundleIdentifier (iOS), package (Android), build profiles (development, preview, production)</w:t>
-      </w:r>
-    </w:p>
-    <w:p>
-      <w:pPr>
-        <w:pStyle w:val="ListBullet"/>
-        <w:tabs>
-          <w:tab w:val="clear" w:pos="360"/>
-          <w:tab w:val="num" w:pos="432"/>
-        </w:tabs>
-        <w:spacing w:after="40"/>
-        <w:ind w:left="1080"/>
-        <w:rPr>
-          <w:rFonts w:cs="Arial"/>
-          <w:sz w:val="18"/>
-          <w:szCs w:val="18"/>
-        </w:rPr>
-      </w:pPr>
-      <w:r>
-        <w:rPr>
-          <w:rFonts w:cs="Arial"/>
-          <w:sz w:val="18"/>
-          <w:szCs w:val="18"/>
-        </w:rPr>
-        <w:t xml:space="preserve">Trigger an </w:t>
-      </w:r>
-      <w:r>
-        <w:rPr>
-          <w:rFonts w:cs="Arial"/>
-          <w:b/>
-          <w:sz w:val="18"/>
-          <w:szCs w:val="18"/>
-        </w:rPr>
-        <w:t>APK build</w:t>
-      </w:r>
-      <w:r>
-        <w:rPr>
-          <w:rFonts w:cs="Arial"/>
-          <w:sz w:val="18"/>
-          <w:szCs w:val="18"/>
-        </w:rPr>
-        <w:t xml:space="preserve"> for Android: eas build --platform android --profile preview</w:t>
-      </w:r>
-    </w:p>
-    <w:p>
-      <w:pPr>
-        <w:pStyle w:val="ListBullet"/>
-        <w:tabs>
-          <w:tab w:val="clear" w:pos="360"/>
-          <w:tab w:val="num" w:pos="432"/>
-        </w:tabs>
-        <w:spacing w:after="40"/>
-        <w:ind w:left="1080"/>
-        <w:rPr>
-          <w:rFonts w:cs="Arial"/>
-          <w:sz w:val="18"/>
-          <w:szCs w:val="18"/>
-        </w:rPr>
-      </w:pPr>
-      <w:r>
-        <w:rPr>
-          <w:rFonts w:cs="Arial"/>
-          <w:sz w:val="18"/>
-          <w:szCs w:val="18"/>
-        </w:rPr>
-        <w:t>Download and install the .apk on a physical Android device</w:t>
-      </w:r>
-    </w:p>
-    <w:p>
-      <w:pPr>
-        <w:pStyle w:val="ListBullet"/>
-        <w:tabs>
-          <w:tab w:val="clear" w:pos="360"/>
-          <w:tab w:val="num" w:pos="432"/>
-        </w:tabs>
-        <w:spacing w:after="40"/>
-        <w:ind w:left="1080"/>
-        <w:rPr>
-          <w:rFonts w:cs="Arial"/>
-          <w:sz w:val="18"/>
-          <w:szCs w:val="18"/>
-        </w:rPr>
-      </w:pPr>
-      <w:r>
-        <w:rPr>
-          <w:rFonts w:cs="Arial"/>
-          <w:sz w:val="18"/>
-          <w:szCs w:val="18"/>
-        </w:rPr>
-        <w:t>Overview of signing (keystore for Android, provisioning profile for iOS) — concepts only, not hands-on for iOS</w:t>
-      </w:r>
-    </w:p>
-    <w:p>
-      <w:pPr>
-        <w:pStyle w:val="ListBullet"/>
-        <w:tabs>
-          <w:tab w:val="clear" w:pos="360"/>
-          <w:tab w:val="num" w:pos="432"/>
-        </w:tabs>
-        <w:spacing w:after="40"/>
-        <w:ind w:left="1080"/>
-        <w:rPr>
-          <w:rFonts w:cs="Arial"/>
-          <w:sz w:val="18"/>
-          <w:szCs w:val="18"/>
-        </w:rPr>
-      </w:pPr>
-      <w:r>
-        <w:rPr>
-          <w:rFonts w:cs="Arial"/>
-          <w:sz w:val="18"/>
-          <w:szCs w:val="18"/>
-        </w:rPr>
-        <w:t>Exercise: produce a working .apk of the Lab 8 exercise app and install it on a classmate's device</w:t>
-      </w:r>
-    </w:p>
-    <w:p>
-      <w:pPr>
         <w:pStyle w:val="CustomHeading2"/>
         <w:ind w:left="720"/>
         <w:rPr>
@@ -4211,1459 +2582,7 @@
           <w:sz w:val="18"/>
           <w:szCs w:val="18"/>
         </w:rPr>
-        <w:t>Lab 10 — React Native Capstone: Meal Explorer Mobile App (Final Project)</w:t>
-      </w:r>
-    </w:p>
-    <w:p>
-      <w:pPr>
-        <w:pStyle w:val="BodyTextCustom"/>
-        <w:ind w:left="720"/>
-        <w:rPr>
-          <w:rFonts w:cs="Arial"/>
-          <w:sz w:val="18"/>
-          <w:szCs w:val="18"/>
-        </w:rPr>
-      </w:pPr>
-      <w:r>
-        <w:rPr>
-          <w:rFonts w:cs="Arial"/>
-          <w:sz w:val="18"/>
-          <w:szCs w:val="18"/>
-        </w:rPr>
-        <w:t xml:space="preserve">Build a complete mobile version of the Meal Explorer application built in CSE 2232, using </w:t>
-      </w:r>
-      <w:r>
-        <w:rPr>
-          <w:rFonts w:cs="Arial"/>
-          <w:color w:val="0563C1"/>
-          <w:sz w:val="18"/>
-          <w:szCs w:val="18"/>
-          <w:u w:val="single"/>
-        </w:rPr>
-        <w:t>TheMealDB API</w:t>
-      </w:r>
-      <w:r>
-        <w:rPr>
-          <w:rFonts w:cs="Arial"/>
-          <w:sz w:val="18"/>
-          <w:szCs w:val="18"/>
-        </w:rPr>
-        <w:t xml:space="preserve"> (https://www.themealdb.com/api.php) (free, no auth required).</w:t>
-      </w:r>
-    </w:p>
-    <w:p>
-      <w:pPr>
-        <w:pStyle w:val="BodyTextCustom"/>
-        <w:ind w:left="720"/>
-        <w:rPr>
-          <w:rFonts w:cs="Arial"/>
-          <w:sz w:val="18"/>
-          <w:szCs w:val="18"/>
-        </w:rPr>
-      </w:pPr>
-      <w:r>
-        <w:rPr>
-          <w:rFonts w:cs="Arial"/>
-          <w:b/>
-          <w:sz w:val="18"/>
-          <w:szCs w:val="18"/>
-        </w:rPr>
-        <w:t>App screens:</w:t>
-      </w:r>
-    </w:p>
-    <w:tbl>
-      <w:tblPr>
-        <w:tblW w:w="0" w:type="auto"/>
-        <w:jc w:val="center"/>
-        <w:tblBorders>
-          <w:top w:val="single" w:sz="8" w:space="0" w:color="CFCFCF"/>
-          <w:left w:val="single" w:sz="8" w:space="0" w:color="CFCFCF"/>
-          <w:bottom w:val="single" w:sz="8" w:space="0" w:color="CFCFCF"/>
-          <w:right w:val="single" w:sz="8" w:space="0" w:color="CFCFCF"/>
-          <w:insideH w:val="single" w:sz="8" w:space="0" w:color="CFCFCF"/>
-          <w:insideV w:val="single" w:sz="8" w:space="0" w:color="CFCFCF"/>
-        </w:tblBorders>
-        <w:tblLook w:val="04A0" w:firstRow="1" w:lastRow="0" w:firstColumn="1" w:lastColumn="0" w:noHBand="0" w:noVBand="1"/>
-      </w:tblPr>
-      <w:tblGrid>
-        <w:gridCol w:w="1980"/>
-        <w:gridCol w:w="2413"/>
-        <w:gridCol w:w="3518"/>
-      </w:tblGrid>
-      <w:tr>
-        <w:trPr>
-          <w:jc w:val="center"/>
-        </w:trPr>
-        <w:tc>
-          <w:tcPr>
-            <w:tcW w:w="1980" w:type="dxa"/>
-            <w:shd w:val="clear" w:color="auto" w:fill="F5F5F5"/>
-            <w:tcMar>
-              <w:top w:w="80" w:type="dxa"/>
-              <w:left w:w="100" w:type="dxa"/>
-              <w:bottom w:w="80" w:type="dxa"/>
-              <w:right w:w="100" w:type="dxa"/>
-            </w:tcMar>
-          </w:tcPr>
-          <w:p>
-            <w:pPr>
-              <w:spacing w:after="0"/>
-              <w:ind w:left="720"/>
-              <w:rPr>
-                <w:rFonts w:cs="Arial"/>
-                <w:sz w:val="18"/>
-                <w:szCs w:val="18"/>
-              </w:rPr>
-            </w:pPr>
-            <w:r>
-              <w:rPr>
-                <w:rFonts w:cs="Arial"/>
-                <w:b/>
-                <w:sz w:val="18"/>
-                <w:szCs w:val="18"/>
-              </w:rPr>
-              <w:t>Screen</w:t>
-            </w:r>
-          </w:p>
-        </w:tc>
-        <w:tc>
-          <w:tcPr>
-            <w:tcW w:w="2413" w:type="dxa"/>
-            <w:shd w:val="clear" w:color="auto" w:fill="F5F5F5"/>
-            <w:tcMar>
-              <w:top w:w="80" w:type="dxa"/>
-              <w:left w:w="100" w:type="dxa"/>
-              <w:bottom w:w="80" w:type="dxa"/>
-              <w:right w:w="100" w:type="dxa"/>
-            </w:tcMar>
-          </w:tcPr>
-          <w:p>
-            <w:pPr>
-              <w:spacing w:after="0"/>
-              <w:ind w:left="720"/>
-              <w:rPr>
-                <w:rFonts w:cs="Arial"/>
-                <w:sz w:val="18"/>
-                <w:szCs w:val="18"/>
-              </w:rPr>
-            </w:pPr>
-            <w:r>
-              <w:rPr>
-                <w:rFonts w:cs="Arial"/>
-                <w:b/>
-                <w:sz w:val="18"/>
-                <w:szCs w:val="18"/>
-              </w:rPr>
-              <w:t>API Endpoint</w:t>
-            </w:r>
-          </w:p>
-        </w:tc>
-        <w:tc>
-          <w:tcPr>
-            <w:tcW w:w="3518" w:type="dxa"/>
-            <w:shd w:val="clear" w:color="auto" w:fill="F5F5F5"/>
-            <w:tcMar>
-              <w:top w:w="80" w:type="dxa"/>
-              <w:left w:w="100" w:type="dxa"/>
-              <w:bottom w:w="80" w:type="dxa"/>
-              <w:right w:w="100" w:type="dxa"/>
-            </w:tcMar>
-          </w:tcPr>
-          <w:p>
-            <w:pPr>
-              <w:spacing w:after="0"/>
-              <w:ind w:left="720"/>
-              <w:rPr>
-                <w:rFonts w:cs="Arial"/>
-                <w:sz w:val="18"/>
-                <w:szCs w:val="18"/>
-              </w:rPr>
-            </w:pPr>
-            <w:r>
-              <w:rPr>
-                <w:rFonts w:cs="Arial"/>
-                <w:b/>
-                <w:sz w:val="18"/>
-                <w:szCs w:val="18"/>
-              </w:rPr>
-              <w:t>Key Feature</w:t>
-            </w:r>
-          </w:p>
-        </w:tc>
-      </w:tr>
-      <w:tr>
-        <w:trPr>
-          <w:jc w:val="center"/>
-        </w:trPr>
-        <w:tc>
-          <w:tcPr>
-            <w:tcW w:w="1980" w:type="dxa"/>
-            <w:tcMar>
-              <w:top w:w="80" w:type="dxa"/>
-              <w:left w:w="100" w:type="dxa"/>
-              <w:bottom w:w="80" w:type="dxa"/>
-              <w:right w:w="100" w:type="dxa"/>
-            </w:tcMar>
-          </w:tcPr>
-          <w:p>
-            <w:pPr>
-              <w:spacing w:after="0"/>
-              <w:rPr>
-                <w:rFonts w:cs="Arial"/>
-                <w:sz w:val="18"/>
-                <w:szCs w:val="18"/>
-              </w:rPr>
-            </w:pPr>
-            <w:r>
-              <w:rPr>
-                <w:rFonts w:cs="Arial"/>
-                <w:sz w:val="18"/>
-                <w:szCs w:val="18"/>
-              </w:rPr>
-              <w:t>Categories Screen</w:t>
-            </w:r>
-          </w:p>
-        </w:tc>
-        <w:tc>
-          <w:tcPr>
-            <w:tcW w:w="2413" w:type="dxa"/>
-            <w:tcMar>
-              <w:top w:w="80" w:type="dxa"/>
-              <w:left w:w="100" w:type="dxa"/>
-              <w:bottom w:w="80" w:type="dxa"/>
-              <w:right w:w="100" w:type="dxa"/>
-            </w:tcMar>
-          </w:tcPr>
-          <w:p>
-            <w:pPr>
-              <w:spacing w:after="0"/>
-              <w:rPr>
-                <w:rFonts w:cs="Arial"/>
-                <w:sz w:val="18"/>
-                <w:szCs w:val="18"/>
-              </w:rPr>
-            </w:pPr>
-            <w:proofErr w:type="spellStart"/>
-            <w:r>
-              <w:rPr>
-                <w:rFonts w:cs="Arial"/>
-                <w:sz w:val="18"/>
-                <w:szCs w:val="18"/>
-              </w:rPr>
-              <w:t>categories.php</w:t>
-            </w:r>
-            <w:proofErr w:type="spellEnd"/>
-          </w:p>
-        </w:tc>
-        <w:tc>
-          <w:tcPr>
-            <w:tcW w:w="3518" w:type="dxa"/>
-            <w:tcMar>
-              <w:top w:w="80" w:type="dxa"/>
-              <w:left w:w="100" w:type="dxa"/>
-              <w:bottom w:w="80" w:type="dxa"/>
-              <w:right w:w="100" w:type="dxa"/>
-            </w:tcMar>
-          </w:tcPr>
-          <w:p>
-            <w:pPr>
-              <w:spacing w:after="0"/>
-              <w:rPr>
-                <w:rFonts w:cs="Arial"/>
-                <w:sz w:val="18"/>
-                <w:szCs w:val="18"/>
-              </w:rPr>
-            </w:pPr>
-            <w:proofErr w:type="spellStart"/>
-            <w:r>
-              <w:rPr>
-                <w:rFonts w:cs="Arial"/>
-                <w:sz w:val="18"/>
-                <w:szCs w:val="18"/>
-              </w:rPr>
-              <w:t>FlatList</w:t>
-            </w:r>
-            <w:proofErr w:type="spellEnd"/>
-            <w:r>
-              <w:rPr>
-                <w:rFonts w:cs="Arial"/>
-                <w:sz w:val="18"/>
-                <w:szCs w:val="18"/>
-              </w:rPr>
-              <w:t xml:space="preserve"> of category cards (thumbnail + name); tap to navigate</w:t>
-            </w:r>
-          </w:p>
-        </w:tc>
-      </w:tr>
-      <w:tr>
-        <w:trPr>
-          <w:jc w:val="center"/>
-        </w:trPr>
-        <w:tc>
-          <w:tcPr>
-            <w:tcW w:w="1980" w:type="dxa"/>
-            <w:tcMar>
-              <w:top w:w="80" w:type="dxa"/>
-              <w:left w:w="100" w:type="dxa"/>
-              <w:bottom w:w="80" w:type="dxa"/>
-              <w:right w:w="100" w:type="dxa"/>
-            </w:tcMar>
-          </w:tcPr>
-          <w:p>
-            <w:pPr>
-              <w:spacing w:after="0"/>
-              <w:rPr>
-                <w:rFonts w:cs="Arial"/>
-                <w:sz w:val="18"/>
-                <w:szCs w:val="18"/>
-              </w:rPr>
-            </w:pPr>
-            <w:r>
-              <w:rPr>
-                <w:rFonts w:cs="Arial"/>
-                <w:sz w:val="18"/>
-                <w:szCs w:val="18"/>
-              </w:rPr>
-              <w:t>Meals by Category Screen</w:t>
-            </w:r>
-          </w:p>
-        </w:tc>
-        <w:tc>
-          <w:tcPr>
-            <w:tcW w:w="2413" w:type="dxa"/>
-            <w:tcMar>
-              <w:top w:w="80" w:type="dxa"/>
-              <w:left w:w="100" w:type="dxa"/>
-              <w:bottom w:w="80" w:type="dxa"/>
-              <w:right w:w="100" w:type="dxa"/>
-            </w:tcMar>
-          </w:tcPr>
-          <w:p>
-            <w:pPr>
-              <w:spacing w:after="0"/>
-              <w:rPr>
-                <w:rFonts w:cs="Arial"/>
-                <w:sz w:val="18"/>
-                <w:szCs w:val="18"/>
-              </w:rPr>
-            </w:pPr>
-            <w:proofErr w:type="spellStart"/>
-            <w:r>
-              <w:rPr>
-                <w:rFonts w:cs="Arial"/>
-                <w:sz w:val="18"/>
-                <w:szCs w:val="18"/>
-              </w:rPr>
-              <w:t>filter.php?c</w:t>
-            </w:r>
-            <w:proofErr w:type="spellEnd"/>
-            <w:r>
-              <w:rPr>
-                <w:rFonts w:cs="Arial"/>
-                <w:sz w:val="18"/>
-                <w:szCs w:val="18"/>
-              </w:rPr>
-              <w:t>={category}</w:t>
-            </w:r>
-          </w:p>
-        </w:tc>
-        <w:tc>
-          <w:tcPr>
-            <w:tcW w:w="3518" w:type="dxa"/>
-            <w:tcMar>
-              <w:top w:w="80" w:type="dxa"/>
-              <w:left w:w="100" w:type="dxa"/>
-              <w:bottom w:w="80" w:type="dxa"/>
-              <w:right w:w="100" w:type="dxa"/>
-            </w:tcMar>
-          </w:tcPr>
-          <w:p>
-            <w:pPr>
-              <w:spacing w:after="0"/>
-              <w:rPr>
-                <w:rFonts w:cs="Arial"/>
-                <w:sz w:val="18"/>
-                <w:szCs w:val="18"/>
-              </w:rPr>
-            </w:pPr>
-            <w:r>
-              <w:rPr>
-                <w:rFonts w:cs="Arial"/>
-                <w:sz w:val="18"/>
-                <w:szCs w:val="18"/>
-              </w:rPr>
-              <w:t>Grid of meal thumbnails for the selected category</w:t>
-            </w:r>
-          </w:p>
-        </w:tc>
-      </w:tr>
-      <w:tr>
-        <w:trPr>
-          <w:jc w:val="center"/>
-        </w:trPr>
-        <w:tc>
-          <w:tcPr>
-            <w:tcW w:w="1980" w:type="dxa"/>
-            <w:tcMar>
-              <w:top w:w="80" w:type="dxa"/>
-              <w:left w:w="100" w:type="dxa"/>
-              <w:bottom w:w="80" w:type="dxa"/>
-              <w:right w:w="100" w:type="dxa"/>
-            </w:tcMar>
-          </w:tcPr>
-          <w:p>
-            <w:pPr>
-              <w:spacing w:after="0"/>
-              <w:rPr>
-                <w:rFonts w:cs="Arial"/>
-                <w:sz w:val="18"/>
-                <w:szCs w:val="18"/>
-              </w:rPr>
-            </w:pPr>
-            <w:r>
-              <w:rPr>
-                <w:rFonts w:cs="Arial"/>
-                <w:sz w:val="18"/>
-                <w:szCs w:val="18"/>
-              </w:rPr>
-              <w:t>Meal Details Screen</w:t>
-            </w:r>
-          </w:p>
-        </w:tc>
-        <w:tc>
-          <w:tcPr>
-            <w:tcW w:w="2413" w:type="dxa"/>
-            <w:tcMar>
-              <w:top w:w="80" w:type="dxa"/>
-              <w:left w:w="100" w:type="dxa"/>
-              <w:bottom w:w="80" w:type="dxa"/>
-              <w:right w:w="100" w:type="dxa"/>
-            </w:tcMar>
-          </w:tcPr>
-          <w:p>
-            <w:pPr>
-              <w:spacing w:after="0"/>
-              <w:rPr>
-                <w:rFonts w:cs="Arial"/>
-                <w:sz w:val="18"/>
-                <w:szCs w:val="18"/>
-              </w:rPr>
-            </w:pPr>
-            <w:proofErr w:type="spellStart"/>
-            <w:r>
-              <w:rPr>
-                <w:rFonts w:cs="Arial"/>
-                <w:sz w:val="18"/>
-                <w:szCs w:val="18"/>
-              </w:rPr>
-              <w:t>lookup.php?i</w:t>
-            </w:r>
-            <w:proofErr w:type="spellEnd"/>
-            <w:r>
-              <w:rPr>
-                <w:rFonts w:cs="Arial"/>
-                <w:sz w:val="18"/>
-                <w:szCs w:val="18"/>
-              </w:rPr>
-              <w:t>={</w:t>
-            </w:r>
-            <w:proofErr w:type="spellStart"/>
-            <w:r>
-              <w:rPr>
-                <w:rFonts w:cs="Arial"/>
-                <w:sz w:val="18"/>
-                <w:szCs w:val="18"/>
-              </w:rPr>
-              <w:t>mealId</w:t>
-            </w:r>
-            <w:proofErr w:type="spellEnd"/>
-            <w:r>
-              <w:rPr>
-                <w:rFonts w:cs="Arial"/>
-                <w:sz w:val="18"/>
-                <w:szCs w:val="18"/>
-              </w:rPr>
-              <w:t>}</w:t>
-            </w:r>
-          </w:p>
-        </w:tc>
-        <w:tc>
-          <w:tcPr>
-            <w:tcW w:w="3518" w:type="dxa"/>
-            <w:tcMar>
-              <w:top w:w="80" w:type="dxa"/>
-              <w:left w:w="100" w:type="dxa"/>
-              <w:bottom w:w="80" w:type="dxa"/>
-              <w:right w:w="100" w:type="dxa"/>
-            </w:tcMar>
-          </w:tcPr>
-          <w:p>
-            <w:pPr>
-              <w:spacing w:after="0"/>
-              <w:rPr>
-                <w:rFonts w:cs="Arial"/>
-                <w:sz w:val="18"/>
-                <w:szCs w:val="18"/>
-              </w:rPr>
-            </w:pPr>
-            <w:r>
-              <w:rPr>
-                <w:rFonts w:cs="Arial"/>
-                <w:sz w:val="18"/>
-                <w:szCs w:val="18"/>
-              </w:rPr>
-              <w:t>Full details — image, ingredients, step-by-step instructions, YouTube button (Linking.openURL)</w:t>
-            </w:r>
-          </w:p>
-        </w:tc>
-      </w:tr>
-      <w:tr>
-        <w:trPr>
-          <w:jc w:val="center"/>
-        </w:trPr>
-        <w:tc>
-          <w:tcPr>
-            <w:tcW w:w="1980" w:type="dxa"/>
-            <w:tcMar>
-              <w:top w:w="80" w:type="dxa"/>
-              <w:left w:w="100" w:type="dxa"/>
-              <w:bottom w:w="80" w:type="dxa"/>
-              <w:right w:w="100" w:type="dxa"/>
-            </w:tcMar>
-          </w:tcPr>
-          <w:p>
-            <w:pPr>
-              <w:spacing w:after="0"/>
-              <w:rPr>
-                <w:rFonts w:cs="Arial"/>
-                <w:sz w:val="18"/>
-                <w:szCs w:val="18"/>
-              </w:rPr>
-            </w:pPr>
-            <w:proofErr w:type="spellStart"/>
-            <w:r>
-              <w:rPr>
-                <w:rFonts w:cs="Arial"/>
-                <w:sz w:val="18"/>
-                <w:szCs w:val="18"/>
-              </w:rPr>
-              <w:t>Favourites</w:t>
-            </w:r>
-            <w:proofErr w:type="spellEnd"/>
-            <w:r>
-              <w:rPr>
-                <w:rFonts w:cs="Arial"/>
-                <w:sz w:val="18"/>
-                <w:szCs w:val="18"/>
-              </w:rPr>
-              <w:t xml:space="preserve"> Screen</w:t>
-            </w:r>
-          </w:p>
-        </w:tc>
-        <w:tc>
-          <w:tcPr>
-            <w:tcW w:w="2413" w:type="dxa"/>
-            <w:tcMar>
-              <w:top w:w="80" w:type="dxa"/>
-              <w:left w:w="100" w:type="dxa"/>
-              <w:bottom w:w="80" w:type="dxa"/>
-              <w:right w:w="100" w:type="dxa"/>
-            </w:tcMar>
-          </w:tcPr>
-          <w:p>
-            <w:pPr>
-              <w:spacing w:after="0"/>
-              <w:rPr>
-                <w:rFonts w:cs="Arial"/>
-                <w:sz w:val="18"/>
-                <w:szCs w:val="18"/>
-              </w:rPr>
-            </w:pPr>
-            <w:r>
-              <w:rPr>
-                <w:rFonts w:cs="Arial"/>
-                <w:sz w:val="18"/>
-                <w:szCs w:val="18"/>
-              </w:rPr>
-              <w:t>—</w:t>
-            </w:r>
-          </w:p>
-        </w:tc>
-        <w:tc>
-          <w:tcPr>
-            <w:tcW w:w="3518" w:type="dxa"/>
-            <w:tcMar>
-              <w:top w:w="80" w:type="dxa"/>
-              <w:left w:w="100" w:type="dxa"/>
-              <w:bottom w:w="80" w:type="dxa"/>
-              <w:right w:w="100" w:type="dxa"/>
-            </w:tcMar>
-          </w:tcPr>
-          <w:p>
-            <w:pPr>
-              <w:spacing w:after="0"/>
-              <w:rPr>
-                <w:rFonts w:cs="Arial"/>
-                <w:sz w:val="18"/>
-                <w:szCs w:val="18"/>
-              </w:rPr>
-            </w:pPr>
-            <w:r>
-              <w:rPr>
-                <w:rFonts w:cs="Arial"/>
-                <w:sz w:val="18"/>
-                <w:szCs w:val="18"/>
-              </w:rPr>
-              <w:t xml:space="preserve">Meals saved via </w:t>
-            </w:r>
-            <w:proofErr w:type="spellStart"/>
-            <w:r>
-              <w:rPr>
-                <w:rFonts w:cs="Arial"/>
-                <w:sz w:val="18"/>
-                <w:szCs w:val="18"/>
-              </w:rPr>
-              <w:t>AsyncStorage</w:t>
-            </w:r>
-            <w:proofErr w:type="spellEnd"/>
-            <w:r>
-              <w:rPr>
-                <w:rFonts w:cs="Arial"/>
-                <w:sz w:val="18"/>
-                <w:szCs w:val="18"/>
-              </w:rPr>
-              <w:t>; accessible from the bottom tab bar</w:t>
-            </w:r>
-          </w:p>
-        </w:tc>
-      </w:tr>
-    </w:tbl>
-    <w:p>
-      <w:pPr>
-        <w:ind w:left="720"/>
-        <w:rPr>
-          <w:rFonts w:cs="Arial"/>
-          <w:sz w:val="18"/>
-          <w:szCs w:val="18"/>
-        </w:rPr>
-      </w:pPr>
-    </w:p>
-    <w:p>
-      <w:pPr>
-        <w:pStyle w:val="BodyTextCustom"/>
-        <w:ind w:left="720"/>
-        <w:rPr>
-          <w:rFonts w:cs="Arial"/>
-          <w:sz w:val="18"/>
-          <w:szCs w:val="18"/>
-        </w:rPr>
-      </w:pPr>
-      <w:r>
-        <w:rPr>
-          <w:rFonts w:cs="Arial"/>
-          <w:b/>
-          <w:sz w:val="18"/>
-          <w:szCs w:val="18"/>
-        </w:rPr>
-        <w:t>Technical requirements:</w:t>
-      </w:r>
-      <w:r>
-        <w:rPr>
-          <w:rFonts w:cs="Arial"/>
-          <w:sz w:val="18"/>
-          <w:szCs w:val="18"/>
-        </w:rPr>
-        <w:br/>
-        <w:t>- Bottom Tab Navigator (Categories, Favourites) with a Stack Navigator inside Categories for the drill-down flow</w:t>
-      </w:r>
-      <w:r>
-        <w:rPr>
-          <w:rFonts w:cs="Arial"/>
-          <w:sz w:val="18"/>
-          <w:szCs w:val="18"/>
-        </w:rPr>
-        <w:br/>
-        <w:t>- ActivityIndicator loading state and error message on every data-fetching screen</w:t>
-      </w:r>
-      <w:r>
-        <w:rPr>
-          <w:rFonts w:cs="Arial"/>
-          <w:sz w:val="18"/>
-          <w:szCs w:val="18"/>
-        </w:rPr>
-        <w:br/>
-        <w:t>- Pull-to-refresh on the Meals by Category screen</w:t>
-      </w:r>
-      <w:r>
-        <w:rPr>
-          <w:rFonts w:cs="Arial"/>
-          <w:sz w:val="18"/>
-          <w:szCs w:val="18"/>
-        </w:rPr>
-        <w:br/>
-        <w:t>- Save / unsave meals to AsyncStorage from the Details screen; reflect changes live on the Favourites tab</w:t>
-      </w:r>
-      <w:r>
-        <w:rPr>
-          <w:rFonts w:cs="Arial"/>
-          <w:sz w:val="18"/>
-          <w:szCs w:val="18"/>
-        </w:rPr>
-        <w:br/>
-        <w:t>- Responsive layout using React Native Flexbox; tested on both Android and iOS screen sizes</w:t>
-      </w:r>
-      <w:r>
-        <w:rPr>
-          <w:rFonts w:cs="Arial"/>
-          <w:sz w:val="18"/>
-          <w:szCs w:val="18"/>
-        </w:rPr>
-        <w:br/>
-        <w:t>- Accessible: all images have accessibilityLabel, interactive elements have accessibilityRole</w:t>
-      </w:r>
-    </w:p>
-    <w:p>
-      <w:pPr>
-        <w:pStyle w:val="BodyTextCustom"/>
-        <w:ind w:left="720"/>
-        <w:rPr>
-          <w:rFonts w:cs="Arial"/>
-          <w:sz w:val="18"/>
-          <w:szCs w:val="18"/>
-        </w:rPr>
-      </w:pPr>
-      <w:r>
-        <w:rPr>
-          <w:rFonts w:cs="Arial"/>
-          <w:b/>
-          <w:sz w:val="18"/>
-          <w:szCs w:val="18"/>
-        </w:rPr>
-        <w:t>EAS Build deliverable:</w:t>
-      </w:r>
-      <w:r>
-        <w:rPr>
-          <w:rFonts w:cs="Arial"/>
-          <w:sz w:val="18"/>
-          <w:szCs w:val="18"/>
-        </w:rPr>
-        <w:br/>
-        <w:t>- Configure eas.json with a preview profile</w:t>
-      </w:r>
-      <w:r>
-        <w:rPr>
-          <w:rFonts w:cs="Arial"/>
-          <w:sz w:val="18"/>
-          <w:szCs w:val="18"/>
-        </w:rPr>
-        <w:br/>
-        <w:t>- Run eas build --platform android --profile preview to produce an .apk</w:t>
-      </w:r>
-      <w:r>
-        <w:rPr>
-          <w:rFonts w:cs="Arial"/>
-          <w:sz w:val="18"/>
-          <w:szCs w:val="18"/>
-        </w:rPr>
-        <w:br/>
-        <w:t>- Submit the Expo build URL or the downloaded .apk file alongside the lab notebook</w:t>
-      </w:r>
-    </w:p>
-    <w:p>
-      <w:pPr>
-        <w:pStyle w:val="BodyTextCustom"/>
-        <w:ind w:left="720"/>
-        <w:rPr>
-          <w:rFonts w:cs="Arial"/>
-          <w:sz w:val="18"/>
-          <w:szCs w:val="18"/>
-        </w:rPr>
-      </w:pPr>
-      <w:r>
-        <w:rPr>
-          <w:rFonts w:cs="Arial"/>
-          <w:b/>
-          <w:sz w:val="18"/>
-          <w:szCs w:val="18"/>
-        </w:rPr>
-        <w:t>Assessment:</w:t>
-      </w:r>
-      <w:r>
-        <w:rPr>
-          <w:rFonts w:cs="Arial"/>
-          <w:sz w:val="18"/>
-          <w:szCs w:val="18"/>
-        </w:rPr>
-        <w:t xml:space="preserve"> Students demo the live app on a physical device or emulator (all four screens functional), present their EAS build artefact, and submit the complete lab notebook covering Labs 1–10.</w:t>
-      </w:r>
-      <w:r>
-        <w:rPr>
-          <w:rFonts w:cs="Arial"/>
-          <w:sz w:val="18"/>
-          <w:szCs w:val="18"/>
-        </w:rPr>
-        <w:br/>
-      </w:r>
-    </w:p>
-    <w:p>
-      <w:pPr>
-        <w:pStyle w:val="QuoteCustom"/>
-        <w:ind w:left="810"/>
-        <w:jc w:val="both"/>
-        <w:rPr>
-          <w:rFonts w:cs="Arial"/>
-          <w:color w:val="auto"/>
-          <w:sz w:val="18"/>
-          <w:szCs w:val="18"/>
-        </w:rPr>
-      </w:pPr>
-      <w:r>
-        <w:rPr>
-          <w:rFonts w:cs="Arial"/>
-          <w:b/>
-          <w:color w:val="auto"/>
-          <w:sz w:val="18"/>
-          <w:szCs w:val="18"/>
-        </w:rPr>
-        <w:t>Alternative Final Projects:</w:t>
-      </w:r>
-      <w:r>
-        <w:rPr>
-          <w:rFonts w:cs="Arial"/>
-          <w:color w:val="auto"/>
-          <w:sz w:val="18"/>
-          <w:szCs w:val="18"/>
-        </w:rPr>
-        <w:t xml:space="preserve"> Students may choose one of the following in place of the Meal Explorer. All alternatives mirror the same apps from CSE 2232 but rebuilt natively in React Native — reinforcing the </w:t>
-      </w:r>
-      <w:r>
-        <w:rPr>
-          <w:rFonts w:cs="Arial"/>
-          <w:color w:val="auto"/>
-          <w:sz w:val="18"/>
-          <w:szCs w:val="18"/>
-        </w:rPr>
-        <w:lastRenderedPageBreak/>
-        <w:t>"same logic, different platform" principle. All require the same four-screen structure (browse → filter → detail → favourites), Stack + Tab Navigation, AsyncStorage, and an EAS APK build.</w:t>
-      </w:r>
-    </w:p>
-    <w:tbl>
-      <w:tblPr>
-        <w:tblStyle w:val="TableGrid"/>
-        <w:tblW w:w="4524" w:type="pct"/>
-        <w:tblInd w:w="828" w:type="dxa"/>
-        <w:tblLayout w:type="fixed"/>
-        <w:tblLook w:val="04A0" w:firstRow="1" w:lastRow="0" w:firstColumn="1" w:lastColumn="0" w:noHBand="0" w:noVBand="1"/>
-      </w:tblPr>
-      <w:tblGrid>
-        <w:gridCol w:w="1296"/>
-        <w:gridCol w:w="2672"/>
-        <w:gridCol w:w="1135"/>
-        <w:gridCol w:w="3561"/>
-      </w:tblGrid>
-      <w:tr>
-        <w:trPr>
-          <w:trHeight w:val="288"/>
-        </w:trPr>
-        <w:tc>
-          <w:tcPr>
-            <w:tcW w:w="748" w:type="pct"/>
-          </w:tcPr>
-          <w:p>
-            <w:pPr>
-              <w:spacing w:after="0"/>
-              <w:rPr>
-                <w:rFonts w:cs="Arial"/>
-                <w:sz w:val="18"/>
-                <w:szCs w:val="18"/>
-              </w:rPr>
-            </w:pPr>
-            <w:r>
-              <w:rPr>
-                <w:rFonts w:cs="Arial"/>
-                <w:b/>
-                <w:sz w:val="18"/>
-                <w:szCs w:val="18"/>
-              </w:rPr>
-              <w:t>Project</w:t>
-            </w:r>
-          </w:p>
-        </w:tc>
-        <w:tc>
-          <w:tcPr>
-            <w:tcW w:w="1542" w:type="pct"/>
-          </w:tcPr>
-          <w:p>
-            <w:pPr>
-              <w:spacing w:after="0"/>
-              <w:rPr>
-                <w:rFonts w:cs="Arial"/>
-                <w:sz w:val="18"/>
-                <w:szCs w:val="18"/>
-              </w:rPr>
-            </w:pPr>
-            <w:r>
-              <w:rPr>
-                <w:rFonts w:cs="Arial"/>
-                <w:b/>
-                <w:sz w:val="18"/>
-                <w:szCs w:val="18"/>
-              </w:rPr>
-              <w:t>API</w:t>
-            </w:r>
-          </w:p>
-        </w:tc>
-        <w:tc>
-          <w:tcPr>
-            <w:tcW w:w="655" w:type="pct"/>
-          </w:tcPr>
-          <w:p>
-            <w:pPr>
-              <w:spacing w:after="0"/>
-              <w:rPr>
-                <w:rFonts w:cs="Arial"/>
-                <w:sz w:val="18"/>
-                <w:szCs w:val="18"/>
-              </w:rPr>
-            </w:pPr>
-            <w:proofErr w:type="spellStart"/>
-            <w:r>
-              <w:rPr>
-                <w:rFonts w:cs="Arial"/>
-                <w:b/>
-                <w:sz w:val="18"/>
-                <w:szCs w:val="18"/>
-              </w:rPr>
-              <w:t>Auth</w:t>
-            </w:r>
-            <w:proofErr w:type="spellEnd"/>
-            <w:r>
-              <w:rPr>
-                <w:rFonts w:cs="Arial"/>
-                <w:b/>
-                <w:sz w:val="18"/>
-                <w:szCs w:val="18"/>
-              </w:rPr>
-              <w:t xml:space="preserve"> Required</w:t>
-            </w:r>
-          </w:p>
-        </w:tc>
-        <w:tc>
-          <w:tcPr>
-            <w:tcW w:w="2055" w:type="pct"/>
-          </w:tcPr>
-          <w:p>
-            <w:pPr>
-              <w:spacing w:after="0"/>
-              <w:rPr>
-                <w:rFonts w:cs="Arial"/>
-                <w:sz w:val="18"/>
-                <w:szCs w:val="18"/>
-              </w:rPr>
-            </w:pPr>
-            <w:r>
-              <w:rPr>
-                <w:rFonts w:cs="Arial"/>
-                <w:b/>
-                <w:sz w:val="18"/>
-                <w:szCs w:val="18"/>
-              </w:rPr>
-              <w:t>Mobile-Specific Feature vs. CSE 2232 Web Version</w:t>
-            </w:r>
-          </w:p>
-        </w:tc>
-      </w:tr>
-      <w:tr>
-        <w:tc>
-          <w:tcPr>
-            <w:tcW w:w="748" w:type="pct"/>
-          </w:tcPr>
-          <w:p>
-            <w:pPr>
-              <w:spacing w:after="0"/>
-              <w:rPr>
-                <w:rFonts w:cs="Arial"/>
-                <w:sz w:val="18"/>
-                <w:szCs w:val="18"/>
-              </w:rPr>
-            </w:pPr>
-            <w:r>
-              <w:rPr>
-                <w:rFonts w:cs="Arial"/>
-                <w:b/>
-                <w:sz w:val="18"/>
-                <w:szCs w:val="18"/>
-              </w:rPr>
-              <w:t>Country Explorer</w:t>
-            </w:r>
-          </w:p>
-        </w:tc>
-        <w:tc>
-          <w:tcPr>
-            <w:tcW w:w="1542" w:type="pct"/>
-          </w:tcPr>
-          <w:p>
-            <w:pPr>
-              <w:spacing w:after="0"/>
-              <w:rPr>
-                <w:rFonts w:cs="Arial"/>
-                <w:sz w:val="18"/>
-                <w:szCs w:val="18"/>
-              </w:rPr>
-            </w:pPr>
-            <w:r>
-              <w:rPr>
-                <w:rFonts w:cs="Arial"/>
-                <w:color w:val="0563C1"/>
-                <w:sz w:val="18"/>
-                <w:szCs w:val="18"/>
-                <w:u w:val="single"/>
-              </w:rPr>
-              <w:t>REST Countries</w:t>
-            </w:r>
-            <w:r>
-              <w:rPr>
-                <w:rFonts w:cs="Arial"/>
-                <w:sz w:val="18"/>
-                <w:szCs w:val="18"/>
-              </w:rPr>
-              <w:t xml:space="preserve"> (https://restcountries.com/)</w:t>
-            </w:r>
-          </w:p>
-        </w:tc>
-        <w:tc>
-          <w:tcPr>
-            <w:tcW w:w="655" w:type="pct"/>
-          </w:tcPr>
-          <w:p>
-            <w:pPr>
-              <w:spacing w:after="0"/>
-              <w:rPr>
-                <w:rFonts w:cs="Arial"/>
-                <w:sz w:val="18"/>
-                <w:szCs w:val="18"/>
-              </w:rPr>
-            </w:pPr>
-            <w:r>
-              <w:rPr>
-                <w:rFonts w:cs="Arial"/>
-                <w:sz w:val="18"/>
-                <w:szCs w:val="18"/>
-              </w:rPr>
-              <w:t>No</w:t>
-            </w:r>
-          </w:p>
-        </w:tc>
-        <w:tc>
-          <w:tcPr>
-            <w:tcW w:w="2055" w:type="pct"/>
-          </w:tcPr>
-          <w:p>
-            <w:pPr>
-              <w:spacing w:after="0"/>
-              <w:rPr>
-                <w:rFonts w:cs="Arial"/>
-                <w:sz w:val="18"/>
-                <w:szCs w:val="18"/>
-              </w:rPr>
-            </w:pPr>
-            <w:r>
-              <w:rPr>
-                <w:rFonts w:cs="Arial"/>
-                <w:sz w:val="18"/>
-                <w:szCs w:val="18"/>
-              </w:rPr>
-              <w:t>Tap a bordering country on the Details screen to navigate directly to its detail; use expo-location to highlight the user's own country on launch</w:t>
-            </w:r>
-          </w:p>
-        </w:tc>
-      </w:tr>
-      <w:tr>
-        <w:tc>
-          <w:tcPr>
-            <w:tcW w:w="748" w:type="pct"/>
-          </w:tcPr>
-          <w:p>
-            <w:pPr>
-              <w:spacing w:after="0"/>
-              <w:rPr>
-                <w:rFonts w:cs="Arial"/>
-                <w:sz w:val="18"/>
-                <w:szCs w:val="18"/>
-              </w:rPr>
-            </w:pPr>
-            <w:r>
-              <w:rPr>
-                <w:rFonts w:cs="Arial"/>
-                <w:b/>
-                <w:sz w:val="18"/>
-                <w:szCs w:val="18"/>
-              </w:rPr>
-              <w:t>Movie Explorer</w:t>
-            </w:r>
-          </w:p>
-        </w:tc>
-        <w:tc>
-          <w:tcPr>
-            <w:tcW w:w="1542" w:type="pct"/>
-          </w:tcPr>
-          <w:p>
-            <w:pPr>
-              <w:spacing w:after="0"/>
-              <w:rPr>
-                <w:rFonts w:cs="Arial"/>
-                <w:sz w:val="18"/>
-                <w:szCs w:val="18"/>
-              </w:rPr>
-            </w:pPr>
-            <w:proofErr w:type="spellStart"/>
-            <w:r>
-              <w:rPr>
-                <w:rFonts w:cs="Arial"/>
-                <w:color w:val="0563C1"/>
-                <w:sz w:val="18"/>
-                <w:szCs w:val="18"/>
-                <w:u w:val="single"/>
-              </w:rPr>
-              <w:t>OMDb</w:t>
-            </w:r>
-            <w:proofErr w:type="spellEnd"/>
-            <w:r>
-              <w:rPr>
-                <w:rFonts w:cs="Arial"/>
-                <w:color w:val="0563C1"/>
-                <w:sz w:val="18"/>
-                <w:szCs w:val="18"/>
-                <w:u w:val="single"/>
-              </w:rPr>
-              <w:t xml:space="preserve"> API</w:t>
-            </w:r>
-            <w:r>
-              <w:rPr>
-                <w:rFonts w:cs="Arial"/>
-                <w:sz w:val="18"/>
-                <w:szCs w:val="18"/>
-              </w:rPr>
-              <w:t xml:space="preserve"> (https://www.omdbapi.com/)</w:t>
-            </w:r>
-          </w:p>
-        </w:tc>
-        <w:tc>
-          <w:tcPr>
-            <w:tcW w:w="655" w:type="pct"/>
-          </w:tcPr>
-          <w:p>
-            <w:pPr>
-              <w:spacing w:after="0"/>
-              <w:rPr>
-                <w:rFonts w:cs="Arial"/>
-                <w:sz w:val="18"/>
-                <w:szCs w:val="18"/>
-              </w:rPr>
-            </w:pPr>
-            <w:r>
-              <w:rPr>
-                <w:rFonts w:cs="Arial"/>
-                <w:sz w:val="18"/>
-                <w:szCs w:val="18"/>
-              </w:rPr>
-              <w:t>Free API key</w:t>
-            </w:r>
-          </w:p>
-        </w:tc>
-        <w:tc>
-          <w:tcPr>
-            <w:tcW w:w="2055" w:type="pct"/>
-          </w:tcPr>
-          <w:p>
-            <w:pPr>
-              <w:spacing w:after="0"/>
-              <w:rPr>
-                <w:rFonts w:cs="Arial"/>
-                <w:sz w:val="18"/>
-                <w:szCs w:val="18"/>
-              </w:rPr>
-            </w:pPr>
-            <w:r>
-              <w:rPr>
-                <w:rFonts w:cs="Arial"/>
-                <w:sz w:val="18"/>
-                <w:szCs w:val="18"/>
-              </w:rPr>
-              <w:t>Search-driven entry (</w:t>
-            </w:r>
-            <w:proofErr w:type="spellStart"/>
-            <w:r>
-              <w:rPr>
-                <w:rFonts w:cs="Arial"/>
-                <w:sz w:val="18"/>
-                <w:szCs w:val="18"/>
-              </w:rPr>
-              <w:t>TextInput</w:t>
-            </w:r>
-            <w:proofErr w:type="spellEnd"/>
-            <w:r>
-              <w:rPr>
-                <w:rFonts w:cs="Arial"/>
-                <w:sz w:val="18"/>
-                <w:szCs w:val="18"/>
-              </w:rPr>
-              <w:t xml:space="preserve"> + </w:t>
-            </w:r>
-            <w:proofErr w:type="spellStart"/>
-            <w:r>
-              <w:rPr>
-                <w:rFonts w:cs="Arial"/>
-                <w:sz w:val="18"/>
-                <w:szCs w:val="18"/>
-              </w:rPr>
-              <w:t>FlatList</w:t>
-            </w:r>
-            <w:proofErr w:type="spellEnd"/>
-            <w:r>
-              <w:rPr>
-                <w:rFonts w:cs="Arial"/>
-                <w:sz w:val="18"/>
-                <w:szCs w:val="18"/>
-              </w:rPr>
-              <w:t xml:space="preserve">); save </w:t>
-            </w:r>
-            <w:proofErr w:type="spellStart"/>
-            <w:r>
-              <w:rPr>
-                <w:rFonts w:cs="Arial"/>
-                <w:sz w:val="18"/>
-                <w:szCs w:val="18"/>
-              </w:rPr>
-              <w:t>watchlist</w:t>
-            </w:r>
-            <w:proofErr w:type="spellEnd"/>
-            <w:r>
-              <w:rPr>
-                <w:rFonts w:cs="Arial"/>
-                <w:sz w:val="18"/>
-                <w:szCs w:val="18"/>
-              </w:rPr>
-              <w:t xml:space="preserve"> to </w:t>
-            </w:r>
-            <w:proofErr w:type="spellStart"/>
-            <w:r>
-              <w:rPr>
-                <w:rFonts w:cs="Arial"/>
-                <w:sz w:val="18"/>
-                <w:szCs w:val="18"/>
-              </w:rPr>
-              <w:t>AsyncStorage</w:t>
-            </w:r>
-            <w:proofErr w:type="spellEnd"/>
-            <w:r>
-              <w:rPr>
-                <w:rFonts w:cs="Arial"/>
-                <w:sz w:val="18"/>
-                <w:szCs w:val="18"/>
-              </w:rPr>
-              <w:t xml:space="preserve">; open trailer via </w:t>
-            </w:r>
-            <w:proofErr w:type="spellStart"/>
-            <w:r>
-              <w:rPr>
-                <w:rFonts w:cs="Arial"/>
-                <w:sz w:val="18"/>
-                <w:szCs w:val="18"/>
-              </w:rPr>
-              <w:t>Linking.openURL</w:t>
-            </w:r>
-            <w:proofErr w:type="spellEnd"/>
-          </w:p>
-        </w:tc>
-      </w:tr>
-      <w:tr>
-        <w:tc>
-          <w:tcPr>
-            <w:tcW w:w="748" w:type="pct"/>
-          </w:tcPr>
-          <w:p>
-            <w:pPr>
-              <w:spacing w:after="0"/>
-              <w:rPr>
-                <w:rFonts w:cs="Arial"/>
-                <w:sz w:val="18"/>
-                <w:szCs w:val="18"/>
-              </w:rPr>
-            </w:pPr>
-            <w:r>
-              <w:rPr>
-                <w:rFonts w:cs="Arial"/>
-                <w:b/>
-                <w:sz w:val="18"/>
-                <w:szCs w:val="18"/>
-              </w:rPr>
-              <w:t>Music Explorer</w:t>
-            </w:r>
-          </w:p>
-        </w:tc>
-        <w:tc>
-          <w:tcPr>
-            <w:tcW w:w="1542" w:type="pct"/>
-          </w:tcPr>
-          <w:p>
-            <w:pPr>
-              <w:spacing w:after="0"/>
-              <w:rPr>
-                <w:rFonts w:cs="Arial"/>
-                <w:sz w:val="18"/>
-                <w:szCs w:val="18"/>
-              </w:rPr>
-            </w:pPr>
-            <w:r>
-              <w:rPr>
-                <w:rFonts w:cs="Arial"/>
-                <w:color w:val="0563C1"/>
-                <w:sz w:val="18"/>
-                <w:szCs w:val="18"/>
-                <w:u w:val="single"/>
-              </w:rPr>
-              <w:t>iTunes Search API</w:t>
-            </w:r>
-            <w:r>
-              <w:rPr>
-                <w:rFonts w:cs="Arial"/>
-                <w:sz w:val="18"/>
-                <w:szCs w:val="18"/>
-              </w:rPr>
-              <w:t xml:space="preserve"> (https://developer.apple.com/library/archive/documentation/AudioVideo/Conceptual/iTuneSearchAPI/)</w:t>
-            </w:r>
-          </w:p>
-        </w:tc>
-        <w:tc>
-          <w:tcPr>
-            <w:tcW w:w="655" w:type="pct"/>
-          </w:tcPr>
-          <w:p>
-            <w:pPr>
-              <w:spacing w:after="0"/>
-              <w:rPr>
-                <w:rFonts w:cs="Arial"/>
-                <w:sz w:val="18"/>
-                <w:szCs w:val="18"/>
-              </w:rPr>
-            </w:pPr>
-            <w:r>
-              <w:rPr>
-                <w:rFonts w:cs="Arial"/>
-                <w:sz w:val="18"/>
-                <w:szCs w:val="18"/>
-              </w:rPr>
-              <w:t>No</w:t>
-            </w:r>
-          </w:p>
-        </w:tc>
-        <w:tc>
-          <w:tcPr>
-            <w:tcW w:w="2055" w:type="pct"/>
-          </w:tcPr>
-          <w:p>
-            <w:pPr>
-              <w:spacing w:after="0"/>
-              <w:rPr>
-                <w:rFonts w:cs="Arial"/>
-                <w:sz w:val="18"/>
-                <w:szCs w:val="18"/>
-              </w:rPr>
-            </w:pPr>
-            <w:r>
-              <w:rPr>
-                <w:rFonts w:cs="Arial"/>
-                <w:sz w:val="18"/>
-                <w:szCs w:val="18"/>
-              </w:rPr>
-              <w:t>30-second track preview using expo-</w:t>
-            </w:r>
-            <w:proofErr w:type="spellStart"/>
-            <w:r>
-              <w:rPr>
-                <w:rFonts w:cs="Arial"/>
-                <w:sz w:val="18"/>
-                <w:szCs w:val="18"/>
-              </w:rPr>
-              <w:t>av</w:t>
-            </w:r>
-            <w:proofErr w:type="spellEnd"/>
-            <w:r>
-              <w:rPr>
-                <w:rFonts w:cs="Arial"/>
-                <w:sz w:val="18"/>
-                <w:szCs w:val="18"/>
-              </w:rPr>
-              <w:t xml:space="preserve"> (</w:t>
-            </w:r>
-            <w:proofErr w:type="spellStart"/>
-            <w:r>
-              <w:rPr>
-                <w:rFonts w:cs="Arial"/>
-                <w:sz w:val="18"/>
-                <w:szCs w:val="18"/>
-              </w:rPr>
-              <w:t>Audio.Sound</w:t>
-            </w:r>
-            <w:proofErr w:type="spellEnd"/>
-            <w:r>
-              <w:rPr>
-                <w:rFonts w:cs="Arial"/>
-                <w:sz w:val="18"/>
-                <w:szCs w:val="18"/>
-              </w:rPr>
-              <w:t>) — replaces the web &lt;audio&gt; tag with native audio playback</w:t>
-            </w:r>
-          </w:p>
-        </w:tc>
-      </w:tr>
-    </w:tbl>
-    <w:p>
-      <w:pPr>
-        <w:pStyle w:val="QuoteCustom"/>
-        <w:rPr>
-          <w:rFonts w:cs="Arial"/>
-          <w:sz w:val="18"/>
-          <w:szCs w:val="18"/>
-        </w:rPr>
-      </w:pPr>
-    </w:p>
-    <w:p>
-      <w:pPr>
-        <w:pStyle w:val="BodyTextCustom"/>
-        <w:ind w:left="720"/>
-        <w:rPr>
-          <w:rFonts w:cs="Arial"/>
-          <w:sz w:val="18"/>
-          <w:szCs w:val="18"/>
-        </w:rPr>
-      </w:pPr>
-      <w:r>
-        <w:rPr>
-          <w:rFonts w:cs="Arial"/>
-          <w:sz w:val="18"/>
-          <w:szCs w:val="18"/>
-        </w:rPr>
-        <w:t xml:space="preserve">Regardless of project choice, all technical requirements above (Tab + Stack Navigator, ActivityIndicator, pull-to-refresh, AsyncStorage favourites, accessibility labels, </w:t>
-      </w:r>
-      <w:proofErr w:type="gramStart"/>
-      <w:r>
-        <w:rPr>
-          <w:rFonts w:cs="Arial"/>
-          <w:sz w:val="18"/>
-          <w:szCs w:val="18"/>
-        </w:rPr>
-        <w:t>EAS</w:t>
-      </w:r>
-      <w:proofErr w:type="gramEnd"/>
-      <w:r>
-        <w:rPr>
-          <w:rFonts w:cs="Arial"/>
-          <w:sz w:val="18"/>
-          <w:szCs w:val="18"/>
-        </w:rPr>
-        <w:t xml:space="preserve"> APK build) apply.</w:t>
+        <w:t>Lab 10 — React Native Capstone Project</w:t>
       </w:r>
     </w:p>
     <w:p>
@@ -5682,7 +2601,7 @@
           <w:sz w:val="18"/>
           <w:szCs w:val="18"/>
         </w:rPr>
-        <w:t>Textbook</w:t>
+        <w:t>Textbooks</w:t>
       </w:r>
     </w:p>
     <w:p>
@@ -5757,565 +2676,6 @@
           <w:szCs w:val="18"/>
         </w:rPr>
         <w:t xml:space="preserve"> (2nd ed.), O'Reilly Media, 2018</w:t>
-      </w:r>
-    </w:p>
-    <w:p>
-      <w:pPr>
-        <w:pStyle w:val="CustomHeading1"/>
-        <w:ind w:left="720"/>
-        <w:rPr>
-          <w:rFonts w:cs="Arial"/>
-          <w:sz w:val="18"/>
-          <w:szCs w:val="18"/>
-        </w:rPr>
-      </w:pPr>
-      <w:r>
-        <w:rPr>
-          <w:rFonts w:cs="Arial"/>
-          <w:sz w:val="18"/>
-          <w:szCs w:val="18"/>
-        </w:rPr>
-        <w:t>Recommended Resources</w:t>
-      </w:r>
-    </w:p>
-    <w:p>
-      <w:pPr>
-        <w:pStyle w:val="ListNumber"/>
-        <w:spacing w:after="40"/>
-        <w:ind w:left="1008"/>
-        <w:rPr>
-          <w:rFonts w:cs="Arial"/>
-          <w:sz w:val="18"/>
-          <w:szCs w:val="18"/>
-        </w:rPr>
-      </w:pPr>
-      <w:r>
-        <w:rPr>
-          <w:rFonts w:cs="Arial"/>
-          <w:b/>
-          <w:sz w:val="18"/>
-          <w:szCs w:val="18"/>
-        </w:rPr>
-        <w:t>React Native Official Docs</w:t>
-      </w:r>
-      <w:r>
-        <w:rPr>
-          <w:rFonts w:cs="Arial"/>
-          <w:sz w:val="18"/>
-          <w:szCs w:val="18"/>
-        </w:rPr>
-        <w:t xml:space="preserve"> — </w:t>
-      </w:r>
-      <w:r>
-        <w:rPr>
-          <w:rFonts w:cs="Arial"/>
-          <w:color w:val="0563C1"/>
-          <w:sz w:val="18"/>
-          <w:szCs w:val="18"/>
-          <w:u w:val="single"/>
-        </w:rPr>
-        <w:t>reactnative.dev</w:t>
-      </w:r>
-      <w:r>
-        <w:rPr>
-          <w:rFonts w:cs="Arial"/>
-          <w:sz w:val="18"/>
-          <w:szCs w:val="18"/>
-        </w:rPr>
-        <w:t xml:space="preserve"> (https://reactnative.dev) — component API reference and guides</w:t>
-      </w:r>
-    </w:p>
-    <w:p>
-      <w:pPr>
-        <w:pStyle w:val="ListNumber"/>
-        <w:spacing w:after="40"/>
-        <w:ind w:left="1008"/>
-        <w:rPr>
-          <w:rFonts w:cs="Arial"/>
-          <w:sz w:val="18"/>
-          <w:szCs w:val="18"/>
-        </w:rPr>
-      </w:pPr>
-      <w:r>
-        <w:rPr>
-          <w:rFonts w:cs="Arial"/>
-          <w:b/>
-          <w:sz w:val="18"/>
-          <w:szCs w:val="18"/>
-        </w:rPr>
-        <w:t>Expo Documentation</w:t>
-      </w:r>
-      <w:r>
-        <w:rPr>
-          <w:rFonts w:cs="Arial"/>
-          <w:sz w:val="18"/>
-          <w:szCs w:val="18"/>
-        </w:rPr>
-        <w:t xml:space="preserve"> — </w:t>
-      </w:r>
-      <w:r>
-        <w:rPr>
-          <w:rFonts w:cs="Arial"/>
-          <w:color w:val="0563C1"/>
-          <w:sz w:val="18"/>
-          <w:szCs w:val="18"/>
-          <w:u w:val="single"/>
-        </w:rPr>
-        <w:t>docs.expo.dev</w:t>
-      </w:r>
-      <w:r>
-        <w:rPr>
-          <w:rFonts w:cs="Arial"/>
-          <w:sz w:val="18"/>
-          <w:szCs w:val="18"/>
-        </w:rPr>
-        <w:t xml:space="preserve"> (https://docs.expo.dev) — Expo SDK APIs, EAS Build, and managed workflow</w:t>
-      </w:r>
-    </w:p>
-    <w:p>
-      <w:pPr>
-        <w:pStyle w:val="ListNumber"/>
-        <w:spacing w:after="40"/>
-        <w:ind w:left="1008"/>
-        <w:rPr>
-          <w:rFonts w:cs="Arial"/>
-          <w:sz w:val="18"/>
-          <w:szCs w:val="18"/>
-        </w:rPr>
-      </w:pPr>
-      <w:r>
-        <w:rPr>
-          <w:rFonts w:cs="Arial"/>
-          <w:b/>
-          <w:sz w:val="18"/>
-          <w:szCs w:val="18"/>
-        </w:rPr>
-        <w:t>React Navigation Docs</w:t>
-      </w:r>
-      <w:r>
-        <w:rPr>
-          <w:rFonts w:cs="Arial"/>
-          <w:sz w:val="18"/>
-          <w:szCs w:val="18"/>
-        </w:rPr>
-        <w:t xml:space="preserve"> — </w:t>
-      </w:r>
-      <w:r>
-        <w:rPr>
-          <w:rFonts w:cs="Arial"/>
-          <w:color w:val="0563C1"/>
-          <w:sz w:val="18"/>
-          <w:szCs w:val="18"/>
-          <w:u w:val="single"/>
-        </w:rPr>
-        <w:t>reactnavigation.org</w:t>
-      </w:r>
-      <w:r>
-        <w:rPr>
-          <w:rFonts w:cs="Arial"/>
-          <w:sz w:val="18"/>
-          <w:szCs w:val="18"/>
-        </w:rPr>
-        <w:t xml:space="preserve"> (https://reactnavigation.org) — navigation patterns and API reference</w:t>
-      </w:r>
-    </w:p>
-    <w:p>
-      <w:pPr>
-        <w:pStyle w:val="ListNumber"/>
-        <w:spacing w:after="40"/>
-        <w:ind w:left="1008"/>
-        <w:rPr>
-          <w:rFonts w:cs="Arial"/>
-          <w:sz w:val="18"/>
-          <w:szCs w:val="18"/>
-        </w:rPr>
-      </w:pPr>
-      <w:r>
-        <w:rPr>
-          <w:rFonts w:cs="Arial"/>
-          <w:b/>
-          <w:sz w:val="18"/>
-          <w:szCs w:val="18"/>
-        </w:rPr>
-        <w:t>EAS Build Guide</w:t>
-      </w:r>
-      <w:r>
-        <w:rPr>
-          <w:rFonts w:cs="Arial"/>
-          <w:sz w:val="18"/>
-          <w:szCs w:val="18"/>
-        </w:rPr>
-        <w:t xml:space="preserve"> — </w:t>
-      </w:r>
-      <w:r>
-        <w:rPr>
-          <w:rFonts w:cs="Arial"/>
-          <w:color w:val="0563C1"/>
-          <w:sz w:val="18"/>
-          <w:szCs w:val="18"/>
-          <w:u w:val="single"/>
-        </w:rPr>
-        <w:t>docs.expo.dev/build/introduction</w:t>
-      </w:r>
-      <w:r>
-        <w:rPr>
-          <w:rFonts w:cs="Arial"/>
-          <w:sz w:val="18"/>
-          <w:szCs w:val="18"/>
-        </w:rPr>
-        <w:t xml:space="preserve"> (https://docs.expo.dev/build/introduction/) — configuring and running EAS builds</w:t>
-      </w:r>
-    </w:p>
-    <w:p>
-      <w:pPr>
-        <w:pStyle w:val="CustomHeading2"/>
-        <w:ind w:left="720"/>
-        <w:rPr>
-          <w:rFonts w:cs="Arial"/>
-          <w:sz w:val="18"/>
-          <w:szCs w:val="18"/>
-        </w:rPr>
-      </w:pPr>
-      <w:r>
-        <w:rPr>
-          <w:rFonts w:cs="Arial"/>
-          <w:sz w:val="18"/>
-          <w:szCs w:val="18"/>
-        </w:rPr>
-        <w:t>Free PDF Quick-Reference Books (goalkicker.com)</w:t>
-      </w:r>
-    </w:p>
-    <w:tbl>
-      <w:tblPr>
-        <w:tblW w:w="0" w:type="auto"/>
-        <w:jc w:val="center"/>
-        <w:tblBorders>
-          <w:top w:val="single" w:sz="8" w:space="0" w:color="CFCFCF"/>
-          <w:left w:val="single" w:sz="8" w:space="0" w:color="CFCFCF"/>
-          <w:bottom w:val="single" w:sz="8" w:space="0" w:color="CFCFCF"/>
-          <w:right w:val="single" w:sz="8" w:space="0" w:color="CFCFCF"/>
-          <w:insideH w:val="single" w:sz="8" w:space="0" w:color="CFCFCF"/>
-          <w:insideV w:val="single" w:sz="8" w:space="0" w:color="CFCFCF"/>
-        </w:tblBorders>
-        <w:tblLook w:val="04A0" w:firstRow="1" w:lastRow="0" w:firstColumn="1" w:lastColumn="0" w:noHBand="0" w:noVBand="1"/>
-      </w:tblPr>
-      <w:tblGrid>
-        <w:gridCol w:w="2433"/>
-        <w:gridCol w:w="6653"/>
-      </w:tblGrid>
-      <w:tr>
-        <w:trPr>
-          <w:jc w:val="center"/>
-        </w:trPr>
-        <w:tc>
-          <w:tcPr>
-            <w:tcW w:w="2433" w:type="dxa"/>
-            <w:shd w:val="clear" w:color="auto" w:fill="F5F5F5"/>
-            <w:tcMar>
-              <w:top w:w="80" w:type="dxa"/>
-              <w:left w:w="100" w:type="dxa"/>
-              <w:bottom w:w="80" w:type="dxa"/>
-              <w:right w:w="100" w:type="dxa"/>
-            </w:tcMar>
-          </w:tcPr>
-          <w:p>
-            <w:pPr>
-              <w:spacing w:after="0"/>
-              <w:rPr>
-                <w:rFonts w:cs="Arial"/>
-                <w:sz w:val="18"/>
-                <w:szCs w:val="18"/>
-              </w:rPr>
-            </w:pPr>
-            <w:r>
-              <w:rPr>
-                <w:rFonts w:cs="Arial"/>
-                <w:b/>
-                <w:sz w:val="18"/>
-                <w:szCs w:val="18"/>
-              </w:rPr>
-              <w:t>Topic</w:t>
-            </w:r>
-          </w:p>
-        </w:tc>
-        <w:tc>
-          <w:tcPr>
-            <w:tcW w:w="6653" w:type="dxa"/>
-            <w:shd w:val="clear" w:color="auto" w:fill="F5F5F5"/>
-            <w:tcMar>
-              <w:top w:w="80" w:type="dxa"/>
-              <w:left w:w="100" w:type="dxa"/>
-              <w:bottom w:w="80" w:type="dxa"/>
-              <w:right w:w="100" w:type="dxa"/>
-            </w:tcMar>
-          </w:tcPr>
-          <w:p>
-            <w:pPr>
-              <w:spacing w:after="0"/>
-              <w:rPr>
-                <w:rFonts w:cs="Arial"/>
-                <w:sz w:val="18"/>
-                <w:szCs w:val="18"/>
-              </w:rPr>
-            </w:pPr>
-            <w:r>
-              <w:rPr>
-                <w:rFonts w:cs="Arial"/>
-                <w:b/>
-                <w:sz w:val="18"/>
-                <w:szCs w:val="18"/>
-              </w:rPr>
-              <w:t>Download</w:t>
-            </w:r>
-          </w:p>
-        </w:tc>
-      </w:tr>
-      <w:tr>
-        <w:trPr>
-          <w:jc w:val="center"/>
-        </w:trPr>
-        <w:tc>
-          <w:tcPr>
-            <w:tcW w:w="2433" w:type="dxa"/>
-            <w:tcMar>
-              <w:top w:w="80" w:type="dxa"/>
-              <w:left w:w="100" w:type="dxa"/>
-              <w:bottom w:w="80" w:type="dxa"/>
-              <w:right w:w="100" w:type="dxa"/>
-            </w:tcMar>
-          </w:tcPr>
-          <w:p>
-            <w:pPr>
-              <w:spacing w:after="0"/>
-              <w:rPr>
-                <w:rFonts w:cs="Arial"/>
-                <w:sz w:val="18"/>
-                <w:szCs w:val="18"/>
-              </w:rPr>
-            </w:pPr>
-            <w:r>
-              <w:rPr>
-                <w:rFonts w:cs="Arial"/>
-                <w:sz w:val="18"/>
-                <w:szCs w:val="18"/>
-              </w:rPr>
-              <w:t>React JS</w:t>
-            </w:r>
-          </w:p>
-        </w:tc>
-        <w:tc>
-          <w:tcPr>
-            <w:tcW w:w="6653" w:type="dxa"/>
-            <w:tcMar>
-              <w:top w:w="80" w:type="dxa"/>
-              <w:left w:w="100" w:type="dxa"/>
-              <w:bottom w:w="80" w:type="dxa"/>
-              <w:right w:w="100" w:type="dxa"/>
-            </w:tcMar>
-          </w:tcPr>
-          <w:p>
-            <w:pPr>
-              <w:spacing w:after="0"/>
-              <w:rPr>
-                <w:rFonts w:cs="Arial"/>
-                <w:sz w:val="18"/>
-                <w:szCs w:val="18"/>
-              </w:rPr>
-            </w:pPr>
-            <w:r>
-              <w:rPr>
-                <w:rFonts w:cs="Arial"/>
-                <w:color w:val="0563C1"/>
-                <w:sz w:val="18"/>
-                <w:szCs w:val="18"/>
-                <w:u w:val="single"/>
-              </w:rPr>
-              <w:t>React JS Notes for Professionals (PDF)</w:t>
-            </w:r>
-            <w:r>
-              <w:rPr>
-                <w:rFonts w:cs="Arial"/>
-                <w:sz w:val="18"/>
-                <w:szCs w:val="18"/>
-              </w:rPr>
-              <w:t xml:space="preserve"> (https://goalkicker.com/ReactJSBook/ReactJSNotesForProfessionals.pdf)</w:t>
-            </w:r>
-          </w:p>
-        </w:tc>
-      </w:tr>
-      <w:tr>
-        <w:trPr>
-          <w:jc w:val="center"/>
-        </w:trPr>
-        <w:tc>
-          <w:tcPr>
-            <w:tcW w:w="2433" w:type="dxa"/>
-            <w:tcMar>
-              <w:top w:w="80" w:type="dxa"/>
-              <w:left w:w="100" w:type="dxa"/>
-              <w:bottom w:w="80" w:type="dxa"/>
-              <w:right w:w="100" w:type="dxa"/>
-            </w:tcMar>
-          </w:tcPr>
-          <w:p>
-            <w:pPr>
-              <w:spacing w:after="0"/>
-              <w:rPr>
-                <w:rFonts w:cs="Arial"/>
-                <w:sz w:val="18"/>
-                <w:szCs w:val="18"/>
-              </w:rPr>
-            </w:pPr>
-            <w:r>
-              <w:rPr>
-                <w:rFonts w:cs="Arial"/>
-                <w:sz w:val="18"/>
-                <w:szCs w:val="18"/>
-              </w:rPr>
-              <w:t>React Native</w:t>
-            </w:r>
-          </w:p>
-        </w:tc>
-        <w:tc>
-          <w:tcPr>
-            <w:tcW w:w="6653" w:type="dxa"/>
-            <w:tcMar>
-              <w:top w:w="80" w:type="dxa"/>
-              <w:left w:w="100" w:type="dxa"/>
-              <w:bottom w:w="80" w:type="dxa"/>
-              <w:right w:w="100" w:type="dxa"/>
-            </w:tcMar>
-          </w:tcPr>
-          <w:p>
-            <w:pPr>
-              <w:spacing w:after="0"/>
-              <w:rPr>
-                <w:rFonts w:cs="Arial"/>
-                <w:sz w:val="18"/>
-                <w:szCs w:val="18"/>
-              </w:rPr>
-            </w:pPr>
-            <w:r>
-              <w:rPr>
-                <w:rFonts w:cs="Arial"/>
-                <w:color w:val="0563C1"/>
-                <w:sz w:val="18"/>
-                <w:szCs w:val="18"/>
-                <w:u w:val="single"/>
-              </w:rPr>
-              <w:t>React Native Notes for Professionals (PDF)</w:t>
-            </w:r>
-            <w:r>
-              <w:rPr>
-                <w:rFonts w:cs="Arial"/>
-                <w:sz w:val="18"/>
-                <w:szCs w:val="18"/>
-              </w:rPr>
-              <w:t xml:space="preserve"> (https://goalkicker.com/ReactNativeBook/ReactNativeNotesForProfessionals.pdf)</w:t>
-            </w:r>
-          </w:p>
-        </w:tc>
-      </w:tr>
-      <w:tr>
-        <w:trPr>
-          <w:jc w:val="center"/>
-        </w:trPr>
-        <w:tc>
-          <w:tcPr>
-            <w:tcW w:w="2433" w:type="dxa"/>
-            <w:tcMar>
-              <w:top w:w="80" w:type="dxa"/>
-              <w:left w:w="100" w:type="dxa"/>
-              <w:bottom w:w="80" w:type="dxa"/>
-              <w:right w:w="100" w:type="dxa"/>
-            </w:tcMar>
-          </w:tcPr>
-          <w:p>
-            <w:pPr>
-              <w:spacing w:after="0"/>
-              <w:rPr>
-                <w:rFonts w:cs="Arial"/>
-                <w:sz w:val="18"/>
-                <w:szCs w:val="18"/>
-              </w:rPr>
-            </w:pPr>
-            <w:r>
-              <w:rPr>
-                <w:rFonts w:cs="Arial"/>
-                <w:sz w:val="18"/>
-                <w:szCs w:val="18"/>
-              </w:rPr>
-              <w:t>JavaScript</w:t>
-            </w:r>
-          </w:p>
-        </w:tc>
-        <w:tc>
-          <w:tcPr>
-            <w:tcW w:w="6653" w:type="dxa"/>
-            <w:tcMar>
-              <w:top w:w="80" w:type="dxa"/>
-              <w:left w:w="100" w:type="dxa"/>
-              <w:bottom w:w="80" w:type="dxa"/>
-              <w:right w:w="100" w:type="dxa"/>
-            </w:tcMar>
-          </w:tcPr>
-          <w:p>
-            <w:pPr>
-              <w:spacing w:after="0"/>
-              <w:rPr>
-                <w:rFonts w:cs="Arial"/>
-                <w:sz w:val="18"/>
-                <w:szCs w:val="18"/>
-              </w:rPr>
-            </w:pPr>
-            <w:r>
-              <w:rPr>
-                <w:rFonts w:cs="Arial"/>
-                <w:color w:val="0563C1"/>
-                <w:sz w:val="18"/>
-                <w:szCs w:val="18"/>
-                <w:u w:val="single"/>
-              </w:rPr>
-              <w:t>JavaScript Notes for Professionals (PDF)</w:t>
-            </w:r>
-            <w:r>
-              <w:rPr>
-                <w:rFonts w:cs="Arial"/>
-                <w:sz w:val="18"/>
-                <w:szCs w:val="18"/>
-              </w:rPr>
-              <w:t xml:space="preserve"> (https://goalkicker.com/JavaScriptBook/JavaScriptNotesForProfessionals.pdf)</w:t>
-            </w:r>
-          </w:p>
-        </w:tc>
-      </w:tr>
-    </w:tbl>
-    <w:p>
-      <w:pPr>
-        <w:pStyle w:val="QuoteCustom"/>
-        <w:ind w:left="720"/>
-        <w:rPr>
-          <w:rFonts w:cs="Arial"/>
-          <w:sz w:val="18"/>
-          <w:szCs w:val="18"/>
-        </w:rPr>
-      </w:pPr>
-      <w:r>
-        <w:rPr>
-          <w:rFonts w:cs="Arial"/>
-          <w:sz w:val="18"/>
-          <w:szCs w:val="18"/>
-        </w:rPr>
-        <w:br/>
-        <w:t>React Native shares the same JavaScript and React fundamentals as CSE 2232. Students are encouraged to keep the React JS and JavaScript Goalkicker PDFs from that course as ongoing references.</w:t>
-      </w:r>
-      <w:r>
-        <w:rPr>
-          <w:rFonts w:cs="Arial"/>
-          <w:sz w:val="18"/>
-          <w:szCs w:val="18"/>
-        </w:rPr>
-        <w:br/>
       </w:r>
     </w:p>
     <w:sectPr>

</xml_diff>

<commit_message>
Consolidate CSE 3172 labs from 10 to 8
- Merge Core Components and Styling/Flexbox into Lab 2
- Move AsyncStorage into Lab 5 (Fetching Data and Local Storage)
- Move notifications into Lab 6 (Device APIs)
- Renumber remaining labs in both print draft and markdown; update Lab 5 exercise and Labs 1-8 references
</commit_message>
<xml_diff>
--- a/48-CSE 3172_U.docx
+++ b/48-CSE 3172_U.docx
@@ -1,6 +1,6 @@
 
 <file path=word/document.xml><?xml version="1.0" encoding="utf-8"?>
-<w:document xmlns:wpc="http://schemas.microsoft.com/office/word/2010/wordprocessingCanvas" xmlns:mc="http://schemas.openxmlformats.org/markup-compatibility/2006" xmlns:o="urn:schemas-microsoft-com:office:office" xmlns:r="http://schemas.openxmlformats.org/officeDocument/2006/relationships" xmlns:m="http://schemas.openxmlformats.org/officeDocument/2006/math" xmlns:v="urn:schemas-microsoft-com:vml" xmlns:wp14="http://schemas.microsoft.com/office/word/2010/wordprocessingDrawing" xmlns:wp="http://schemas.openxmlformats.org/drawingml/2006/wordprocessingDrawing" xmlns:w10="urn:schemas-microsoft-com:office:word" xmlns:w="http://schemas.openxmlformats.org/wordprocessingml/2006/main" xmlns:w14="http://schemas.microsoft.com/office/word/2010/wordml" xmlns:w15="http://schemas.microsoft.com/office/word/2012/wordml" xmlns:wpg="http://schemas.microsoft.com/office/word/2010/wordprocessingGroup" xmlns:wpi="http://schemas.microsoft.com/office/word/2010/wordprocessingInk" xmlns:wne="http://schemas.microsoft.com/office/word/2006/wordml" xmlns:wps="http://schemas.microsoft.com/office/word/2010/wordprocessingShape" mc:Ignorable="w14 w15 wp14">
+<w:document xmlns:wpc="http://schemas.microsoft.com/office/word/2010/wordprocessingCanvas" xmlns:cx="http://schemas.microsoft.com/office/drawing/2014/chartex" xmlns:cx1="http://schemas.microsoft.com/office/drawing/2015/9/8/chartex" xmlns:cx2="http://schemas.microsoft.com/office/drawing/2015/10/21/chartex" xmlns:cx3="http://schemas.microsoft.com/office/drawing/2016/5/9/chartex" xmlns:cx4="http://schemas.microsoft.com/office/drawing/2016/5/10/chartex" xmlns:cx5="http://schemas.microsoft.com/office/drawing/2016/5/11/chartex" xmlns:cx6="http://schemas.microsoft.com/office/drawing/2016/5/12/chartex" xmlns:cx7="http://schemas.microsoft.com/office/drawing/2016/5/13/chartex" xmlns:cx8="http://schemas.microsoft.com/office/drawing/2016/5/14/chartex" xmlns:mc="http://schemas.openxmlformats.org/markup-compatibility/2006" xmlns:m="http://schemas.openxmlformats.org/officeDocument/2006/math" xmlns:aink="http://schemas.microsoft.com/office/drawing/2016/ink" xmlns:am3d="http://schemas.microsoft.com/office/drawing/2017/model3d" xmlns:oel="http://schemas.microsoft.com/office/2019/extlst" xmlns:r="http://schemas.openxmlformats.org/officeDocument/2006/relationships" xmlns:wp14="http://schemas.microsoft.com/office/word/2010/wordprocessingDrawing" xmlns:wp="http://schemas.openxmlformats.org/drawingml/2006/wordprocessingDrawing" xmlns:wpg="http://schemas.microsoft.com/office/word/2010/wordprocessingGroup" xmlns:wpi="http://schemas.microsoft.com/office/word/2010/wordprocessingInk" xmlns:wps="http://schemas.microsoft.com/office/word/2010/wordprocessingShape" xmlns:o="urn:schemas-microsoft-com:office:office" xmlns:v="urn:schemas-microsoft-com:vml" xmlns:w10="urn:schemas-microsoft-com:office:word" xmlns:w="http://schemas.openxmlformats.org/wordprocessingml/2006/main" xmlns:w14="http://schemas.microsoft.com/office/word/2010/wordml" xmlns:w15="http://schemas.microsoft.com/office/word/2012/wordml" xmlns:w16cex="http://schemas.microsoft.com/office/word/2018/wordml/cex" xmlns:w16cid="http://schemas.microsoft.com/office/word/2016/wordml/cid" xmlns:w16="http://schemas.microsoft.com/office/word/2018/wordml" xmlns:w16sdtdh="http://schemas.microsoft.com/office/word/2020/wordml/sdtdatahash" xmlns:w16sdtfl="http://schemas.microsoft.com/office/word/2024/wordml/sdtformatlock" xmlns:w16se="http://schemas.microsoft.com/office/word/2015/wordml/symex" xmlns:w16du="http://schemas.microsoft.com/office/word/2023/wordml/word16du" xmlns:wne="http://schemas.microsoft.com/office/word/2006/wordml" mc:Ignorable="w14 w15 w16se w16cid w16 w16cex w16sdtdh w16sdtfl w16du wp14">
   <w:body>
     <w:p>
       <w:pPr>
@@ -44,8 +44,6 @@
         </w:rPr>
         <w:t>317</w:t>
       </w:r>
-      <w:bookmarkStart w:id="0" w:name="_GoBack"/>
-      <w:bookmarkEnd w:id="0"/>
       <w:r>
         <w:rPr>
           <w:rFonts w:eastAsia="Arial" w:cs="Arial"/>
@@ -469,8 +467,8 @@
                 <w:lang w:val="en"/>
               </w:rPr>
             </w:pPr>
-            <w:bookmarkStart w:id="1" w:name="_9926sq2j1afr" w:colFirst="0" w:colLast="0"/>
-            <w:bookmarkEnd w:id="1"/>
+            <w:bookmarkStart w:id="0" w:name="_9926sq2j1afr" w:colFirst="0" w:colLast="0"/>
+            <w:bookmarkEnd w:id="0"/>
             <w:r>
               <w:rPr>
                 <w:rFonts w:eastAsia="Arial" w:cs="Arial"/>
@@ -602,12 +600,12 @@
         <w:tblLook w:val="04A0" w:firstRow="1" w:lastRow="0" w:firstColumn="1" w:lastColumn="0" w:noHBand="0" w:noVBand="1"/>
       </w:tblPr>
       <w:tblGrid>
-        <w:gridCol w:w="571"/>
-        <w:gridCol w:w="2020"/>
+        <w:gridCol w:w="572"/>
+        <w:gridCol w:w="2015"/>
         <w:gridCol w:w="1981"/>
-        <w:gridCol w:w="1777"/>
-        <w:gridCol w:w="1593"/>
-        <w:gridCol w:w="1618"/>
+        <w:gridCol w:w="1783"/>
+        <w:gridCol w:w="1592"/>
+        <w:gridCol w:w="1617"/>
       </w:tblGrid>
       <w:tr>
         <w:trPr>
@@ -2398,6 +2396,7 @@
     <w:p>
       <w:pPr>
         <w:pStyle w:val="CustomHeading2"/>
+        <w:spacing w:before="120" w:after="0" w:line="240" w:lineRule="auto"/>
         <w:ind w:left="720"/>
         <w:rPr>
           <w:rFonts w:cs="Arial"/>
@@ -2417,6 +2416,7 @@
     <w:p>
       <w:pPr>
         <w:pStyle w:val="CustomHeading2"/>
+        <w:spacing w:before="120" w:after="0" w:line="240" w:lineRule="auto"/>
         <w:ind w:left="720"/>
         <w:rPr>
           <w:rFonts w:cs="Arial"/>
@@ -2430,12 +2430,13 @@
           <w:sz w:val="18"/>
           <w:szCs w:val="18"/>
         </w:rPr>
-        <w:t>Lab 2 — Core Components and Layouts</w:t>
+        <w:t>Lab 2 — Core Components, Styling, and Flexbox</w:t>
       </w:r>
     </w:p>
     <w:p>
       <w:pPr>
         <w:pStyle w:val="CustomHeading2"/>
+        <w:spacing w:before="120" w:after="0" w:line="240" w:lineRule="auto"/>
         <w:ind w:left="720"/>
         <w:rPr>
           <w:rFonts w:cs="Arial"/>
@@ -2449,12 +2450,13 @@
           <w:sz w:val="18"/>
           <w:szCs w:val="18"/>
         </w:rPr>
-        <w:t>Lab 3 — Styling and Flexbox in React Native</w:t>
+        <w:t>Lab 3 — Navigation with React Navigation</w:t>
       </w:r>
     </w:p>
     <w:p>
       <w:pPr>
         <w:pStyle w:val="CustomHeading2"/>
+        <w:spacing w:before="120" w:after="0" w:line="240" w:lineRule="auto"/>
         <w:ind w:left="720"/>
         <w:rPr>
           <w:rFonts w:cs="Arial"/>
@@ -2468,12 +2470,13 @@
           <w:sz w:val="18"/>
           <w:szCs w:val="18"/>
         </w:rPr>
-        <w:t>Lab 4 — Navigation with React Navigation</w:t>
+        <w:t>Lab 4 — User Input, Forms, and Keyboard Handling</w:t>
       </w:r>
     </w:p>
     <w:p>
       <w:pPr>
         <w:pStyle w:val="CustomHeading2"/>
+        <w:spacing w:before="120" w:after="0" w:line="240" w:lineRule="auto"/>
         <w:ind w:left="720"/>
         <w:rPr>
           <w:rFonts w:cs="Arial"/>
@@ -2487,12 +2490,13 @@
           <w:sz w:val="18"/>
           <w:szCs w:val="18"/>
         </w:rPr>
-        <w:t>Lab 5 — User Input, Forms, and Keyboard Handling</w:t>
+        <w:t>Lab 5 — Fetching Data and Local Storage</w:t>
       </w:r>
     </w:p>
     <w:p>
       <w:pPr>
         <w:pStyle w:val="CustomHeading2"/>
+        <w:spacing w:before="120" w:after="0" w:line="240" w:lineRule="auto"/>
         <w:ind w:left="720"/>
         <w:rPr>
           <w:rFonts w:cs="Arial"/>
@@ -2506,12 +2510,13 @@
           <w:sz w:val="18"/>
           <w:szCs w:val="18"/>
         </w:rPr>
-        <w:t>Lab 6 — Fetching Data and Async State</w:t>
+        <w:t>Lab 6 — Device APIs: Camera, Location, and Notifications</w:t>
       </w:r>
     </w:p>
     <w:p>
       <w:pPr>
         <w:pStyle w:val="CustomHeading2"/>
+        <w:spacing w:before="120" w:after="0" w:line="240" w:lineRule="auto"/>
         <w:ind w:left="720"/>
         <w:rPr>
           <w:rFonts w:cs="Arial"/>
@@ -2525,12 +2530,13 @@
           <w:sz w:val="18"/>
           <w:szCs w:val="18"/>
         </w:rPr>
-        <w:t>Lab 7 — Device APIs: Camera and Location</w:t>
+        <w:t>Lab 7 — EAS Build: Producing a Distributable App</w:t>
       </w:r>
     </w:p>
     <w:p>
       <w:pPr>
         <w:pStyle w:val="CustomHeading2"/>
+        <w:spacing w:before="120" w:after="0" w:line="240" w:lineRule="auto"/>
         <w:ind w:left="720"/>
         <w:rPr>
           <w:rFonts w:cs="Arial"/>
@@ -2544,45 +2550,7 @@
           <w:sz w:val="18"/>
           <w:szCs w:val="18"/>
         </w:rPr>
-        <w:t>Lab 8 — Notifications and Local Storage</w:t>
-      </w:r>
-    </w:p>
-    <w:p>
-      <w:pPr>
-        <w:pStyle w:val="CustomHeading2"/>
-        <w:ind w:left="720"/>
-        <w:rPr>
-          <w:rFonts w:cs="Arial"/>
-          <w:sz w:val="18"/>
-          <w:szCs w:val="18"/>
-        </w:rPr>
-      </w:pPr>
-      <w:r>
-        <w:rPr>
-          <w:rFonts w:cs="Arial"/>
-          <w:sz w:val="18"/>
-          <w:szCs w:val="18"/>
-        </w:rPr>
-        <w:t>Lab 9 — EAS Build: Producing a Distributable App</w:t>
-      </w:r>
-    </w:p>
-    <w:p>
-      <w:pPr>
-        <w:pStyle w:val="CustomHeading2"/>
-        <w:ind w:left="720"/>
-        <w:rPr>
-          <w:rFonts w:cs="Arial"/>
-          <w:sz w:val="18"/>
-          <w:szCs w:val="18"/>
-        </w:rPr>
-      </w:pPr>
-      <w:r>
-        <w:rPr>
-          <w:rFonts w:cs="Arial"/>
-          <w:sz w:val="18"/>
-          <w:szCs w:val="18"/>
-        </w:rPr>
-        <w:t>Lab 10 — React Native Capstone Project</w:t>
+        <w:t>Lab 8 — React Native Capstone Project</w:t>
       </w:r>
     </w:p>
     <w:p>
@@ -2601,6 +2569,7 @@
           <w:sz w:val="18"/>
           <w:szCs w:val="18"/>
         </w:rPr>
+        <w:lastRenderedPageBreak/>
         <w:t>Textbooks</w:t>
       </w:r>
     </w:p>
@@ -2689,8 +2658,8 @@
 </file>
 
 <file path=word/numbering.xml><?xml version="1.0" encoding="utf-8"?>
-<w:numbering xmlns:wpc="http://schemas.microsoft.com/office/word/2010/wordprocessingCanvas" xmlns:mc="http://schemas.openxmlformats.org/markup-compatibility/2006" xmlns:o="urn:schemas-microsoft-com:office:office" xmlns:r="http://schemas.openxmlformats.org/officeDocument/2006/relationships" xmlns:m="http://schemas.openxmlformats.org/officeDocument/2006/math" xmlns:v="urn:schemas-microsoft-com:vml" xmlns:wp14="http://schemas.microsoft.com/office/word/2010/wordprocessingDrawing" xmlns:wp="http://schemas.openxmlformats.org/drawingml/2006/wordprocessingDrawing" xmlns:w10="urn:schemas-microsoft-com:office:word" xmlns:w="http://schemas.openxmlformats.org/wordprocessingml/2006/main" xmlns:w14="http://schemas.microsoft.com/office/word/2010/wordml" xmlns:w15="http://schemas.microsoft.com/office/word/2012/wordml" xmlns:wpg="http://schemas.microsoft.com/office/word/2010/wordprocessingGroup" xmlns:wpi="http://schemas.microsoft.com/office/word/2010/wordprocessingInk" xmlns:wne="http://schemas.microsoft.com/office/word/2006/wordml" xmlns:wps="http://schemas.microsoft.com/office/word/2010/wordprocessingShape" mc:Ignorable="w14 w15 wp14">
-  <w:abstractNum w:abstractNumId="0">
+<w:numbering xmlns:wpc="http://schemas.microsoft.com/office/word/2010/wordprocessingCanvas" xmlns:cx="http://schemas.microsoft.com/office/drawing/2014/chartex" xmlns:cx1="http://schemas.microsoft.com/office/drawing/2015/9/8/chartex" xmlns:cx2="http://schemas.microsoft.com/office/drawing/2015/10/21/chartex" xmlns:cx3="http://schemas.microsoft.com/office/drawing/2016/5/9/chartex" xmlns:cx4="http://schemas.microsoft.com/office/drawing/2016/5/10/chartex" xmlns:cx5="http://schemas.microsoft.com/office/drawing/2016/5/11/chartex" xmlns:cx6="http://schemas.microsoft.com/office/drawing/2016/5/12/chartex" xmlns:cx7="http://schemas.microsoft.com/office/drawing/2016/5/13/chartex" xmlns:cx8="http://schemas.microsoft.com/office/drawing/2016/5/14/chartex" xmlns:mc="http://schemas.openxmlformats.org/markup-compatibility/2006" xmlns:m="http://schemas.openxmlformats.org/officeDocument/2006/math" xmlns:aink="http://schemas.microsoft.com/office/drawing/2016/ink" xmlns:am3d="http://schemas.microsoft.com/office/drawing/2017/model3d" xmlns:oel="http://schemas.microsoft.com/office/2019/extlst" xmlns:r="http://schemas.openxmlformats.org/officeDocument/2006/relationships" xmlns:wp14="http://schemas.microsoft.com/office/word/2010/wordprocessingDrawing" xmlns:wp="http://schemas.openxmlformats.org/drawingml/2006/wordprocessingDrawing" xmlns:wpg="http://schemas.microsoft.com/office/word/2010/wordprocessingGroup" xmlns:wpi="http://schemas.microsoft.com/office/word/2010/wordprocessingInk" xmlns:wps="http://schemas.microsoft.com/office/word/2010/wordprocessingShape" xmlns:o="urn:schemas-microsoft-com:office:office" xmlns:v="urn:schemas-microsoft-com:vml" xmlns:w10="urn:schemas-microsoft-com:office:word" xmlns:w="http://schemas.openxmlformats.org/wordprocessingml/2006/main" xmlns:w14="http://schemas.microsoft.com/office/word/2010/wordml" xmlns:w15="http://schemas.microsoft.com/office/word/2012/wordml" xmlns:w16cex="http://schemas.microsoft.com/office/word/2018/wordml/cex" xmlns:w16cid="http://schemas.microsoft.com/office/word/2016/wordml/cid" xmlns:w16="http://schemas.microsoft.com/office/word/2018/wordml" xmlns:w16sdtdh="http://schemas.microsoft.com/office/word/2020/wordml/sdtdatahash" xmlns:w16sdtfl="http://schemas.microsoft.com/office/word/2024/wordml/sdtformatlock" xmlns:w16se="http://schemas.microsoft.com/office/word/2015/wordml/symex" xmlns:w16du="http://schemas.microsoft.com/office/word/2023/wordml/word16du" xmlns:wne="http://schemas.microsoft.com/office/word/2006/wordml" mc:Ignorable="w14 w15 w16se w16cid w16 w16cex w16sdtdh w16sdtfl w16du wp14">
+  <w:abstractNum w:abstractNumId="0" w15:restartNumberingAfterBreak="0">
     <w:nsid w:val="FFFFFF7C"/>
     <w:multiLevelType w:val="singleLevel"/>
     <w:tmpl w:val="C310EC42"/>
@@ -2707,7 +2676,7 @@
       </w:pPr>
     </w:lvl>
   </w:abstractNum>
-  <w:abstractNum w:abstractNumId="1">
+  <w:abstractNum w:abstractNumId="1" w15:restartNumberingAfterBreak="0">
     <w:nsid w:val="FFFFFF7D"/>
     <w:multiLevelType w:val="singleLevel"/>
     <w:tmpl w:val="E4089024"/>
@@ -2724,7 +2693,7 @@
       </w:pPr>
     </w:lvl>
   </w:abstractNum>
-  <w:abstractNum w:abstractNumId="2">
+  <w:abstractNum w:abstractNumId="2" w15:restartNumberingAfterBreak="0">
     <w:nsid w:val="FFFFFF7E"/>
     <w:multiLevelType w:val="singleLevel"/>
     <w:tmpl w:val="FB12693A"/>
@@ -2742,7 +2711,7 @@
       </w:pPr>
     </w:lvl>
   </w:abstractNum>
-  <w:abstractNum w:abstractNumId="3">
+  <w:abstractNum w:abstractNumId="3" w15:restartNumberingAfterBreak="0">
     <w:nsid w:val="FFFFFF7F"/>
     <w:multiLevelType w:val="singleLevel"/>
     <w:tmpl w:val="38441652"/>
@@ -2760,7 +2729,7 @@
       </w:pPr>
     </w:lvl>
   </w:abstractNum>
-  <w:abstractNum w:abstractNumId="4">
+  <w:abstractNum w:abstractNumId="4" w15:restartNumberingAfterBreak="0">
     <w:nsid w:val="FFFFFF81"/>
     <w:multiLevelType w:val="singleLevel"/>
     <w:tmpl w:val="171AC3A4"/>
@@ -2780,7 +2749,7 @@
       </w:rPr>
     </w:lvl>
   </w:abstractNum>
-  <w:abstractNum w:abstractNumId="5">
+  <w:abstractNum w:abstractNumId="5" w15:restartNumberingAfterBreak="0">
     <w:nsid w:val="FFFFFF82"/>
     <w:multiLevelType w:val="singleLevel"/>
     <w:tmpl w:val="F3EAFDEC"/>
@@ -2801,7 +2770,7 @@
       </w:rPr>
     </w:lvl>
   </w:abstractNum>
-  <w:abstractNum w:abstractNumId="6">
+  <w:abstractNum w:abstractNumId="6" w15:restartNumberingAfterBreak="0">
     <w:nsid w:val="FFFFFF83"/>
     <w:multiLevelType w:val="singleLevel"/>
     <w:tmpl w:val="3D1EFFD4"/>
@@ -2822,7 +2791,7 @@
       </w:rPr>
     </w:lvl>
   </w:abstractNum>
-  <w:abstractNum w:abstractNumId="7">
+  <w:abstractNum w:abstractNumId="7" w15:restartNumberingAfterBreak="0">
     <w:nsid w:val="FFFFFF88"/>
     <w:multiLevelType w:val="singleLevel"/>
     <w:tmpl w:val="D0A62B40"/>
@@ -2840,7 +2809,7 @@
       </w:pPr>
     </w:lvl>
   </w:abstractNum>
-  <w:abstractNum w:abstractNumId="8">
+  <w:abstractNum w:abstractNumId="8" w15:restartNumberingAfterBreak="0">
     <w:nsid w:val="FFFFFF89"/>
     <w:multiLevelType w:val="singleLevel"/>
     <w:tmpl w:val="29761A62"/>
@@ -2861,38 +2830,38 @@
       </w:rPr>
     </w:lvl>
   </w:abstractNum>
-  <w:num w:numId="1">
+  <w:num w:numId="1" w16cid:durableId="1000085446">
     <w:abstractNumId w:val="8"/>
   </w:num>
-  <w:num w:numId="2">
+  <w:num w:numId="2" w16cid:durableId="400181843">
     <w:abstractNumId w:val="6"/>
   </w:num>
-  <w:num w:numId="3">
+  <w:num w:numId="3" w16cid:durableId="2128502999">
     <w:abstractNumId w:val="5"/>
   </w:num>
-  <w:num w:numId="4">
+  <w:num w:numId="4" w16cid:durableId="1075321290">
     <w:abstractNumId w:val="4"/>
   </w:num>
-  <w:num w:numId="5">
+  <w:num w:numId="5" w16cid:durableId="363747040">
     <w:abstractNumId w:val="7"/>
   </w:num>
-  <w:num w:numId="6">
+  <w:num w:numId="6" w16cid:durableId="950355153">
     <w:abstractNumId w:val="3"/>
   </w:num>
-  <w:num w:numId="7">
+  <w:num w:numId="7" w16cid:durableId="828791430">
     <w:abstractNumId w:val="2"/>
   </w:num>
-  <w:num w:numId="8">
+  <w:num w:numId="8" w16cid:durableId="1875847072">
     <w:abstractNumId w:val="1"/>
   </w:num>
-  <w:num w:numId="9">
+  <w:num w:numId="9" w16cid:durableId="956568115">
     <w:abstractNumId w:val="0"/>
   </w:num>
 </w:numbering>
 </file>
 
 <file path=word/styles.xml><?xml version="1.0" encoding="utf-8"?>
-<w:styles xmlns:mc="http://schemas.openxmlformats.org/markup-compatibility/2006" xmlns:r="http://schemas.openxmlformats.org/officeDocument/2006/relationships" xmlns:w="http://schemas.openxmlformats.org/wordprocessingml/2006/main" xmlns:w14="http://schemas.microsoft.com/office/word/2010/wordml" xmlns:w15="http://schemas.microsoft.com/office/word/2012/wordml" mc:Ignorable="w14 w15">
+<w:styles xmlns:mc="http://schemas.openxmlformats.org/markup-compatibility/2006" xmlns:r="http://schemas.openxmlformats.org/officeDocument/2006/relationships" xmlns:w="http://schemas.openxmlformats.org/wordprocessingml/2006/main" xmlns:w14="http://schemas.microsoft.com/office/word/2010/wordml" xmlns:w15="http://schemas.microsoft.com/office/word/2012/wordml" xmlns:w16cex="http://schemas.microsoft.com/office/word/2018/wordml/cex" xmlns:w16cid="http://schemas.microsoft.com/office/word/2016/wordml/cid" xmlns:w16="http://schemas.microsoft.com/office/word/2018/wordml" xmlns:w16sdtdh="http://schemas.microsoft.com/office/word/2020/wordml/sdtdatahash" xmlns:w16sdtfl="http://schemas.microsoft.com/office/word/2024/wordml/sdtformatlock" xmlns:w16se="http://schemas.microsoft.com/office/word/2015/wordml/symex" xmlns:w16du="http://schemas.microsoft.com/office/word/2023/wordml/word16du" mc:Ignorable="w14 w15 w16se w16cid w16 w16cex w16sdtdh w16sdtfl w16du">
   <w:docDefaults>
     <w:rPrDefault>
       <w:rPr>
@@ -2908,7 +2877,7 @@
       </w:pPr>
     </w:pPrDefault>
   </w:docDefaults>
-  <w:latentStyles w:defLockedState="0" w:defUIPriority="99" w:defSemiHidden="0" w:defUnhideWhenUsed="0" w:defQFormat="0" w:count="371">
+  <w:latentStyles w:defLockedState="0" w:defUIPriority="99" w:defSemiHidden="0" w:defUnhideWhenUsed="0" w:defQFormat="0" w:count="376">
     <w:lsdException w:name="Normal" w:uiPriority="0" w:qFormat="1"/>
     <w:lsdException w:name="heading 1" w:uiPriority="9" w:qFormat="1"/>
     <w:lsdException w:name="heading 2" w:semiHidden="1" w:uiPriority="9" w:unhideWhenUsed="1" w:qFormat="1"/>
@@ -3271,6 +3240,11 @@
     <w:lsdException w:name="List Table 5 Dark Accent 6" w:uiPriority="50"/>
     <w:lsdException w:name="List Table 6 Colorful Accent 6" w:uiPriority="51"/>
     <w:lsdException w:name="List Table 7 Colorful Accent 6" w:uiPriority="52"/>
+    <w:lsdException w:name="Mention" w:semiHidden="1" w:unhideWhenUsed="1"/>
+    <w:lsdException w:name="Smart Hyperlink" w:semiHidden="1" w:unhideWhenUsed="1"/>
+    <w:lsdException w:name="Hashtag" w:semiHidden="1" w:unhideWhenUsed="1"/>
+    <w:lsdException w:name="Unresolved Mention" w:semiHidden="1" w:unhideWhenUsed="1"/>
+    <w:lsdException w:name="Smart Link" w:semiHidden="1" w:unhideWhenUsed="1"/>
   </w:latentStyles>
   <w:style w:type="paragraph" w:default="1" w:styleId="Normal">
     <w:name w:val="Normal"/>
@@ -4217,7 +4191,6 @@
       <w:spacing w:after="0" w:line="240" w:lineRule="auto"/>
     </w:pPr>
     <w:tblPr>
-      <w:tblInd w:w="0" w:type="dxa"/>
       <w:tblBorders>
         <w:top w:val="single" w:sz="4" w:space="0" w:color="auto"/>
         <w:left w:val="single" w:sz="4" w:space="0" w:color="auto"/>
@@ -4226,12 +4199,6 @@
         <w:insideH w:val="single" w:sz="4" w:space="0" w:color="auto"/>
         <w:insideV w:val="single" w:sz="4" w:space="0" w:color="auto"/>
       </w:tblBorders>
-      <w:tblCellMar>
-        <w:top w:w="0" w:type="dxa"/>
-        <w:left w:w="108" w:type="dxa"/>
-        <w:bottom w:w="0" w:type="dxa"/>
-        <w:right w:w="108" w:type="dxa"/>
-      </w:tblCellMar>
     </w:tblPr>
   </w:style>
   <w:style w:type="table" w:styleId="LightShading">
@@ -4248,17 +4215,10 @@
     <w:tblPr>
       <w:tblStyleRowBandSize w:val="1"/>
       <w:tblStyleColBandSize w:val="1"/>
-      <w:tblInd w:w="0" w:type="dxa"/>
       <w:tblBorders>
         <w:top w:val="single" w:sz="8" w:space="0" w:color="000000" w:themeColor="text1"/>
         <w:bottom w:val="single" w:sz="8" w:space="0" w:color="000000" w:themeColor="text1"/>
       </w:tblBorders>
-      <w:tblCellMar>
-        <w:top w:w="0" w:type="dxa"/>
-        <w:left w:w="108" w:type="dxa"/>
-        <w:bottom w:w="0" w:type="dxa"/>
-        <w:right w:w="108" w:type="dxa"/>
-      </w:tblCellMar>
     </w:tblPr>
     <w:tblStylePr w:type="firstRow">
       <w:pPr>
@@ -4351,17 +4311,10 @@
     <w:tblPr>
       <w:tblStyleRowBandSize w:val="1"/>
       <w:tblStyleColBandSize w:val="1"/>
-      <w:tblInd w:w="0" w:type="dxa"/>
       <w:tblBorders>
         <w:top w:val="single" w:sz="8" w:space="0" w:color="4F81BD" w:themeColor="accent1"/>
         <w:bottom w:val="single" w:sz="8" w:space="0" w:color="4F81BD" w:themeColor="accent1"/>
       </w:tblBorders>
-      <w:tblCellMar>
-        <w:top w:w="0" w:type="dxa"/>
-        <w:left w:w="108" w:type="dxa"/>
-        <w:bottom w:w="0" w:type="dxa"/>
-        <w:right w:w="108" w:type="dxa"/>
-      </w:tblCellMar>
     </w:tblPr>
     <w:tblStylePr w:type="firstRow">
       <w:pPr>
@@ -4454,17 +4407,10 @@
     <w:tblPr>
       <w:tblStyleRowBandSize w:val="1"/>
       <w:tblStyleColBandSize w:val="1"/>
-      <w:tblInd w:w="0" w:type="dxa"/>
       <w:tblBorders>
         <w:top w:val="single" w:sz="8" w:space="0" w:color="C0504D" w:themeColor="accent2"/>
         <w:bottom w:val="single" w:sz="8" w:space="0" w:color="C0504D" w:themeColor="accent2"/>
       </w:tblBorders>
-      <w:tblCellMar>
-        <w:top w:w="0" w:type="dxa"/>
-        <w:left w:w="108" w:type="dxa"/>
-        <w:bottom w:w="0" w:type="dxa"/>
-        <w:right w:w="108" w:type="dxa"/>
-      </w:tblCellMar>
     </w:tblPr>
     <w:tblStylePr w:type="firstRow">
       <w:pPr>
@@ -4557,17 +4503,10 @@
     <w:tblPr>
       <w:tblStyleRowBandSize w:val="1"/>
       <w:tblStyleColBandSize w:val="1"/>
-      <w:tblInd w:w="0" w:type="dxa"/>
       <w:tblBorders>
         <w:top w:val="single" w:sz="8" w:space="0" w:color="9BBB59" w:themeColor="accent3"/>
         <w:bottom w:val="single" w:sz="8" w:space="0" w:color="9BBB59" w:themeColor="accent3"/>
       </w:tblBorders>
-      <w:tblCellMar>
-        <w:top w:w="0" w:type="dxa"/>
-        <w:left w:w="108" w:type="dxa"/>
-        <w:bottom w:w="0" w:type="dxa"/>
-        <w:right w:w="108" w:type="dxa"/>
-      </w:tblCellMar>
     </w:tblPr>
     <w:tblStylePr w:type="firstRow">
       <w:pPr>
@@ -4660,17 +4599,10 @@
     <w:tblPr>
       <w:tblStyleRowBandSize w:val="1"/>
       <w:tblStyleColBandSize w:val="1"/>
-      <w:tblInd w:w="0" w:type="dxa"/>
       <w:tblBorders>
         <w:top w:val="single" w:sz="8" w:space="0" w:color="8064A2" w:themeColor="accent4"/>
         <w:bottom w:val="single" w:sz="8" w:space="0" w:color="8064A2" w:themeColor="accent4"/>
       </w:tblBorders>
-      <w:tblCellMar>
-        <w:top w:w="0" w:type="dxa"/>
-        <w:left w:w="108" w:type="dxa"/>
-        <w:bottom w:w="0" w:type="dxa"/>
-        <w:right w:w="108" w:type="dxa"/>
-      </w:tblCellMar>
     </w:tblPr>
     <w:tblStylePr w:type="firstRow">
       <w:pPr>
@@ -4763,17 +4695,10 @@
     <w:tblPr>
       <w:tblStyleRowBandSize w:val="1"/>
       <w:tblStyleColBandSize w:val="1"/>
-      <w:tblInd w:w="0" w:type="dxa"/>
       <w:tblBorders>
         <w:top w:val="single" w:sz="8" w:space="0" w:color="4BACC6" w:themeColor="accent5"/>
         <w:bottom w:val="single" w:sz="8" w:space="0" w:color="4BACC6" w:themeColor="accent5"/>
       </w:tblBorders>
-      <w:tblCellMar>
-        <w:top w:w="0" w:type="dxa"/>
-        <w:left w:w="108" w:type="dxa"/>
-        <w:bottom w:w="0" w:type="dxa"/>
-        <w:right w:w="108" w:type="dxa"/>
-      </w:tblCellMar>
     </w:tblPr>
     <w:tblStylePr w:type="firstRow">
       <w:pPr>
@@ -4866,17 +4791,10 @@
     <w:tblPr>
       <w:tblStyleRowBandSize w:val="1"/>
       <w:tblStyleColBandSize w:val="1"/>
-      <w:tblInd w:w="0" w:type="dxa"/>
       <w:tblBorders>
         <w:top w:val="single" w:sz="8" w:space="0" w:color="F79646" w:themeColor="accent6"/>
         <w:bottom w:val="single" w:sz="8" w:space="0" w:color="F79646" w:themeColor="accent6"/>
       </w:tblBorders>
-      <w:tblCellMar>
-        <w:top w:w="0" w:type="dxa"/>
-        <w:left w:w="108" w:type="dxa"/>
-        <w:bottom w:w="0" w:type="dxa"/>
-        <w:right w:w="108" w:type="dxa"/>
-      </w:tblCellMar>
     </w:tblPr>
     <w:tblStylePr w:type="firstRow">
       <w:pPr>
@@ -4966,19 +4884,12 @@
     <w:tblPr>
       <w:tblStyleRowBandSize w:val="1"/>
       <w:tblStyleColBandSize w:val="1"/>
-      <w:tblInd w:w="0" w:type="dxa"/>
       <w:tblBorders>
         <w:top w:val="single" w:sz="8" w:space="0" w:color="000000" w:themeColor="text1"/>
         <w:left w:val="single" w:sz="8" w:space="0" w:color="000000" w:themeColor="text1"/>
         <w:bottom w:val="single" w:sz="8" w:space="0" w:color="000000" w:themeColor="text1"/>
         <w:right w:val="single" w:sz="8" w:space="0" w:color="000000" w:themeColor="text1"/>
       </w:tblBorders>
-      <w:tblCellMar>
-        <w:top w:w="0" w:type="dxa"/>
-        <w:left w:w="108" w:type="dxa"/>
-        <w:bottom w:w="0" w:type="dxa"/>
-        <w:right w:w="108" w:type="dxa"/>
-      </w:tblCellMar>
     </w:tblPr>
     <w:tblStylePr w:type="firstRow">
       <w:pPr>
@@ -5058,19 +4969,12 @@
     <w:tblPr>
       <w:tblStyleRowBandSize w:val="1"/>
       <w:tblStyleColBandSize w:val="1"/>
-      <w:tblInd w:w="0" w:type="dxa"/>
       <w:tblBorders>
         <w:top w:val="single" w:sz="8" w:space="0" w:color="4F81BD" w:themeColor="accent1"/>
         <w:left w:val="single" w:sz="8" w:space="0" w:color="4F81BD" w:themeColor="accent1"/>
         <w:bottom w:val="single" w:sz="8" w:space="0" w:color="4F81BD" w:themeColor="accent1"/>
         <w:right w:val="single" w:sz="8" w:space="0" w:color="4F81BD" w:themeColor="accent1"/>
       </w:tblBorders>
-      <w:tblCellMar>
-        <w:top w:w="0" w:type="dxa"/>
-        <w:left w:w="108" w:type="dxa"/>
-        <w:bottom w:w="0" w:type="dxa"/>
-        <w:right w:w="108" w:type="dxa"/>
-      </w:tblCellMar>
     </w:tblPr>
     <w:tblStylePr w:type="firstRow">
       <w:pPr>
@@ -5150,19 +5054,12 @@
     <w:tblPr>
       <w:tblStyleRowBandSize w:val="1"/>
       <w:tblStyleColBandSize w:val="1"/>
-      <w:tblInd w:w="0" w:type="dxa"/>
       <w:tblBorders>
         <w:top w:val="single" w:sz="8" w:space="0" w:color="C0504D" w:themeColor="accent2"/>
         <w:left w:val="single" w:sz="8" w:space="0" w:color="C0504D" w:themeColor="accent2"/>
         <w:bottom w:val="single" w:sz="8" w:space="0" w:color="C0504D" w:themeColor="accent2"/>
         <w:right w:val="single" w:sz="8" w:space="0" w:color="C0504D" w:themeColor="accent2"/>
       </w:tblBorders>
-      <w:tblCellMar>
-        <w:top w:w="0" w:type="dxa"/>
-        <w:left w:w="108" w:type="dxa"/>
-        <w:bottom w:w="0" w:type="dxa"/>
-        <w:right w:w="108" w:type="dxa"/>
-      </w:tblCellMar>
     </w:tblPr>
     <w:tblStylePr w:type="firstRow">
       <w:pPr>
@@ -5242,19 +5139,12 @@
     <w:tblPr>
       <w:tblStyleRowBandSize w:val="1"/>
       <w:tblStyleColBandSize w:val="1"/>
-      <w:tblInd w:w="0" w:type="dxa"/>
       <w:tblBorders>
         <w:top w:val="single" w:sz="8" w:space="0" w:color="9BBB59" w:themeColor="accent3"/>
         <w:left w:val="single" w:sz="8" w:space="0" w:color="9BBB59" w:themeColor="accent3"/>
         <w:bottom w:val="single" w:sz="8" w:space="0" w:color="9BBB59" w:themeColor="accent3"/>
         <w:right w:val="single" w:sz="8" w:space="0" w:color="9BBB59" w:themeColor="accent3"/>
       </w:tblBorders>
-      <w:tblCellMar>
-        <w:top w:w="0" w:type="dxa"/>
-        <w:left w:w="108" w:type="dxa"/>
-        <w:bottom w:w="0" w:type="dxa"/>
-        <w:right w:w="108" w:type="dxa"/>
-      </w:tblCellMar>
     </w:tblPr>
     <w:tblStylePr w:type="firstRow">
       <w:pPr>
@@ -5334,19 +5224,12 @@
     <w:tblPr>
       <w:tblStyleRowBandSize w:val="1"/>
       <w:tblStyleColBandSize w:val="1"/>
-      <w:tblInd w:w="0" w:type="dxa"/>
       <w:tblBorders>
         <w:top w:val="single" w:sz="8" w:space="0" w:color="8064A2" w:themeColor="accent4"/>
         <w:left w:val="single" w:sz="8" w:space="0" w:color="8064A2" w:themeColor="accent4"/>
         <w:bottom w:val="single" w:sz="8" w:space="0" w:color="8064A2" w:themeColor="accent4"/>
         <w:right w:val="single" w:sz="8" w:space="0" w:color="8064A2" w:themeColor="accent4"/>
       </w:tblBorders>
-      <w:tblCellMar>
-        <w:top w:w="0" w:type="dxa"/>
-        <w:left w:w="108" w:type="dxa"/>
-        <w:bottom w:w="0" w:type="dxa"/>
-        <w:right w:w="108" w:type="dxa"/>
-      </w:tblCellMar>
     </w:tblPr>
     <w:tblStylePr w:type="firstRow">
       <w:pPr>
@@ -5426,19 +5309,12 @@
     <w:tblPr>
       <w:tblStyleRowBandSize w:val="1"/>
       <w:tblStyleColBandSize w:val="1"/>
-      <w:tblInd w:w="0" w:type="dxa"/>
       <w:tblBorders>
         <w:top w:val="single" w:sz="8" w:space="0" w:color="4BACC6" w:themeColor="accent5"/>
         <w:left w:val="single" w:sz="8" w:space="0" w:color="4BACC6" w:themeColor="accent5"/>
         <w:bottom w:val="single" w:sz="8" w:space="0" w:color="4BACC6" w:themeColor="accent5"/>
         <w:right w:val="single" w:sz="8" w:space="0" w:color="4BACC6" w:themeColor="accent5"/>
       </w:tblBorders>
-      <w:tblCellMar>
-        <w:top w:w="0" w:type="dxa"/>
-        <w:left w:w="108" w:type="dxa"/>
-        <w:bottom w:w="0" w:type="dxa"/>
-        <w:right w:w="108" w:type="dxa"/>
-      </w:tblCellMar>
     </w:tblPr>
     <w:tblStylePr w:type="firstRow">
       <w:pPr>
@@ -5518,19 +5394,12 @@
     <w:tblPr>
       <w:tblStyleRowBandSize w:val="1"/>
       <w:tblStyleColBandSize w:val="1"/>
-      <w:tblInd w:w="0" w:type="dxa"/>
       <w:tblBorders>
         <w:top w:val="single" w:sz="8" w:space="0" w:color="F79646" w:themeColor="accent6"/>
         <w:left w:val="single" w:sz="8" w:space="0" w:color="F79646" w:themeColor="accent6"/>
         <w:bottom w:val="single" w:sz="8" w:space="0" w:color="F79646" w:themeColor="accent6"/>
         <w:right w:val="single" w:sz="8" w:space="0" w:color="F79646" w:themeColor="accent6"/>
       </w:tblBorders>
-      <w:tblCellMar>
-        <w:top w:w="0" w:type="dxa"/>
-        <w:left w:w="108" w:type="dxa"/>
-        <w:bottom w:w="0" w:type="dxa"/>
-        <w:right w:w="108" w:type="dxa"/>
-      </w:tblCellMar>
     </w:tblPr>
     <w:tblStylePr w:type="firstRow">
       <w:pPr>
@@ -5610,7 +5479,6 @@
     <w:tblPr>
       <w:tblStyleRowBandSize w:val="1"/>
       <w:tblStyleColBandSize w:val="1"/>
-      <w:tblInd w:w="0" w:type="dxa"/>
       <w:tblBorders>
         <w:top w:val="single" w:sz="8" w:space="0" w:color="000000" w:themeColor="text1"/>
         <w:left w:val="single" w:sz="8" w:space="0" w:color="000000" w:themeColor="text1"/>
@@ -5619,12 +5487,6 @@
         <w:insideH w:val="single" w:sz="8" w:space="0" w:color="000000" w:themeColor="text1"/>
         <w:insideV w:val="single" w:sz="8" w:space="0" w:color="000000" w:themeColor="text1"/>
       </w:tblBorders>
-      <w:tblCellMar>
-        <w:top w:w="0" w:type="dxa"/>
-        <w:left w:w="108" w:type="dxa"/>
-        <w:bottom w:w="0" w:type="dxa"/>
-        <w:right w:w="108" w:type="dxa"/>
-      </w:tblCellMar>
     </w:tblPr>
     <w:tblStylePr w:type="firstRow">
       <w:pPr>
@@ -5740,7 +5602,6 @@
     <w:tblPr>
       <w:tblStyleRowBandSize w:val="1"/>
       <w:tblStyleColBandSize w:val="1"/>
-      <w:tblInd w:w="0" w:type="dxa"/>
       <w:tblBorders>
         <w:top w:val="single" w:sz="8" w:space="0" w:color="4F81BD" w:themeColor="accent1"/>
         <w:left w:val="single" w:sz="8" w:space="0" w:color="4F81BD" w:themeColor="accent1"/>
@@ -5749,12 +5610,6 @@
         <w:insideH w:val="single" w:sz="8" w:space="0" w:color="4F81BD" w:themeColor="accent1"/>
         <w:insideV w:val="single" w:sz="8" w:space="0" w:color="4F81BD" w:themeColor="accent1"/>
       </w:tblBorders>
-      <w:tblCellMar>
-        <w:top w:w="0" w:type="dxa"/>
-        <w:left w:w="108" w:type="dxa"/>
-        <w:bottom w:w="0" w:type="dxa"/>
-        <w:right w:w="108" w:type="dxa"/>
-      </w:tblCellMar>
     </w:tblPr>
     <w:tblStylePr w:type="firstRow">
       <w:pPr>
@@ -5870,7 +5725,6 @@
     <w:tblPr>
       <w:tblStyleRowBandSize w:val="1"/>
       <w:tblStyleColBandSize w:val="1"/>
-      <w:tblInd w:w="0" w:type="dxa"/>
       <w:tblBorders>
         <w:top w:val="single" w:sz="8" w:space="0" w:color="C0504D" w:themeColor="accent2"/>
         <w:left w:val="single" w:sz="8" w:space="0" w:color="C0504D" w:themeColor="accent2"/>
@@ -5879,12 +5733,6 @@
         <w:insideH w:val="single" w:sz="8" w:space="0" w:color="C0504D" w:themeColor="accent2"/>
         <w:insideV w:val="single" w:sz="8" w:space="0" w:color="C0504D" w:themeColor="accent2"/>
       </w:tblBorders>
-      <w:tblCellMar>
-        <w:top w:w="0" w:type="dxa"/>
-        <w:left w:w="108" w:type="dxa"/>
-        <w:bottom w:w="0" w:type="dxa"/>
-        <w:right w:w="108" w:type="dxa"/>
-      </w:tblCellMar>
     </w:tblPr>
     <w:tblStylePr w:type="firstRow">
       <w:pPr>
@@ -6000,7 +5848,6 @@
     <w:tblPr>
       <w:tblStyleRowBandSize w:val="1"/>
       <w:tblStyleColBandSize w:val="1"/>
-      <w:tblInd w:w="0" w:type="dxa"/>
       <w:tblBorders>
         <w:top w:val="single" w:sz="8" w:space="0" w:color="9BBB59" w:themeColor="accent3"/>
         <w:left w:val="single" w:sz="8" w:space="0" w:color="9BBB59" w:themeColor="accent3"/>
@@ -6009,12 +5856,6 @@
         <w:insideH w:val="single" w:sz="8" w:space="0" w:color="9BBB59" w:themeColor="accent3"/>
         <w:insideV w:val="single" w:sz="8" w:space="0" w:color="9BBB59" w:themeColor="accent3"/>
       </w:tblBorders>
-      <w:tblCellMar>
-        <w:top w:w="0" w:type="dxa"/>
-        <w:left w:w="108" w:type="dxa"/>
-        <w:bottom w:w="0" w:type="dxa"/>
-        <w:right w:w="108" w:type="dxa"/>
-      </w:tblCellMar>
     </w:tblPr>
     <w:tblStylePr w:type="firstRow">
       <w:pPr>
@@ -6130,7 +5971,6 @@
     <w:tblPr>
       <w:tblStyleRowBandSize w:val="1"/>
       <w:tblStyleColBandSize w:val="1"/>
-      <w:tblInd w:w="0" w:type="dxa"/>
       <w:tblBorders>
         <w:top w:val="single" w:sz="8" w:space="0" w:color="8064A2" w:themeColor="accent4"/>
         <w:left w:val="single" w:sz="8" w:space="0" w:color="8064A2" w:themeColor="accent4"/>
@@ -6139,12 +5979,6 @@
         <w:insideH w:val="single" w:sz="8" w:space="0" w:color="8064A2" w:themeColor="accent4"/>
         <w:insideV w:val="single" w:sz="8" w:space="0" w:color="8064A2" w:themeColor="accent4"/>
       </w:tblBorders>
-      <w:tblCellMar>
-        <w:top w:w="0" w:type="dxa"/>
-        <w:left w:w="108" w:type="dxa"/>
-        <w:bottom w:w="0" w:type="dxa"/>
-        <w:right w:w="108" w:type="dxa"/>
-      </w:tblCellMar>
     </w:tblPr>
     <w:tblStylePr w:type="firstRow">
       <w:pPr>
@@ -6260,7 +6094,6 @@
     <w:tblPr>
       <w:tblStyleRowBandSize w:val="1"/>
       <w:tblStyleColBandSize w:val="1"/>
-      <w:tblInd w:w="0" w:type="dxa"/>
       <w:tblBorders>
         <w:top w:val="single" w:sz="8" w:space="0" w:color="4BACC6" w:themeColor="accent5"/>
         <w:left w:val="single" w:sz="8" w:space="0" w:color="4BACC6" w:themeColor="accent5"/>
@@ -6269,12 +6102,6 @@
         <w:insideH w:val="single" w:sz="8" w:space="0" w:color="4BACC6" w:themeColor="accent5"/>
         <w:insideV w:val="single" w:sz="8" w:space="0" w:color="4BACC6" w:themeColor="accent5"/>
       </w:tblBorders>
-      <w:tblCellMar>
-        <w:top w:w="0" w:type="dxa"/>
-        <w:left w:w="108" w:type="dxa"/>
-        <w:bottom w:w="0" w:type="dxa"/>
-        <w:right w:w="108" w:type="dxa"/>
-      </w:tblCellMar>
     </w:tblPr>
     <w:tblStylePr w:type="firstRow">
       <w:pPr>
@@ -6390,7 +6217,6 @@
     <w:tblPr>
       <w:tblStyleRowBandSize w:val="1"/>
       <w:tblStyleColBandSize w:val="1"/>
-      <w:tblInd w:w="0" w:type="dxa"/>
       <w:tblBorders>
         <w:top w:val="single" w:sz="8" w:space="0" w:color="F79646" w:themeColor="accent6"/>
         <w:left w:val="single" w:sz="8" w:space="0" w:color="F79646" w:themeColor="accent6"/>
@@ -6399,12 +6225,6 @@
         <w:insideH w:val="single" w:sz="8" w:space="0" w:color="F79646" w:themeColor="accent6"/>
         <w:insideV w:val="single" w:sz="8" w:space="0" w:color="F79646" w:themeColor="accent6"/>
       </w:tblBorders>
-      <w:tblCellMar>
-        <w:top w:w="0" w:type="dxa"/>
-        <w:left w:w="108" w:type="dxa"/>
-        <w:bottom w:w="0" w:type="dxa"/>
-        <w:right w:w="108" w:type="dxa"/>
-      </w:tblCellMar>
     </w:tblPr>
     <w:tblStylePr w:type="firstRow">
       <w:pPr>
@@ -6520,7 +6340,6 @@
     <w:tblPr>
       <w:tblStyleRowBandSize w:val="1"/>
       <w:tblStyleColBandSize w:val="1"/>
-      <w:tblInd w:w="0" w:type="dxa"/>
       <w:tblBorders>
         <w:top w:val="single" w:sz="8" w:space="0" w:color="404040" w:themeColor="text1" w:themeTint="BF"/>
         <w:left w:val="single" w:sz="8" w:space="0" w:color="404040" w:themeColor="text1" w:themeTint="BF"/>
@@ -6528,12 +6347,6 @@
         <w:right w:val="single" w:sz="8" w:space="0" w:color="404040" w:themeColor="text1" w:themeTint="BF"/>
         <w:insideH w:val="single" w:sz="8" w:space="0" w:color="404040" w:themeColor="text1" w:themeTint="BF"/>
       </w:tblBorders>
-      <w:tblCellMar>
-        <w:top w:w="0" w:type="dxa"/>
-        <w:left w:w="108" w:type="dxa"/>
-        <w:bottom w:w="0" w:type="dxa"/>
-        <w:right w:w="108" w:type="dxa"/>
-      </w:tblCellMar>
     </w:tblPr>
     <w:tblStylePr w:type="firstRow">
       <w:pPr>
@@ -6626,7 +6439,6 @@
     <w:tblPr>
       <w:tblStyleRowBandSize w:val="1"/>
       <w:tblStyleColBandSize w:val="1"/>
-      <w:tblInd w:w="0" w:type="dxa"/>
       <w:tblBorders>
         <w:top w:val="single" w:sz="8" w:space="0" w:color="7BA0CD" w:themeColor="accent1" w:themeTint="BF"/>
         <w:left w:val="single" w:sz="8" w:space="0" w:color="7BA0CD" w:themeColor="accent1" w:themeTint="BF"/>
@@ -6634,12 +6446,6 @@
         <w:right w:val="single" w:sz="8" w:space="0" w:color="7BA0CD" w:themeColor="accent1" w:themeTint="BF"/>
         <w:insideH w:val="single" w:sz="8" w:space="0" w:color="7BA0CD" w:themeColor="accent1" w:themeTint="BF"/>
       </w:tblBorders>
-      <w:tblCellMar>
-        <w:top w:w="0" w:type="dxa"/>
-        <w:left w:w="108" w:type="dxa"/>
-        <w:bottom w:w="0" w:type="dxa"/>
-        <w:right w:w="108" w:type="dxa"/>
-      </w:tblCellMar>
     </w:tblPr>
     <w:tblStylePr w:type="firstRow">
       <w:pPr>
@@ -6732,7 +6538,6 @@
     <w:tblPr>
       <w:tblStyleRowBandSize w:val="1"/>
       <w:tblStyleColBandSize w:val="1"/>
-      <w:tblInd w:w="0" w:type="dxa"/>
       <w:tblBorders>
         <w:top w:val="single" w:sz="8" w:space="0" w:color="CF7B79" w:themeColor="accent2" w:themeTint="BF"/>
         <w:left w:val="single" w:sz="8" w:space="0" w:color="CF7B79" w:themeColor="accent2" w:themeTint="BF"/>
@@ -6740,12 +6545,6 @@
         <w:right w:val="single" w:sz="8" w:space="0" w:color="CF7B79" w:themeColor="accent2" w:themeTint="BF"/>
         <w:insideH w:val="single" w:sz="8" w:space="0" w:color="CF7B79" w:themeColor="accent2" w:themeTint="BF"/>
       </w:tblBorders>
-      <w:tblCellMar>
-        <w:top w:w="0" w:type="dxa"/>
-        <w:left w:w="108" w:type="dxa"/>
-        <w:bottom w:w="0" w:type="dxa"/>
-        <w:right w:w="108" w:type="dxa"/>
-      </w:tblCellMar>
     </w:tblPr>
     <w:tblStylePr w:type="firstRow">
       <w:pPr>
@@ -6838,7 +6637,6 @@
     <w:tblPr>
       <w:tblStyleRowBandSize w:val="1"/>
       <w:tblStyleColBandSize w:val="1"/>
-      <w:tblInd w:w="0" w:type="dxa"/>
       <w:tblBorders>
         <w:top w:val="single" w:sz="8" w:space="0" w:color="B3CC82" w:themeColor="accent3" w:themeTint="BF"/>
         <w:left w:val="single" w:sz="8" w:space="0" w:color="B3CC82" w:themeColor="accent3" w:themeTint="BF"/>
@@ -6846,12 +6644,6 @@
         <w:right w:val="single" w:sz="8" w:space="0" w:color="B3CC82" w:themeColor="accent3" w:themeTint="BF"/>
         <w:insideH w:val="single" w:sz="8" w:space="0" w:color="B3CC82" w:themeColor="accent3" w:themeTint="BF"/>
       </w:tblBorders>
-      <w:tblCellMar>
-        <w:top w:w="0" w:type="dxa"/>
-        <w:left w:w="108" w:type="dxa"/>
-        <w:bottom w:w="0" w:type="dxa"/>
-        <w:right w:w="108" w:type="dxa"/>
-      </w:tblCellMar>
     </w:tblPr>
     <w:tblStylePr w:type="firstRow">
       <w:pPr>
@@ -6944,7 +6736,6 @@
     <w:tblPr>
       <w:tblStyleRowBandSize w:val="1"/>
       <w:tblStyleColBandSize w:val="1"/>
-      <w:tblInd w:w="0" w:type="dxa"/>
       <w:tblBorders>
         <w:top w:val="single" w:sz="8" w:space="0" w:color="9F8AB9" w:themeColor="accent4" w:themeTint="BF"/>
         <w:left w:val="single" w:sz="8" w:space="0" w:color="9F8AB9" w:themeColor="accent4" w:themeTint="BF"/>
@@ -6952,12 +6743,6 @@
         <w:right w:val="single" w:sz="8" w:space="0" w:color="9F8AB9" w:themeColor="accent4" w:themeTint="BF"/>
         <w:insideH w:val="single" w:sz="8" w:space="0" w:color="9F8AB9" w:themeColor="accent4" w:themeTint="BF"/>
       </w:tblBorders>
-      <w:tblCellMar>
-        <w:top w:w="0" w:type="dxa"/>
-        <w:left w:w="108" w:type="dxa"/>
-        <w:bottom w:w="0" w:type="dxa"/>
-        <w:right w:w="108" w:type="dxa"/>
-      </w:tblCellMar>
     </w:tblPr>
     <w:tblStylePr w:type="firstRow">
       <w:pPr>
@@ -7050,7 +6835,6 @@
     <w:tblPr>
       <w:tblStyleRowBandSize w:val="1"/>
       <w:tblStyleColBandSize w:val="1"/>
-      <w:tblInd w:w="0" w:type="dxa"/>
       <w:tblBorders>
         <w:top w:val="single" w:sz="8" w:space="0" w:color="78C0D4" w:themeColor="accent5" w:themeTint="BF"/>
         <w:left w:val="single" w:sz="8" w:space="0" w:color="78C0D4" w:themeColor="accent5" w:themeTint="BF"/>
@@ -7058,12 +6842,6 @@
         <w:right w:val="single" w:sz="8" w:space="0" w:color="78C0D4" w:themeColor="accent5" w:themeTint="BF"/>
         <w:insideH w:val="single" w:sz="8" w:space="0" w:color="78C0D4" w:themeColor="accent5" w:themeTint="BF"/>
       </w:tblBorders>
-      <w:tblCellMar>
-        <w:top w:w="0" w:type="dxa"/>
-        <w:left w:w="108" w:type="dxa"/>
-        <w:bottom w:w="0" w:type="dxa"/>
-        <w:right w:w="108" w:type="dxa"/>
-      </w:tblCellMar>
     </w:tblPr>
     <w:tblStylePr w:type="firstRow">
       <w:pPr>
@@ -7156,7 +6934,6 @@
     <w:tblPr>
       <w:tblStyleRowBandSize w:val="1"/>
       <w:tblStyleColBandSize w:val="1"/>
-      <w:tblInd w:w="0" w:type="dxa"/>
       <w:tblBorders>
         <w:top w:val="single" w:sz="8" w:space="0" w:color="F9B074" w:themeColor="accent6" w:themeTint="BF"/>
         <w:left w:val="single" w:sz="8" w:space="0" w:color="F9B074" w:themeColor="accent6" w:themeTint="BF"/>
@@ -7164,12 +6941,6 @@
         <w:right w:val="single" w:sz="8" w:space="0" w:color="F9B074" w:themeColor="accent6" w:themeTint="BF"/>
         <w:insideH w:val="single" w:sz="8" w:space="0" w:color="F9B074" w:themeColor="accent6" w:themeTint="BF"/>
       </w:tblBorders>
-      <w:tblCellMar>
-        <w:top w:w="0" w:type="dxa"/>
-        <w:left w:w="108" w:type="dxa"/>
-        <w:bottom w:w="0" w:type="dxa"/>
-        <w:right w:w="108" w:type="dxa"/>
-      </w:tblCellMar>
     </w:tblPr>
     <w:tblStylePr w:type="firstRow">
       <w:pPr>
@@ -7262,17 +7033,10 @@
     <w:tblPr>
       <w:tblStyleRowBandSize w:val="1"/>
       <w:tblStyleColBandSize w:val="1"/>
-      <w:tblInd w:w="0" w:type="dxa"/>
       <w:tblBorders>
         <w:top w:val="single" w:sz="18" w:space="0" w:color="auto"/>
         <w:bottom w:val="single" w:sz="18" w:space="0" w:color="auto"/>
       </w:tblBorders>
-      <w:tblCellMar>
-        <w:top w:w="0" w:type="dxa"/>
-        <w:left w:w="108" w:type="dxa"/>
-        <w:bottom w:w="0" w:type="dxa"/>
-        <w:right w:w="108" w:type="dxa"/>
-      </w:tblCellMar>
     </w:tblPr>
     <w:tblStylePr w:type="firstRow">
       <w:pPr>
@@ -7411,17 +7175,10 @@
     <w:tblPr>
       <w:tblStyleRowBandSize w:val="1"/>
       <w:tblStyleColBandSize w:val="1"/>
-      <w:tblInd w:w="0" w:type="dxa"/>
       <w:tblBorders>
         <w:top w:val="single" w:sz="18" w:space="0" w:color="auto"/>
         <w:bottom w:val="single" w:sz="18" w:space="0" w:color="auto"/>
       </w:tblBorders>
-      <w:tblCellMar>
-        <w:top w:w="0" w:type="dxa"/>
-        <w:left w:w="108" w:type="dxa"/>
-        <w:bottom w:w="0" w:type="dxa"/>
-        <w:right w:w="108" w:type="dxa"/>
-      </w:tblCellMar>
     </w:tblPr>
     <w:tblStylePr w:type="firstRow">
       <w:pPr>
@@ -7560,17 +7317,10 @@
     <w:tblPr>
       <w:tblStyleRowBandSize w:val="1"/>
       <w:tblStyleColBandSize w:val="1"/>
-      <w:tblInd w:w="0" w:type="dxa"/>
       <w:tblBorders>
         <w:top w:val="single" w:sz="18" w:space="0" w:color="auto"/>
         <w:bottom w:val="single" w:sz="18" w:space="0" w:color="auto"/>
       </w:tblBorders>
-      <w:tblCellMar>
-        <w:top w:w="0" w:type="dxa"/>
-        <w:left w:w="108" w:type="dxa"/>
-        <w:bottom w:w="0" w:type="dxa"/>
-        <w:right w:w="108" w:type="dxa"/>
-      </w:tblCellMar>
     </w:tblPr>
     <w:tblStylePr w:type="firstRow">
       <w:pPr>
@@ -7709,17 +7459,10 @@
     <w:tblPr>
       <w:tblStyleRowBandSize w:val="1"/>
       <w:tblStyleColBandSize w:val="1"/>
-      <w:tblInd w:w="0" w:type="dxa"/>
       <w:tblBorders>
         <w:top w:val="single" w:sz="18" w:space="0" w:color="auto"/>
         <w:bottom w:val="single" w:sz="18" w:space="0" w:color="auto"/>
       </w:tblBorders>
-      <w:tblCellMar>
-        <w:top w:w="0" w:type="dxa"/>
-        <w:left w:w="108" w:type="dxa"/>
-        <w:bottom w:w="0" w:type="dxa"/>
-        <w:right w:w="108" w:type="dxa"/>
-      </w:tblCellMar>
     </w:tblPr>
     <w:tblStylePr w:type="firstRow">
       <w:pPr>
@@ -7858,17 +7601,10 @@
     <w:tblPr>
       <w:tblStyleRowBandSize w:val="1"/>
       <w:tblStyleColBandSize w:val="1"/>
-      <w:tblInd w:w="0" w:type="dxa"/>
       <w:tblBorders>
         <w:top w:val="single" w:sz="18" w:space="0" w:color="auto"/>
         <w:bottom w:val="single" w:sz="18" w:space="0" w:color="auto"/>
       </w:tblBorders>
-      <w:tblCellMar>
-        <w:top w:w="0" w:type="dxa"/>
-        <w:left w:w="108" w:type="dxa"/>
-        <w:bottom w:w="0" w:type="dxa"/>
-        <w:right w:w="108" w:type="dxa"/>
-      </w:tblCellMar>
     </w:tblPr>
     <w:tblStylePr w:type="firstRow">
       <w:pPr>
@@ -8007,17 +7743,10 @@
     <w:tblPr>
       <w:tblStyleRowBandSize w:val="1"/>
       <w:tblStyleColBandSize w:val="1"/>
-      <w:tblInd w:w="0" w:type="dxa"/>
       <w:tblBorders>
         <w:top w:val="single" w:sz="18" w:space="0" w:color="auto"/>
         <w:bottom w:val="single" w:sz="18" w:space="0" w:color="auto"/>
       </w:tblBorders>
-      <w:tblCellMar>
-        <w:top w:w="0" w:type="dxa"/>
-        <w:left w:w="108" w:type="dxa"/>
-        <w:bottom w:w="0" w:type="dxa"/>
-        <w:right w:w="108" w:type="dxa"/>
-      </w:tblCellMar>
     </w:tblPr>
     <w:tblStylePr w:type="firstRow">
       <w:pPr>
@@ -8156,17 +7885,10 @@
     <w:tblPr>
       <w:tblStyleRowBandSize w:val="1"/>
       <w:tblStyleColBandSize w:val="1"/>
-      <w:tblInd w:w="0" w:type="dxa"/>
       <w:tblBorders>
         <w:top w:val="single" w:sz="18" w:space="0" w:color="auto"/>
         <w:bottom w:val="single" w:sz="18" w:space="0" w:color="auto"/>
       </w:tblBorders>
-      <w:tblCellMar>
-        <w:top w:w="0" w:type="dxa"/>
-        <w:left w:w="108" w:type="dxa"/>
-        <w:bottom w:w="0" w:type="dxa"/>
-        <w:right w:w="108" w:type="dxa"/>
-      </w:tblCellMar>
     </w:tblPr>
     <w:tblStylePr w:type="firstRow">
       <w:pPr>
@@ -8308,17 +8030,10 @@
     <w:tblPr>
       <w:tblStyleRowBandSize w:val="1"/>
       <w:tblStyleColBandSize w:val="1"/>
-      <w:tblInd w:w="0" w:type="dxa"/>
       <w:tblBorders>
         <w:top w:val="single" w:sz="8" w:space="0" w:color="000000" w:themeColor="text1"/>
         <w:bottom w:val="single" w:sz="8" w:space="0" w:color="000000" w:themeColor="text1"/>
       </w:tblBorders>
-      <w:tblCellMar>
-        <w:top w:w="0" w:type="dxa"/>
-        <w:left w:w="108" w:type="dxa"/>
-        <w:bottom w:w="0" w:type="dxa"/>
-        <w:right w:w="108" w:type="dxa"/>
-      </w:tblCellMar>
     </w:tblPr>
     <w:tblStylePr w:type="firstRow">
       <w:rPr>
@@ -8392,17 +8107,10 @@
     <w:tblPr>
       <w:tblStyleRowBandSize w:val="1"/>
       <w:tblStyleColBandSize w:val="1"/>
-      <w:tblInd w:w="0" w:type="dxa"/>
       <w:tblBorders>
         <w:top w:val="single" w:sz="8" w:space="0" w:color="4F81BD" w:themeColor="accent1"/>
         <w:bottom w:val="single" w:sz="8" w:space="0" w:color="4F81BD" w:themeColor="accent1"/>
       </w:tblBorders>
-      <w:tblCellMar>
-        <w:top w:w="0" w:type="dxa"/>
-        <w:left w:w="108" w:type="dxa"/>
-        <w:bottom w:w="0" w:type="dxa"/>
-        <w:right w:w="108" w:type="dxa"/>
-      </w:tblCellMar>
     </w:tblPr>
     <w:tblStylePr w:type="firstRow">
       <w:rPr>
@@ -8476,17 +8184,10 @@
     <w:tblPr>
       <w:tblStyleRowBandSize w:val="1"/>
       <w:tblStyleColBandSize w:val="1"/>
-      <w:tblInd w:w="0" w:type="dxa"/>
       <w:tblBorders>
         <w:top w:val="single" w:sz="8" w:space="0" w:color="C0504D" w:themeColor="accent2"/>
         <w:bottom w:val="single" w:sz="8" w:space="0" w:color="C0504D" w:themeColor="accent2"/>
       </w:tblBorders>
-      <w:tblCellMar>
-        <w:top w:w="0" w:type="dxa"/>
-        <w:left w:w="108" w:type="dxa"/>
-        <w:bottom w:w="0" w:type="dxa"/>
-        <w:right w:w="108" w:type="dxa"/>
-      </w:tblCellMar>
     </w:tblPr>
     <w:tblStylePr w:type="firstRow">
       <w:rPr>
@@ -8560,17 +8261,10 @@
     <w:tblPr>
       <w:tblStyleRowBandSize w:val="1"/>
       <w:tblStyleColBandSize w:val="1"/>
-      <w:tblInd w:w="0" w:type="dxa"/>
       <w:tblBorders>
         <w:top w:val="single" w:sz="8" w:space="0" w:color="9BBB59" w:themeColor="accent3"/>
         <w:bottom w:val="single" w:sz="8" w:space="0" w:color="9BBB59" w:themeColor="accent3"/>
       </w:tblBorders>
-      <w:tblCellMar>
-        <w:top w:w="0" w:type="dxa"/>
-        <w:left w:w="108" w:type="dxa"/>
-        <w:bottom w:w="0" w:type="dxa"/>
-        <w:right w:w="108" w:type="dxa"/>
-      </w:tblCellMar>
     </w:tblPr>
     <w:tblStylePr w:type="firstRow">
       <w:rPr>
@@ -8644,17 +8338,10 @@
     <w:tblPr>
       <w:tblStyleRowBandSize w:val="1"/>
       <w:tblStyleColBandSize w:val="1"/>
-      <w:tblInd w:w="0" w:type="dxa"/>
       <w:tblBorders>
         <w:top w:val="single" w:sz="8" w:space="0" w:color="8064A2" w:themeColor="accent4"/>
         <w:bottom w:val="single" w:sz="8" w:space="0" w:color="8064A2" w:themeColor="accent4"/>
       </w:tblBorders>
-      <w:tblCellMar>
-        <w:top w:w="0" w:type="dxa"/>
-        <w:left w:w="108" w:type="dxa"/>
-        <w:bottom w:w="0" w:type="dxa"/>
-        <w:right w:w="108" w:type="dxa"/>
-      </w:tblCellMar>
     </w:tblPr>
     <w:tblStylePr w:type="firstRow">
       <w:rPr>
@@ -8728,17 +8415,10 @@
     <w:tblPr>
       <w:tblStyleRowBandSize w:val="1"/>
       <w:tblStyleColBandSize w:val="1"/>
-      <w:tblInd w:w="0" w:type="dxa"/>
       <w:tblBorders>
         <w:top w:val="single" w:sz="8" w:space="0" w:color="4BACC6" w:themeColor="accent5"/>
         <w:bottom w:val="single" w:sz="8" w:space="0" w:color="4BACC6" w:themeColor="accent5"/>
       </w:tblBorders>
-      <w:tblCellMar>
-        <w:top w:w="0" w:type="dxa"/>
-        <w:left w:w="108" w:type="dxa"/>
-        <w:bottom w:w="0" w:type="dxa"/>
-        <w:right w:w="108" w:type="dxa"/>
-      </w:tblCellMar>
     </w:tblPr>
     <w:tblStylePr w:type="firstRow">
       <w:rPr>
@@ -8812,17 +8492,10 @@
     <w:tblPr>
       <w:tblStyleRowBandSize w:val="1"/>
       <w:tblStyleColBandSize w:val="1"/>
-      <w:tblInd w:w="0" w:type="dxa"/>
       <w:tblBorders>
         <w:top w:val="single" w:sz="8" w:space="0" w:color="F79646" w:themeColor="accent6"/>
         <w:bottom w:val="single" w:sz="8" w:space="0" w:color="F79646" w:themeColor="accent6"/>
       </w:tblBorders>
-      <w:tblCellMar>
-        <w:top w:w="0" w:type="dxa"/>
-        <w:left w:w="108" w:type="dxa"/>
-        <w:bottom w:w="0" w:type="dxa"/>
-        <w:right w:w="108" w:type="dxa"/>
-      </w:tblCellMar>
     </w:tblPr>
     <w:tblStylePr w:type="firstRow">
       <w:rPr>
@@ -8897,19 +8570,12 @@
     <w:tblPr>
       <w:tblStyleRowBandSize w:val="1"/>
       <w:tblStyleColBandSize w:val="1"/>
-      <w:tblInd w:w="0" w:type="dxa"/>
       <w:tblBorders>
         <w:top w:val="single" w:sz="8" w:space="0" w:color="000000" w:themeColor="text1"/>
         <w:left w:val="single" w:sz="8" w:space="0" w:color="000000" w:themeColor="text1"/>
         <w:bottom w:val="single" w:sz="8" w:space="0" w:color="000000" w:themeColor="text1"/>
         <w:right w:val="single" w:sz="8" w:space="0" w:color="000000" w:themeColor="text1"/>
       </w:tblBorders>
-      <w:tblCellMar>
-        <w:top w:w="0" w:type="dxa"/>
-        <w:left w:w="108" w:type="dxa"/>
-        <w:bottom w:w="0" w:type="dxa"/>
-        <w:right w:w="108" w:type="dxa"/>
-      </w:tblCellMar>
     </w:tblPr>
     <w:tblStylePr w:type="firstRow">
       <w:rPr>
@@ -9025,19 +8691,12 @@
     <w:tblPr>
       <w:tblStyleRowBandSize w:val="1"/>
       <w:tblStyleColBandSize w:val="1"/>
-      <w:tblInd w:w="0" w:type="dxa"/>
       <w:tblBorders>
         <w:top w:val="single" w:sz="8" w:space="0" w:color="4F81BD" w:themeColor="accent1"/>
         <w:left w:val="single" w:sz="8" w:space="0" w:color="4F81BD" w:themeColor="accent1"/>
         <w:bottom w:val="single" w:sz="8" w:space="0" w:color="4F81BD" w:themeColor="accent1"/>
         <w:right w:val="single" w:sz="8" w:space="0" w:color="4F81BD" w:themeColor="accent1"/>
       </w:tblBorders>
-      <w:tblCellMar>
-        <w:top w:w="0" w:type="dxa"/>
-        <w:left w:w="108" w:type="dxa"/>
-        <w:bottom w:w="0" w:type="dxa"/>
-        <w:right w:w="108" w:type="dxa"/>
-      </w:tblCellMar>
     </w:tblPr>
     <w:tblStylePr w:type="firstRow">
       <w:rPr>
@@ -9153,19 +8812,12 @@
     <w:tblPr>
       <w:tblStyleRowBandSize w:val="1"/>
       <w:tblStyleColBandSize w:val="1"/>
-      <w:tblInd w:w="0" w:type="dxa"/>
       <w:tblBorders>
         <w:top w:val="single" w:sz="8" w:space="0" w:color="C0504D" w:themeColor="accent2"/>
         <w:left w:val="single" w:sz="8" w:space="0" w:color="C0504D" w:themeColor="accent2"/>
         <w:bottom w:val="single" w:sz="8" w:space="0" w:color="C0504D" w:themeColor="accent2"/>
         <w:right w:val="single" w:sz="8" w:space="0" w:color="C0504D" w:themeColor="accent2"/>
       </w:tblBorders>
-      <w:tblCellMar>
-        <w:top w:w="0" w:type="dxa"/>
-        <w:left w:w="108" w:type="dxa"/>
-        <w:bottom w:w="0" w:type="dxa"/>
-        <w:right w:w="108" w:type="dxa"/>
-      </w:tblCellMar>
     </w:tblPr>
     <w:tblStylePr w:type="firstRow">
       <w:rPr>
@@ -9281,19 +8933,12 @@
     <w:tblPr>
       <w:tblStyleRowBandSize w:val="1"/>
       <w:tblStyleColBandSize w:val="1"/>
-      <w:tblInd w:w="0" w:type="dxa"/>
       <w:tblBorders>
         <w:top w:val="single" w:sz="8" w:space="0" w:color="9BBB59" w:themeColor="accent3"/>
         <w:left w:val="single" w:sz="8" w:space="0" w:color="9BBB59" w:themeColor="accent3"/>
         <w:bottom w:val="single" w:sz="8" w:space="0" w:color="9BBB59" w:themeColor="accent3"/>
         <w:right w:val="single" w:sz="8" w:space="0" w:color="9BBB59" w:themeColor="accent3"/>
       </w:tblBorders>
-      <w:tblCellMar>
-        <w:top w:w="0" w:type="dxa"/>
-        <w:left w:w="108" w:type="dxa"/>
-        <w:bottom w:w="0" w:type="dxa"/>
-        <w:right w:w="108" w:type="dxa"/>
-      </w:tblCellMar>
     </w:tblPr>
     <w:tblStylePr w:type="firstRow">
       <w:rPr>
@@ -9409,19 +9054,12 @@
     <w:tblPr>
       <w:tblStyleRowBandSize w:val="1"/>
       <w:tblStyleColBandSize w:val="1"/>
-      <w:tblInd w:w="0" w:type="dxa"/>
       <w:tblBorders>
         <w:top w:val="single" w:sz="8" w:space="0" w:color="8064A2" w:themeColor="accent4"/>
         <w:left w:val="single" w:sz="8" w:space="0" w:color="8064A2" w:themeColor="accent4"/>
         <w:bottom w:val="single" w:sz="8" w:space="0" w:color="8064A2" w:themeColor="accent4"/>
         <w:right w:val="single" w:sz="8" w:space="0" w:color="8064A2" w:themeColor="accent4"/>
       </w:tblBorders>
-      <w:tblCellMar>
-        <w:top w:w="0" w:type="dxa"/>
-        <w:left w:w="108" w:type="dxa"/>
-        <w:bottom w:w="0" w:type="dxa"/>
-        <w:right w:w="108" w:type="dxa"/>
-      </w:tblCellMar>
     </w:tblPr>
     <w:tblStylePr w:type="firstRow">
       <w:rPr>
@@ -9537,19 +9175,12 @@
     <w:tblPr>
       <w:tblStyleRowBandSize w:val="1"/>
       <w:tblStyleColBandSize w:val="1"/>
-      <w:tblInd w:w="0" w:type="dxa"/>
       <w:tblBorders>
         <w:top w:val="single" w:sz="8" w:space="0" w:color="4BACC6" w:themeColor="accent5"/>
         <w:left w:val="single" w:sz="8" w:space="0" w:color="4BACC6" w:themeColor="accent5"/>
         <w:bottom w:val="single" w:sz="8" w:space="0" w:color="4BACC6" w:themeColor="accent5"/>
         <w:right w:val="single" w:sz="8" w:space="0" w:color="4BACC6" w:themeColor="accent5"/>
       </w:tblBorders>
-      <w:tblCellMar>
-        <w:top w:w="0" w:type="dxa"/>
-        <w:left w:w="108" w:type="dxa"/>
-        <w:bottom w:w="0" w:type="dxa"/>
-        <w:right w:w="108" w:type="dxa"/>
-      </w:tblCellMar>
     </w:tblPr>
     <w:tblStylePr w:type="firstRow">
       <w:rPr>
@@ -9665,19 +9296,12 @@
     <w:tblPr>
       <w:tblStyleRowBandSize w:val="1"/>
       <w:tblStyleColBandSize w:val="1"/>
-      <w:tblInd w:w="0" w:type="dxa"/>
       <w:tblBorders>
         <w:top w:val="single" w:sz="8" w:space="0" w:color="F79646" w:themeColor="accent6"/>
         <w:left w:val="single" w:sz="8" w:space="0" w:color="F79646" w:themeColor="accent6"/>
         <w:bottom w:val="single" w:sz="8" w:space="0" w:color="F79646" w:themeColor="accent6"/>
         <w:right w:val="single" w:sz="8" w:space="0" w:color="F79646" w:themeColor="accent6"/>
       </w:tblBorders>
-      <w:tblCellMar>
-        <w:top w:w="0" w:type="dxa"/>
-        <w:left w:w="108" w:type="dxa"/>
-        <w:bottom w:w="0" w:type="dxa"/>
-        <w:right w:w="108" w:type="dxa"/>
-      </w:tblCellMar>
     </w:tblPr>
     <w:tblStylePr w:type="firstRow">
       <w:rPr>
@@ -9789,7 +9413,6 @@
     <w:tblPr>
       <w:tblStyleRowBandSize w:val="1"/>
       <w:tblStyleColBandSize w:val="1"/>
-      <w:tblInd w:w="0" w:type="dxa"/>
       <w:tblBorders>
         <w:top w:val="single" w:sz="8" w:space="0" w:color="404040" w:themeColor="text1" w:themeTint="BF"/>
         <w:left w:val="single" w:sz="8" w:space="0" w:color="404040" w:themeColor="text1" w:themeTint="BF"/>
@@ -9798,12 +9421,6 @@
         <w:insideH w:val="single" w:sz="8" w:space="0" w:color="404040" w:themeColor="text1" w:themeTint="BF"/>
         <w:insideV w:val="single" w:sz="8" w:space="0" w:color="404040" w:themeColor="text1" w:themeTint="BF"/>
       </w:tblBorders>
-      <w:tblCellMar>
-        <w:top w:w="0" w:type="dxa"/>
-        <w:left w:w="108" w:type="dxa"/>
-        <w:bottom w:w="0" w:type="dxa"/>
-        <w:right w:w="108" w:type="dxa"/>
-      </w:tblCellMar>
     </w:tblPr>
     <w:tcPr>
       <w:shd w:val="clear" w:color="auto" w:fill="C0C0C0" w:themeFill="text1" w:themeFillTint="3F"/>
@@ -9862,7 +9479,6 @@
     <w:tblPr>
       <w:tblStyleRowBandSize w:val="1"/>
       <w:tblStyleColBandSize w:val="1"/>
-      <w:tblInd w:w="0" w:type="dxa"/>
       <w:tblBorders>
         <w:top w:val="single" w:sz="8" w:space="0" w:color="7BA0CD" w:themeColor="accent1" w:themeTint="BF"/>
         <w:left w:val="single" w:sz="8" w:space="0" w:color="7BA0CD" w:themeColor="accent1" w:themeTint="BF"/>
@@ -9871,12 +9487,6 @@
         <w:insideH w:val="single" w:sz="8" w:space="0" w:color="7BA0CD" w:themeColor="accent1" w:themeTint="BF"/>
         <w:insideV w:val="single" w:sz="8" w:space="0" w:color="7BA0CD" w:themeColor="accent1" w:themeTint="BF"/>
       </w:tblBorders>
-      <w:tblCellMar>
-        <w:top w:w="0" w:type="dxa"/>
-        <w:left w:w="108" w:type="dxa"/>
-        <w:bottom w:w="0" w:type="dxa"/>
-        <w:right w:w="108" w:type="dxa"/>
-      </w:tblCellMar>
     </w:tblPr>
     <w:tcPr>
       <w:shd w:val="clear" w:color="auto" w:fill="D3DFEE" w:themeFill="accent1" w:themeFillTint="3F"/>
@@ -9935,7 +9545,6 @@
     <w:tblPr>
       <w:tblStyleRowBandSize w:val="1"/>
       <w:tblStyleColBandSize w:val="1"/>
-      <w:tblInd w:w="0" w:type="dxa"/>
       <w:tblBorders>
         <w:top w:val="single" w:sz="8" w:space="0" w:color="CF7B79" w:themeColor="accent2" w:themeTint="BF"/>
         <w:left w:val="single" w:sz="8" w:space="0" w:color="CF7B79" w:themeColor="accent2" w:themeTint="BF"/>
@@ -9944,12 +9553,6 @@
         <w:insideH w:val="single" w:sz="8" w:space="0" w:color="CF7B79" w:themeColor="accent2" w:themeTint="BF"/>
         <w:insideV w:val="single" w:sz="8" w:space="0" w:color="CF7B79" w:themeColor="accent2" w:themeTint="BF"/>
       </w:tblBorders>
-      <w:tblCellMar>
-        <w:top w:w="0" w:type="dxa"/>
-        <w:left w:w="108" w:type="dxa"/>
-        <w:bottom w:w="0" w:type="dxa"/>
-        <w:right w:w="108" w:type="dxa"/>
-      </w:tblCellMar>
     </w:tblPr>
     <w:tcPr>
       <w:shd w:val="clear" w:color="auto" w:fill="EFD3D2" w:themeFill="accent2" w:themeFillTint="3F"/>
@@ -10008,7 +9611,6 @@
     <w:tblPr>
       <w:tblStyleRowBandSize w:val="1"/>
       <w:tblStyleColBandSize w:val="1"/>
-      <w:tblInd w:w="0" w:type="dxa"/>
       <w:tblBorders>
         <w:top w:val="single" w:sz="8" w:space="0" w:color="B3CC82" w:themeColor="accent3" w:themeTint="BF"/>
         <w:left w:val="single" w:sz="8" w:space="0" w:color="B3CC82" w:themeColor="accent3" w:themeTint="BF"/>
@@ -10017,12 +9619,6 @@
         <w:insideH w:val="single" w:sz="8" w:space="0" w:color="B3CC82" w:themeColor="accent3" w:themeTint="BF"/>
         <w:insideV w:val="single" w:sz="8" w:space="0" w:color="B3CC82" w:themeColor="accent3" w:themeTint="BF"/>
       </w:tblBorders>
-      <w:tblCellMar>
-        <w:top w:w="0" w:type="dxa"/>
-        <w:left w:w="108" w:type="dxa"/>
-        <w:bottom w:w="0" w:type="dxa"/>
-        <w:right w:w="108" w:type="dxa"/>
-      </w:tblCellMar>
     </w:tblPr>
     <w:tcPr>
       <w:shd w:val="clear" w:color="auto" w:fill="E6EED5" w:themeFill="accent3" w:themeFillTint="3F"/>
@@ -10081,7 +9677,6 @@
     <w:tblPr>
       <w:tblStyleRowBandSize w:val="1"/>
       <w:tblStyleColBandSize w:val="1"/>
-      <w:tblInd w:w="0" w:type="dxa"/>
       <w:tblBorders>
         <w:top w:val="single" w:sz="8" w:space="0" w:color="9F8AB9" w:themeColor="accent4" w:themeTint="BF"/>
         <w:left w:val="single" w:sz="8" w:space="0" w:color="9F8AB9" w:themeColor="accent4" w:themeTint="BF"/>
@@ -10090,12 +9685,6 @@
         <w:insideH w:val="single" w:sz="8" w:space="0" w:color="9F8AB9" w:themeColor="accent4" w:themeTint="BF"/>
         <w:insideV w:val="single" w:sz="8" w:space="0" w:color="9F8AB9" w:themeColor="accent4" w:themeTint="BF"/>
       </w:tblBorders>
-      <w:tblCellMar>
-        <w:top w:w="0" w:type="dxa"/>
-        <w:left w:w="108" w:type="dxa"/>
-        <w:bottom w:w="0" w:type="dxa"/>
-        <w:right w:w="108" w:type="dxa"/>
-      </w:tblCellMar>
     </w:tblPr>
     <w:tcPr>
       <w:shd w:val="clear" w:color="auto" w:fill="DFD8E8" w:themeFill="accent4" w:themeFillTint="3F"/>
@@ -10154,7 +9743,6 @@
     <w:tblPr>
       <w:tblStyleRowBandSize w:val="1"/>
       <w:tblStyleColBandSize w:val="1"/>
-      <w:tblInd w:w="0" w:type="dxa"/>
       <w:tblBorders>
         <w:top w:val="single" w:sz="8" w:space="0" w:color="78C0D4" w:themeColor="accent5" w:themeTint="BF"/>
         <w:left w:val="single" w:sz="8" w:space="0" w:color="78C0D4" w:themeColor="accent5" w:themeTint="BF"/>
@@ -10163,12 +9751,6 @@
         <w:insideH w:val="single" w:sz="8" w:space="0" w:color="78C0D4" w:themeColor="accent5" w:themeTint="BF"/>
         <w:insideV w:val="single" w:sz="8" w:space="0" w:color="78C0D4" w:themeColor="accent5" w:themeTint="BF"/>
       </w:tblBorders>
-      <w:tblCellMar>
-        <w:top w:w="0" w:type="dxa"/>
-        <w:left w:w="108" w:type="dxa"/>
-        <w:bottom w:w="0" w:type="dxa"/>
-        <w:right w:w="108" w:type="dxa"/>
-      </w:tblCellMar>
     </w:tblPr>
     <w:tcPr>
       <w:shd w:val="clear" w:color="auto" w:fill="D2EAF1" w:themeFill="accent5" w:themeFillTint="3F"/>
@@ -10227,7 +9809,6 @@
     <w:tblPr>
       <w:tblStyleRowBandSize w:val="1"/>
       <w:tblStyleColBandSize w:val="1"/>
-      <w:tblInd w:w="0" w:type="dxa"/>
       <w:tblBorders>
         <w:top w:val="single" w:sz="8" w:space="0" w:color="F9B074" w:themeColor="accent6" w:themeTint="BF"/>
         <w:left w:val="single" w:sz="8" w:space="0" w:color="F9B074" w:themeColor="accent6" w:themeTint="BF"/>
@@ -10236,12 +9817,6 @@
         <w:insideH w:val="single" w:sz="8" w:space="0" w:color="F9B074" w:themeColor="accent6" w:themeTint="BF"/>
         <w:insideV w:val="single" w:sz="8" w:space="0" w:color="F9B074" w:themeColor="accent6" w:themeTint="BF"/>
       </w:tblBorders>
-      <w:tblCellMar>
-        <w:top w:w="0" w:type="dxa"/>
-        <w:left w:w="108" w:type="dxa"/>
-        <w:bottom w:w="0" w:type="dxa"/>
-        <w:right w:w="108" w:type="dxa"/>
-      </w:tblCellMar>
     </w:tblPr>
     <w:tcPr>
       <w:shd w:val="clear" w:color="auto" w:fill="FDE4D0" w:themeFill="accent6" w:themeFillTint="3F"/>
@@ -10304,7 +9879,6 @@
     <w:tblPr>
       <w:tblStyleRowBandSize w:val="1"/>
       <w:tblStyleColBandSize w:val="1"/>
-      <w:tblInd w:w="0" w:type="dxa"/>
       <w:tblBorders>
         <w:top w:val="single" w:sz="8" w:space="0" w:color="000000" w:themeColor="text1"/>
         <w:left w:val="single" w:sz="8" w:space="0" w:color="000000" w:themeColor="text1"/>
@@ -10313,12 +9887,6 @@
         <w:insideH w:val="single" w:sz="8" w:space="0" w:color="000000" w:themeColor="text1"/>
         <w:insideV w:val="single" w:sz="8" w:space="0" w:color="000000" w:themeColor="text1"/>
       </w:tblBorders>
-      <w:tblCellMar>
-        <w:top w:w="0" w:type="dxa"/>
-        <w:left w:w="108" w:type="dxa"/>
-        <w:bottom w:w="0" w:type="dxa"/>
-        <w:right w:w="108" w:type="dxa"/>
-      </w:tblCellMar>
     </w:tblPr>
     <w:tcPr>
       <w:shd w:val="clear" w:color="auto" w:fill="C0C0C0" w:themeFill="text1" w:themeFillTint="3F"/>
@@ -10429,7 +9997,6 @@
     <w:tblPr>
       <w:tblStyleRowBandSize w:val="1"/>
       <w:tblStyleColBandSize w:val="1"/>
-      <w:tblInd w:w="0" w:type="dxa"/>
       <w:tblBorders>
         <w:top w:val="single" w:sz="8" w:space="0" w:color="4F81BD" w:themeColor="accent1"/>
         <w:left w:val="single" w:sz="8" w:space="0" w:color="4F81BD" w:themeColor="accent1"/>
@@ -10438,12 +10005,6 @@
         <w:insideH w:val="single" w:sz="8" w:space="0" w:color="4F81BD" w:themeColor="accent1"/>
         <w:insideV w:val="single" w:sz="8" w:space="0" w:color="4F81BD" w:themeColor="accent1"/>
       </w:tblBorders>
-      <w:tblCellMar>
-        <w:top w:w="0" w:type="dxa"/>
-        <w:left w:w="108" w:type="dxa"/>
-        <w:bottom w:w="0" w:type="dxa"/>
-        <w:right w:w="108" w:type="dxa"/>
-      </w:tblCellMar>
     </w:tblPr>
     <w:tcPr>
       <w:shd w:val="clear" w:color="auto" w:fill="D3DFEE" w:themeFill="accent1" w:themeFillTint="3F"/>
@@ -10554,7 +10115,6 @@
     <w:tblPr>
       <w:tblStyleRowBandSize w:val="1"/>
       <w:tblStyleColBandSize w:val="1"/>
-      <w:tblInd w:w="0" w:type="dxa"/>
       <w:tblBorders>
         <w:top w:val="single" w:sz="8" w:space="0" w:color="C0504D" w:themeColor="accent2"/>
         <w:left w:val="single" w:sz="8" w:space="0" w:color="C0504D" w:themeColor="accent2"/>
@@ -10563,12 +10123,6 @@
         <w:insideH w:val="single" w:sz="8" w:space="0" w:color="C0504D" w:themeColor="accent2"/>
         <w:insideV w:val="single" w:sz="8" w:space="0" w:color="C0504D" w:themeColor="accent2"/>
       </w:tblBorders>
-      <w:tblCellMar>
-        <w:top w:w="0" w:type="dxa"/>
-        <w:left w:w="108" w:type="dxa"/>
-        <w:bottom w:w="0" w:type="dxa"/>
-        <w:right w:w="108" w:type="dxa"/>
-      </w:tblCellMar>
     </w:tblPr>
     <w:tcPr>
       <w:shd w:val="clear" w:color="auto" w:fill="EFD3D2" w:themeFill="accent2" w:themeFillTint="3F"/>
@@ -10679,7 +10233,6 @@
     <w:tblPr>
       <w:tblStyleRowBandSize w:val="1"/>
       <w:tblStyleColBandSize w:val="1"/>
-      <w:tblInd w:w="0" w:type="dxa"/>
       <w:tblBorders>
         <w:top w:val="single" w:sz="8" w:space="0" w:color="9BBB59" w:themeColor="accent3"/>
         <w:left w:val="single" w:sz="8" w:space="0" w:color="9BBB59" w:themeColor="accent3"/>
@@ -10688,12 +10241,6 @@
         <w:insideH w:val="single" w:sz="8" w:space="0" w:color="9BBB59" w:themeColor="accent3"/>
         <w:insideV w:val="single" w:sz="8" w:space="0" w:color="9BBB59" w:themeColor="accent3"/>
       </w:tblBorders>
-      <w:tblCellMar>
-        <w:top w:w="0" w:type="dxa"/>
-        <w:left w:w="108" w:type="dxa"/>
-        <w:bottom w:w="0" w:type="dxa"/>
-        <w:right w:w="108" w:type="dxa"/>
-      </w:tblCellMar>
     </w:tblPr>
     <w:tcPr>
       <w:shd w:val="clear" w:color="auto" w:fill="E6EED5" w:themeFill="accent3" w:themeFillTint="3F"/>
@@ -10804,7 +10351,6 @@
     <w:tblPr>
       <w:tblStyleRowBandSize w:val="1"/>
       <w:tblStyleColBandSize w:val="1"/>
-      <w:tblInd w:w="0" w:type="dxa"/>
       <w:tblBorders>
         <w:top w:val="single" w:sz="8" w:space="0" w:color="8064A2" w:themeColor="accent4"/>
         <w:left w:val="single" w:sz="8" w:space="0" w:color="8064A2" w:themeColor="accent4"/>
@@ -10813,12 +10359,6 @@
         <w:insideH w:val="single" w:sz="8" w:space="0" w:color="8064A2" w:themeColor="accent4"/>
         <w:insideV w:val="single" w:sz="8" w:space="0" w:color="8064A2" w:themeColor="accent4"/>
       </w:tblBorders>
-      <w:tblCellMar>
-        <w:top w:w="0" w:type="dxa"/>
-        <w:left w:w="108" w:type="dxa"/>
-        <w:bottom w:w="0" w:type="dxa"/>
-        <w:right w:w="108" w:type="dxa"/>
-      </w:tblCellMar>
     </w:tblPr>
     <w:tcPr>
       <w:shd w:val="clear" w:color="auto" w:fill="DFD8E8" w:themeFill="accent4" w:themeFillTint="3F"/>
@@ -10929,7 +10469,6 @@
     <w:tblPr>
       <w:tblStyleRowBandSize w:val="1"/>
       <w:tblStyleColBandSize w:val="1"/>
-      <w:tblInd w:w="0" w:type="dxa"/>
       <w:tblBorders>
         <w:top w:val="single" w:sz="8" w:space="0" w:color="4BACC6" w:themeColor="accent5"/>
         <w:left w:val="single" w:sz="8" w:space="0" w:color="4BACC6" w:themeColor="accent5"/>
@@ -10938,12 +10477,6 @@
         <w:insideH w:val="single" w:sz="8" w:space="0" w:color="4BACC6" w:themeColor="accent5"/>
         <w:insideV w:val="single" w:sz="8" w:space="0" w:color="4BACC6" w:themeColor="accent5"/>
       </w:tblBorders>
-      <w:tblCellMar>
-        <w:top w:w="0" w:type="dxa"/>
-        <w:left w:w="108" w:type="dxa"/>
-        <w:bottom w:w="0" w:type="dxa"/>
-        <w:right w:w="108" w:type="dxa"/>
-      </w:tblCellMar>
     </w:tblPr>
     <w:tcPr>
       <w:shd w:val="clear" w:color="auto" w:fill="D2EAF1" w:themeFill="accent5" w:themeFillTint="3F"/>
@@ -11054,7 +10587,6 @@
     <w:tblPr>
       <w:tblStyleRowBandSize w:val="1"/>
       <w:tblStyleColBandSize w:val="1"/>
-      <w:tblInd w:w="0" w:type="dxa"/>
       <w:tblBorders>
         <w:top w:val="single" w:sz="8" w:space="0" w:color="F79646" w:themeColor="accent6"/>
         <w:left w:val="single" w:sz="8" w:space="0" w:color="F79646" w:themeColor="accent6"/>
@@ -11063,12 +10595,6 @@
         <w:insideH w:val="single" w:sz="8" w:space="0" w:color="F79646" w:themeColor="accent6"/>
         <w:insideV w:val="single" w:sz="8" w:space="0" w:color="F79646" w:themeColor="accent6"/>
       </w:tblBorders>
-      <w:tblCellMar>
-        <w:top w:w="0" w:type="dxa"/>
-        <w:left w:w="108" w:type="dxa"/>
-        <w:bottom w:w="0" w:type="dxa"/>
-        <w:right w:w="108" w:type="dxa"/>
-      </w:tblCellMar>
     </w:tblPr>
     <w:tcPr>
       <w:shd w:val="clear" w:color="auto" w:fill="FDE4D0" w:themeFill="accent6" w:themeFillTint="3F"/>
@@ -11175,7 +10701,6 @@
     <w:tblPr>
       <w:tblStyleRowBandSize w:val="1"/>
       <w:tblStyleColBandSize w:val="1"/>
-      <w:tblInd w:w="0" w:type="dxa"/>
       <w:tblBorders>
         <w:top w:val="single" w:sz="8" w:space="0" w:color="FFFFFF" w:themeColor="background1"/>
         <w:left w:val="single" w:sz="8" w:space="0" w:color="FFFFFF" w:themeColor="background1"/>
@@ -11184,12 +10709,6 @@
         <w:insideH w:val="single" w:sz="6" w:space="0" w:color="FFFFFF" w:themeColor="background1"/>
         <w:insideV w:val="single" w:sz="6" w:space="0" w:color="FFFFFF" w:themeColor="background1"/>
       </w:tblBorders>
-      <w:tblCellMar>
-        <w:top w:w="0" w:type="dxa"/>
-        <w:left w:w="108" w:type="dxa"/>
-        <w:bottom w:w="0" w:type="dxa"/>
-        <w:right w:w="108" w:type="dxa"/>
-      </w:tblCellMar>
     </w:tblPr>
     <w:tcPr>
       <w:shd w:val="clear" w:color="auto" w:fill="C0C0C0" w:themeFill="text1" w:themeFillTint="3F"/>
@@ -11316,7 +10835,6 @@
     <w:tblPr>
       <w:tblStyleRowBandSize w:val="1"/>
       <w:tblStyleColBandSize w:val="1"/>
-      <w:tblInd w:w="0" w:type="dxa"/>
       <w:tblBorders>
         <w:top w:val="single" w:sz="8" w:space="0" w:color="FFFFFF" w:themeColor="background1"/>
         <w:left w:val="single" w:sz="8" w:space="0" w:color="FFFFFF" w:themeColor="background1"/>
@@ -11325,12 +10843,6 @@
         <w:insideH w:val="single" w:sz="6" w:space="0" w:color="FFFFFF" w:themeColor="background1"/>
         <w:insideV w:val="single" w:sz="6" w:space="0" w:color="FFFFFF" w:themeColor="background1"/>
       </w:tblBorders>
-      <w:tblCellMar>
-        <w:top w:w="0" w:type="dxa"/>
-        <w:left w:w="108" w:type="dxa"/>
-        <w:bottom w:w="0" w:type="dxa"/>
-        <w:right w:w="108" w:type="dxa"/>
-      </w:tblCellMar>
     </w:tblPr>
     <w:tcPr>
       <w:shd w:val="clear" w:color="auto" w:fill="D3DFEE" w:themeFill="accent1" w:themeFillTint="3F"/>
@@ -11457,7 +10969,6 @@
     <w:tblPr>
       <w:tblStyleRowBandSize w:val="1"/>
       <w:tblStyleColBandSize w:val="1"/>
-      <w:tblInd w:w="0" w:type="dxa"/>
       <w:tblBorders>
         <w:top w:val="single" w:sz="8" w:space="0" w:color="FFFFFF" w:themeColor="background1"/>
         <w:left w:val="single" w:sz="8" w:space="0" w:color="FFFFFF" w:themeColor="background1"/>
@@ -11466,12 +10977,6 @@
         <w:insideH w:val="single" w:sz="6" w:space="0" w:color="FFFFFF" w:themeColor="background1"/>
         <w:insideV w:val="single" w:sz="6" w:space="0" w:color="FFFFFF" w:themeColor="background1"/>
       </w:tblBorders>
-      <w:tblCellMar>
-        <w:top w:w="0" w:type="dxa"/>
-        <w:left w:w="108" w:type="dxa"/>
-        <w:bottom w:w="0" w:type="dxa"/>
-        <w:right w:w="108" w:type="dxa"/>
-      </w:tblCellMar>
     </w:tblPr>
     <w:tcPr>
       <w:shd w:val="clear" w:color="auto" w:fill="EFD3D2" w:themeFill="accent2" w:themeFillTint="3F"/>
@@ -11598,7 +11103,6 @@
     <w:tblPr>
       <w:tblStyleRowBandSize w:val="1"/>
       <w:tblStyleColBandSize w:val="1"/>
-      <w:tblInd w:w="0" w:type="dxa"/>
       <w:tblBorders>
         <w:top w:val="single" w:sz="8" w:space="0" w:color="FFFFFF" w:themeColor="background1"/>
         <w:left w:val="single" w:sz="8" w:space="0" w:color="FFFFFF" w:themeColor="background1"/>
@@ -11607,12 +11111,6 @@
         <w:insideH w:val="single" w:sz="6" w:space="0" w:color="FFFFFF" w:themeColor="background1"/>
         <w:insideV w:val="single" w:sz="6" w:space="0" w:color="FFFFFF" w:themeColor="background1"/>
       </w:tblBorders>
-      <w:tblCellMar>
-        <w:top w:w="0" w:type="dxa"/>
-        <w:left w:w="108" w:type="dxa"/>
-        <w:bottom w:w="0" w:type="dxa"/>
-        <w:right w:w="108" w:type="dxa"/>
-      </w:tblCellMar>
     </w:tblPr>
     <w:tcPr>
       <w:shd w:val="clear" w:color="auto" w:fill="E6EED5" w:themeFill="accent3" w:themeFillTint="3F"/>
@@ -11739,7 +11237,6 @@
     <w:tblPr>
       <w:tblStyleRowBandSize w:val="1"/>
       <w:tblStyleColBandSize w:val="1"/>
-      <w:tblInd w:w="0" w:type="dxa"/>
       <w:tblBorders>
         <w:top w:val="single" w:sz="8" w:space="0" w:color="FFFFFF" w:themeColor="background1"/>
         <w:left w:val="single" w:sz="8" w:space="0" w:color="FFFFFF" w:themeColor="background1"/>
@@ -11748,12 +11245,6 @@
         <w:insideH w:val="single" w:sz="6" w:space="0" w:color="FFFFFF" w:themeColor="background1"/>
         <w:insideV w:val="single" w:sz="6" w:space="0" w:color="FFFFFF" w:themeColor="background1"/>
       </w:tblBorders>
-      <w:tblCellMar>
-        <w:top w:w="0" w:type="dxa"/>
-        <w:left w:w="108" w:type="dxa"/>
-        <w:bottom w:w="0" w:type="dxa"/>
-        <w:right w:w="108" w:type="dxa"/>
-      </w:tblCellMar>
     </w:tblPr>
     <w:tcPr>
       <w:shd w:val="clear" w:color="auto" w:fill="DFD8E8" w:themeFill="accent4" w:themeFillTint="3F"/>
@@ -11880,7 +11371,6 @@
     <w:tblPr>
       <w:tblStyleRowBandSize w:val="1"/>
       <w:tblStyleColBandSize w:val="1"/>
-      <w:tblInd w:w="0" w:type="dxa"/>
       <w:tblBorders>
         <w:top w:val="single" w:sz="8" w:space="0" w:color="FFFFFF" w:themeColor="background1"/>
         <w:left w:val="single" w:sz="8" w:space="0" w:color="FFFFFF" w:themeColor="background1"/>
@@ -11889,12 +11379,6 @@
         <w:insideH w:val="single" w:sz="6" w:space="0" w:color="FFFFFF" w:themeColor="background1"/>
         <w:insideV w:val="single" w:sz="6" w:space="0" w:color="FFFFFF" w:themeColor="background1"/>
       </w:tblBorders>
-      <w:tblCellMar>
-        <w:top w:w="0" w:type="dxa"/>
-        <w:left w:w="108" w:type="dxa"/>
-        <w:bottom w:w="0" w:type="dxa"/>
-        <w:right w:w="108" w:type="dxa"/>
-      </w:tblCellMar>
     </w:tblPr>
     <w:tcPr>
       <w:shd w:val="clear" w:color="auto" w:fill="D2EAF1" w:themeFill="accent5" w:themeFillTint="3F"/>
@@ -12021,7 +11505,6 @@
     <w:tblPr>
       <w:tblStyleRowBandSize w:val="1"/>
       <w:tblStyleColBandSize w:val="1"/>
-      <w:tblInd w:w="0" w:type="dxa"/>
       <w:tblBorders>
         <w:top w:val="single" w:sz="8" w:space="0" w:color="FFFFFF" w:themeColor="background1"/>
         <w:left w:val="single" w:sz="8" w:space="0" w:color="FFFFFF" w:themeColor="background1"/>
@@ -12030,12 +11513,6 @@
         <w:insideH w:val="single" w:sz="6" w:space="0" w:color="FFFFFF" w:themeColor="background1"/>
         <w:insideV w:val="single" w:sz="6" w:space="0" w:color="FFFFFF" w:themeColor="background1"/>
       </w:tblBorders>
-      <w:tblCellMar>
-        <w:top w:w="0" w:type="dxa"/>
-        <w:left w:w="108" w:type="dxa"/>
-        <w:bottom w:w="0" w:type="dxa"/>
-        <w:right w:w="108" w:type="dxa"/>
-      </w:tblCellMar>
     </w:tblPr>
     <w:tcPr>
       <w:shd w:val="clear" w:color="auto" w:fill="FDE4D0" w:themeFill="accent6" w:themeFillTint="3F"/>
@@ -12165,13 +11642,6 @@
     <w:tblPr>
       <w:tblStyleRowBandSize w:val="1"/>
       <w:tblStyleColBandSize w:val="1"/>
-      <w:tblInd w:w="0" w:type="dxa"/>
-      <w:tblCellMar>
-        <w:top w:w="0" w:type="dxa"/>
-        <w:left w:w="108" w:type="dxa"/>
-        <w:bottom w:w="0" w:type="dxa"/>
-        <w:right w:w="108" w:type="dxa"/>
-      </w:tblCellMar>
     </w:tblPr>
     <w:tcPr>
       <w:shd w:val="clear" w:color="auto" w:fill="000000" w:themeFill="text1"/>
@@ -12279,13 +11749,6 @@
     <w:tblPr>
       <w:tblStyleRowBandSize w:val="1"/>
       <w:tblStyleColBandSize w:val="1"/>
-      <w:tblInd w:w="0" w:type="dxa"/>
-      <w:tblCellMar>
-        <w:top w:w="0" w:type="dxa"/>
-        <w:left w:w="108" w:type="dxa"/>
-        <w:bottom w:w="0" w:type="dxa"/>
-        <w:right w:w="108" w:type="dxa"/>
-      </w:tblCellMar>
     </w:tblPr>
     <w:tcPr>
       <w:shd w:val="clear" w:color="auto" w:fill="4F81BD" w:themeFill="accent1"/>
@@ -12393,13 +11856,6 @@
     <w:tblPr>
       <w:tblStyleRowBandSize w:val="1"/>
       <w:tblStyleColBandSize w:val="1"/>
-      <w:tblInd w:w="0" w:type="dxa"/>
-      <w:tblCellMar>
-        <w:top w:w="0" w:type="dxa"/>
-        <w:left w:w="108" w:type="dxa"/>
-        <w:bottom w:w="0" w:type="dxa"/>
-        <w:right w:w="108" w:type="dxa"/>
-      </w:tblCellMar>
     </w:tblPr>
     <w:tcPr>
       <w:shd w:val="clear" w:color="auto" w:fill="C0504D" w:themeFill="accent2"/>
@@ -12507,13 +11963,6 @@
     <w:tblPr>
       <w:tblStyleRowBandSize w:val="1"/>
       <w:tblStyleColBandSize w:val="1"/>
-      <w:tblInd w:w="0" w:type="dxa"/>
-      <w:tblCellMar>
-        <w:top w:w="0" w:type="dxa"/>
-        <w:left w:w="108" w:type="dxa"/>
-        <w:bottom w:w="0" w:type="dxa"/>
-        <w:right w:w="108" w:type="dxa"/>
-      </w:tblCellMar>
     </w:tblPr>
     <w:tcPr>
       <w:shd w:val="clear" w:color="auto" w:fill="9BBB59" w:themeFill="accent3"/>
@@ -12621,13 +12070,6 @@
     <w:tblPr>
       <w:tblStyleRowBandSize w:val="1"/>
       <w:tblStyleColBandSize w:val="1"/>
-      <w:tblInd w:w="0" w:type="dxa"/>
-      <w:tblCellMar>
-        <w:top w:w="0" w:type="dxa"/>
-        <w:left w:w="108" w:type="dxa"/>
-        <w:bottom w:w="0" w:type="dxa"/>
-        <w:right w:w="108" w:type="dxa"/>
-      </w:tblCellMar>
     </w:tblPr>
     <w:tcPr>
       <w:shd w:val="clear" w:color="auto" w:fill="8064A2" w:themeFill="accent4"/>
@@ -12735,13 +12177,6 @@
     <w:tblPr>
       <w:tblStyleRowBandSize w:val="1"/>
       <w:tblStyleColBandSize w:val="1"/>
-      <w:tblInd w:w="0" w:type="dxa"/>
-      <w:tblCellMar>
-        <w:top w:w="0" w:type="dxa"/>
-        <w:left w:w="108" w:type="dxa"/>
-        <w:bottom w:w="0" w:type="dxa"/>
-        <w:right w:w="108" w:type="dxa"/>
-      </w:tblCellMar>
     </w:tblPr>
     <w:tcPr>
       <w:shd w:val="clear" w:color="auto" w:fill="4BACC6" w:themeFill="accent5"/>
@@ -12849,13 +12284,6 @@
     <w:tblPr>
       <w:tblStyleRowBandSize w:val="1"/>
       <w:tblStyleColBandSize w:val="1"/>
-      <w:tblInd w:w="0" w:type="dxa"/>
-      <w:tblCellMar>
-        <w:top w:w="0" w:type="dxa"/>
-        <w:left w:w="108" w:type="dxa"/>
-        <w:bottom w:w="0" w:type="dxa"/>
-        <w:right w:w="108" w:type="dxa"/>
-      </w:tblCellMar>
     </w:tblPr>
     <w:tcPr>
       <w:shd w:val="clear" w:color="auto" w:fill="F79646" w:themeFill="accent6"/>
@@ -12963,7 +12391,6 @@
     <w:tblPr>
       <w:tblStyleRowBandSize w:val="1"/>
       <w:tblStyleColBandSize w:val="1"/>
-      <w:tblInd w:w="0" w:type="dxa"/>
       <w:tblBorders>
         <w:top w:val="single" w:sz="24" w:space="0" w:color="C0504D" w:themeColor="accent2"/>
         <w:left w:val="single" w:sz="4" w:space="0" w:color="000000" w:themeColor="text1"/>
@@ -12972,12 +12399,6 @@
         <w:insideH w:val="single" w:sz="4" w:space="0" w:color="FFFFFF" w:themeColor="background1"/>
         <w:insideV w:val="single" w:sz="4" w:space="0" w:color="FFFFFF" w:themeColor="background1"/>
       </w:tblBorders>
-      <w:tblCellMar>
-        <w:top w:w="0" w:type="dxa"/>
-        <w:left w:w="108" w:type="dxa"/>
-        <w:bottom w:w="0" w:type="dxa"/>
-        <w:right w:w="108" w:type="dxa"/>
-      </w:tblCellMar>
     </w:tblPr>
     <w:tcPr>
       <w:shd w:val="clear" w:color="auto" w:fill="E6E6E6" w:themeFill="text1" w:themeFillTint="19"/>
@@ -13085,7 +12506,6 @@
     <w:tblPr>
       <w:tblStyleRowBandSize w:val="1"/>
       <w:tblStyleColBandSize w:val="1"/>
-      <w:tblInd w:w="0" w:type="dxa"/>
       <w:tblBorders>
         <w:top w:val="single" w:sz="24" w:space="0" w:color="C0504D" w:themeColor="accent2"/>
         <w:left w:val="single" w:sz="4" w:space="0" w:color="4F81BD" w:themeColor="accent1"/>
@@ -13094,12 +12514,6 @@
         <w:insideH w:val="single" w:sz="4" w:space="0" w:color="FFFFFF" w:themeColor="background1"/>
         <w:insideV w:val="single" w:sz="4" w:space="0" w:color="FFFFFF" w:themeColor="background1"/>
       </w:tblBorders>
-      <w:tblCellMar>
-        <w:top w:w="0" w:type="dxa"/>
-        <w:left w:w="108" w:type="dxa"/>
-        <w:bottom w:w="0" w:type="dxa"/>
-        <w:right w:w="108" w:type="dxa"/>
-      </w:tblCellMar>
     </w:tblPr>
     <w:tcPr>
       <w:shd w:val="clear" w:color="auto" w:fill="EDF2F8" w:themeFill="accent1" w:themeFillTint="19"/>
@@ -13207,7 +12621,6 @@
     <w:tblPr>
       <w:tblStyleRowBandSize w:val="1"/>
       <w:tblStyleColBandSize w:val="1"/>
-      <w:tblInd w:w="0" w:type="dxa"/>
       <w:tblBorders>
         <w:top w:val="single" w:sz="24" w:space="0" w:color="C0504D" w:themeColor="accent2"/>
         <w:left w:val="single" w:sz="4" w:space="0" w:color="C0504D" w:themeColor="accent2"/>
@@ -13216,12 +12629,6 @@
         <w:insideH w:val="single" w:sz="4" w:space="0" w:color="FFFFFF" w:themeColor="background1"/>
         <w:insideV w:val="single" w:sz="4" w:space="0" w:color="FFFFFF" w:themeColor="background1"/>
       </w:tblBorders>
-      <w:tblCellMar>
-        <w:top w:w="0" w:type="dxa"/>
-        <w:left w:w="108" w:type="dxa"/>
-        <w:bottom w:w="0" w:type="dxa"/>
-        <w:right w:w="108" w:type="dxa"/>
-      </w:tblCellMar>
     </w:tblPr>
     <w:tcPr>
       <w:shd w:val="clear" w:color="auto" w:fill="F8EDED" w:themeFill="accent2" w:themeFillTint="19"/>
@@ -13329,7 +12736,6 @@
     <w:tblPr>
       <w:tblStyleRowBandSize w:val="1"/>
       <w:tblStyleColBandSize w:val="1"/>
-      <w:tblInd w:w="0" w:type="dxa"/>
       <w:tblBorders>
         <w:top w:val="single" w:sz="24" w:space="0" w:color="8064A2" w:themeColor="accent4"/>
         <w:left w:val="single" w:sz="4" w:space="0" w:color="9BBB59" w:themeColor="accent3"/>
@@ -13338,12 +12744,6 @@
         <w:insideH w:val="single" w:sz="4" w:space="0" w:color="FFFFFF" w:themeColor="background1"/>
         <w:insideV w:val="single" w:sz="4" w:space="0" w:color="FFFFFF" w:themeColor="background1"/>
       </w:tblBorders>
-      <w:tblCellMar>
-        <w:top w:w="0" w:type="dxa"/>
-        <w:left w:w="108" w:type="dxa"/>
-        <w:bottom w:w="0" w:type="dxa"/>
-        <w:right w:w="108" w:type="dxa"/>
-      </w:tblCellMar>
     </w:tblPr>
     <w:tcPr>
       <w:shd w:val="clear" w:color="auto" w:fill="F5F8EE" w:themeFill="accent3" w:themeFillTint="19"/>
@@ -13441,7 +12841,6 @@
     <w:tblPr>
       <w:tblStyleRowBandSize w:val="1"/>
       <w:tblStyleColBandSize w:val="1"/>
-      <w:tblInd w:w="0" w:type="dxa"/>
       <w:tblBorders>
         <w:top w:val="single" w:sz="24" w:space="0" w:color="9BBB59" w:themeColor="accent3"/>
         <w:left w:val="single" w:sz="4" w:space="0" w:color="8064A2" w:themeColor="accent4"/>
@@ -13450,12 +12849,6 @@
         <w:insideH w:val="single" w:sz="4" w:space="0" w:color="FFFFFF" w:themeColor="background1"/>
         <w:insideV w:val="single" w:sz="4" w:space="0" w:color="FFFFFF" w:themeColor="background1"/>
       </w:tblBorders>
-      <w:tblCellMar>
-        <w:top w:w="0" w:type="dxa"/>
-        <w:left w:w="108" w:type="dxa"/>
-        <w:bottom w:w="0" w:type="dxa"/>
-        <w:right w:w="108" w:type="dxa"/>
-      </w:tblCellMar>
     </w:tblPr>
     <w:tcPr>
       <w:shd w:val="clear" w:color="auto" w:fill="F2EFF6" w:themeFill="accent4" w:themeFillTint="19"/>
@@ -13563,7 +12956,6 @@
     <w:tblPr>
       <w:tblStyleRowBandSize w:val="1"/>
       <w:tblStyleColBandSize w:val="1"/>
-      <w:tblInd w:w="0" w:type="dxa"/>
       <w:tblBorders>
         <w:top w:val="single" w:sz="24" w:space="0" w:color="F79646" w:themeColor="accent6"/>
         <w:left w:val="single" w:sz="4" w:space="0" w:color="4BACC6" w:themeColor="accent5"/>
@@ -13572,12 +12964,6 @@
         <w:insideH w:val="single" w:sz="4" w:space="0" w:color="FFFFFF" w:themeColor="background1"/>
         <w:insideV w:val="single" w:sz="4" w:space="0" w:color="FFFFFF" w:themeColor="background1"/>
       </w:tblBorders>
-      <w:tblCellMar>
-        <w:top w:w="0" w:type="dxa"/>
-        <w:left w:w="108" w:type="dxa"/>
-        <w:bottom w:w="0" w:type="dxa"/>
-        <w:right w:w="108" w:type="dxa"/>
-      </w:tblCellMar>
     </w:tblPr>
     <w:tcPr>
       <w:shd w:val="clear" w:color="auto" w:fill="EDF6F9" w:themeFill="accent5" w:themeFillTint="19"/>
@@ -13685,7 +13071,6 @@
     <w:tblPr>
       <w:tblStyleRowBandSize w:val="1"/>
       <w:tblStyleColBandSize w:val="1"/>
-      <w:tblInd w:w="0" w:type="dxa"/>
       <w:tblBorders>
         <w:top w:val="single" w:sz="24" w:space="0" w:color="4BACC6" w:themeColor="accent5"/>
         <w:left w:val="single" w:sz="4" w:space="0" w:color="F79646" w:themeColor="accent6"/>
@@ -13694,12 +13079,6 @@
         <w:insideH w:val="single" w:sz="4" w:space="0" w:color="FFFFFF" w:themeColor="background1"/>
         <w:insideV w:val="single" w:sz="4" w:space="0" w:color="FFFFFF" w:themeColor="background1"/>
       </w:tblBorders>
-      <w:tblCellMar>
-        <w:top w:w="0" w:type="dxa"/>
-        <w:left w:w="108" w:type="dxa"/>
-        <w:bottom w:w="0" w:type="dxa"/>
-        <w:right w:w="108" w:type="dxa"/>
-      </w:tblCellMar>
     </w:tblPr>
     <w:tcPr>
       <w:shd w:val="clear" w:color="auto" w:fill="FEF4EC" w:themeFill="accent6" w:themeFillTint="19"/>
@@ -13807,13 +13186,6 @@
     <w:tblPr>
       <w:tblStyleRowBandSize w:val="1"/>
       <w:tblStyleColBandSize w:val="1"/>
-      <w:tblInd w:w="0" w:type="dxa"/>
-      <w:tblCellMar>
-        <w:top w:w="0" w:type="dxa"/>
-        <w:left w:w="108" w:type="dxa"/>
-        <w:bottom w:w="0" w:type="dxa"/>
-        <w:right w:w="108" w:type="dxa"/>
-      </w:tblCellMar>
     </w:tblPr>
     <w:tcPr>
       <w:shd w:val="clear" w:color="auto" w:fill="E6E6E6" w:themeFill="text1" w:themeFillTint="19"/>
@@ -13893,13 +13265,6 @@
     <w:tblPr>
       <w:tblStyleRowBandSize w:val="1"/>
       <w:tblStyleColBandSize w:val="1"/>
-      <w:tblInd w:w="0" w:type="dxa"/>
-      <w:tblCellMar>
-        <w:top w:w="0" w:type="dxa"/>
-        <w:left w:w="108" w:type="dxa"/>
-        <w:bottom w:w="0" w:type="dxa"/>
-        <w:right w:w="108" w:type="dxa"/>
-      </w:tblCellMar>
     </w:tblPr>
     <w:tcPr>
       <w:shd w:val="clear" w:color="auto" w:fill="EDF2F8" w:themeFill="accent1" w:themeFillTint="19"/>
@@ -13979,13 +13344,6 @@
     <w:tblPr>
       <w:tblStyleRowBandSize w:val="1"/>
       <w:tblStyleColBandSize w:val="1"/>
-      <w:tblInd w:w="0" w:type="dxa"/>
-      <w:tblCellMar>
-        <w:top w:w="0" w:type="dxa"/>
-        <w:left w:w="108" w:type="dxa"/>
-        <w:bottom w:w="0" w:type="dxa"/>
-        <w:right w:w="108" w:type="dxa"/>
-      </w:tblCellMar>
     </w:tblPr>
     <w:tcPr>
       <w:shd w:val="clear" w:color="auto" w:fill="F8EDED" w:themeFill="accent2" w:themeFillTint="19"/>
@@ -14065,13 +13423,6 @@
     <w:tblPr>
       <w:tblStyleRowBandSize w:val="1"/>
       <w:tblStyleColBandSize w:val="1"/>
-      <w:tblInd w:w="0" w:type="dxa"/>
-      <w:tblCellMar>
-        <w:top w:w="0" w:type="dxa"/>
-        <w:left w:w="108" w:type="dxa"/>
-        <w:bottom w:w="0" w:type="dxa"/>
-        <w:right w:w="108" w:type="dxa"/>
-      </w:tblCellMar>
     </w:tblPr>
     <w:tcPr>
       <w:shd w:val="clear" w:color="auto" w:fill="F5F8EE" w:themeFill="accent3" w:themeFillTint="19"/>
@@ -14151,13 +13502,6 @@
     <w:tblPr>
       <w:tblStyleRowBandSize w:val="1"/>
       <w:tblStyleColBandSize w:val="1"/>
-      <w:tblInd w:w="0" w:type="dxa"/>
-      <w:tblCellMar>
-        <w:top w:w="0" w:type="dxa"/>
-        <w:left w:w="108" w:type="dxa"/>
-        <w:bottom w:w="0" w:type="dxa"/>
-        <w:right w:w="108" w:type="dxa"/>
-      </w:tblCellMar>
     </w:tblPr>
     <w:tcPr>
       <w:shd w:val="clear" w:color="auto" w:fill="F2EFF6" w:themeFill="accent4" w:themeFillTint="19"/>
@@ -14237,13 +13581,6 @@
     <w:tblPr>
       <w:tblStyleRowBandSize w:val="1"/>
       <w:tblStyleColBandSize w:val="1"/>
-      <w:tblInd w:w="0" w:type="dxa"/>
-      <w:tblCellMar>
-        <w:top w:w="0" w:type="dxa"/>
-        <w:left w:w="108" w:type="dxa"/>
-        <w:bottom w:w="0" w:type="dxa"/>
-        <w:right w:w="108" w:type="dxa"/>
-      </w:tblCellMar>
     </w:tblPr>
     <w:tcPr>
       <w:shd w:val="clear" w:color="auto" w:fill="EDF6F9" w:themeFill="accent5" w:themeFillTint="19"/>
@@ -14323,13 +13660,6 @@
     <w:tblPr>
       <w:tblStyleRowBandSize w:val="1"/>
       <w:tblStyleColBandSize w:val="1"/>
-      <w:tblInd w:w="0" w:type="dxa"/>
-      <w:tblCellMar>
-        <w:top w:w="0" w:type="dxa"/>
-        <w:left w:w="108" w:type="dxa"/>
-        <w:bottom w:w="0" w:type="dxa"/>
-        <w:right w:w="108" w:type="dxa"/>
-      </w:tblCellMar>
     </w:tblPr>
     <w:tcPr>
       <w:shd w:val="clear" w:color="auto" w:fill="FEF4EC" w:themeFill="accent6" w:themeFillTint="19"/>
@@ -14409,16 +13739,9 @@
     <w:tblPr>
       <w:tblStyleRowBandSize w:val="1"/>
       <w:tblStyleColBandSize w:val="1"/>
-      <w:tblInd w:w="0" w:type="dxa"/>
       <w:tblBorders>
         <w:insideH w:val="single" w:sz="4" w:space="0" w:color="FFFFFF" w:themeColor="background1"/>
       </w:tblBorders>
-      <w:tblCellMar>
-        <w:top w:w="0" w:type="dxa"/>
-        <w:left w:w="108" w:type="dxa"/>
-        <w:bottom w:w="0" w:type="dxa"/>
-        <w:right w:w="108" w:type="dxa"/>
-      </w:tblCellMar>
     </w:tblPr>
     <w:tcPr>
       <w:shd w:val="clear" w:color="auto" w:fill="CCCCCC" w:themeFill="text1" w:themeFillTint="33"/>
@@ -14489,16 +13812,9 @@
     <w:tblPr>
       <w:tblStyleRowBandSize w:val="1"/>
       <w:tblStyleColBandSize w:val="1"/>
-      <w:tblInd w:w="0" w:type="dxa"/>
       <w:tblBorders>
         <w:insideH w:val="single" w:sz="4" w:space="0" w:color="FFFFFF" w:themeColor="background1"/>
       </w:tblBorders>
-      <w:tblCellMar>
-        <w:top w:w="0" w:type="dxa"/>
-        <w:left w:w="108" w:type="dxa"/>
-        <w:bottom w:w="0" w:type="dxa"/>
-        <w:right w:w="108" w:type="dxa"/>
-      </w:tblCellMar>
     </w:tblPr>
     <w:tcPr>
       <w:shd w:val="clear" w:color="auto" w:fill="DBE5F1" w:themeFill="accent1" w:themeFillTint="33"/>
@@ -14569,16 +13885,9 @@
     <w:tblPr>
       <w:tblStyleRowBandSize w:val="1"/>
       <w:tblStyleColBandSize w:val="1"/>
-      <w:tblInd w:w="0" w:type="dxa"/>
       <w:tblBorders>
         <w:insideH w:val="single" w:sz="4" w:space="0" w:color="FFFFFF" w:themeColor="background1"/>
       </w:tblBorders>
-      <w:tblCellMar>
-        <w:top w:w="0" w:type="dxa"/>
-        <w:left w:w="108" w:type="dxa"/>
-        <w:bottom w:w="0" w:type="dxa"/>
-        <w:right w:w="108" w:type="dxa"/>
-      </w:tblCellMar>
     </w:tblPr>
     <w:tcPr>
       <w:shd w:val="clear" w:color="auto" w:fill="F2DBDB" w:themeFill="accent2" w:themeFillTint="33"/>
@@ -14649,16 +13958,9 @@
     <w:tblPr>
       <w:tblStyleRowBandSize w:val="1"/>
       <w:tblStyleColBandSize w:val="1"/>
-      <w:tblInd w:w="0" w:type="dxa"/>
       <w:tblBorders>
         <w:insideH w:val="single" w:sz="4" w:space="0" w:color="FFFFFF" w:themeColor="background1"/>
       </w:tblBorders>
-      <w:tblCellMar>
-        <w:top w:w="0" w:type="dxa"/>
-        <w:left w:w="108" w:type="dxa"/>
-        <w:bottom w:w="0" w:type="dxa"/>
-        <w:right w:w="108" w:type="dxa"/>
-      </w:tblCellMar>
     </w:tblPr>
     <w:tcPr>
       <w:shd w:val="clear" w:color="auto" w:fill="EAF1DD" w:themeFill="accent3" w:themeFillTint="33"/>
@@ -14729,16 +14031,9 @@
     <w:tblPr>
       <w:tblStyleRowBandSize w:val="1"/>
       <w:tblStyleColBandSize w:val="1"/>
-      <w:tblInd w:w="0" w:type="dxa"/>
       <w:tblBorders>
         <w:insideH w:val="single" w:sz="4" w:space="0" w:color="FFFFFF" w:themeColor="background1"/>
       </w:tblBorders>
-      <w:tblCellMar>
-        <w:top w:w="0" w:type="dxa"/>
-        <w:left w:w="108" w:type="dxa"/>
-        <w:bottom w:w="0" w:type="dxa"/>
-        <w:right w:w="108" w:type="dxa"/>
-      </w:tblCellMar>
     </w:tblPr>
     <w:tcPr>
       <w:shd w:val="clear" w:color="auto" w:fill="E5DFEC" w:themeFill="accent4" w:themeFillTint="33"/>
@@ -14809,16 +14104,9 @@
     <w:tblPr>
       <w:tblStyleRowBandSize w:val="1"/>
       <w:tblStyleColBandSize w:val="1"/>
-      <w:tblInd w:w="0" w:type="dxa"/>
       <w:tblBorders>
         <w:insideH w:val="single" w:sz="4" w:space="0" w:color="FFFFFF" w:themeColor="background1"/>
       </w:tblBorders>
-      <w:tblCellMar>
-        <w:top w:w="0" w:type="dxa"/>
-        <w:left w:w="108" w:type="dxa"/>
-        <w:bottom w:w="0" w:type="dxa"/>
-        <w:right w:w="108" w:type="dxa"/>
-      </w:tblCellMar>
     </w:tblPr>
     <w:tcPr>
       <w:shd w:val="clear" w:color="auto" w:fill="DAEEF3" w:themeFill="accent5" w:themeFillTint="33"/>
@@ -14889,16 +14177,9 @@
     <w:tblPr>
       <w:tblStyleRowBandSize w:val="1"/>
       <w:tblStyleColBandSize w:val="1"/>
-      <w:tblInd w:w="0" w:type="dxa"/>
       <w:tblBorders>
         <w:insideH w:val="single" w:sz="4" w:space="0" w:color="FFFFFF" w:themeColor="background1"/>
       </w:tblBorders>
-      <w:tblCellMar>
-        <w:top w:w="0" w:type="dxa"/>
-        <w:left w:w="108" w:type="dxa"/>
-        <w:bottom w:w="0" w:type="dxa"/>
-        <w:right w:w="108" w:type="dxa"/>
-      </w:tblCellMar>
     </w:tblPr>
     <w:tcPr>
       <w:shd w:val="clear" w:color="auto" w:fill="FDE9D9" w:themeFill="accent6" w:themeFillTint="33"/>

</xml_diff>

<commit_message>
Uncheck Note book assessment tool for CSE 3172 and CSE 3252 COs
</commit_message>
<xml_diff>
--- a/48-CSE 3172_U.docx
+++ b/48-CSE 3172_U.docx
@@ -1241,7 +1241,7 @@
                 <w:szCs w:val="18"/>
                 <w:lang w:val="en"/>
               </w:rPr>
-              <w:t>☒</w:t>
+              <w:t>☐</w:t>
             </w:r>
             <w:r>
               <w:rPr>
@@ -1734,7 +1734,7 @@
                 <w:szCs w:val="18"/>
                 <w:lang w:val="en"/>
               </w:rPr>
-              <w:t>☒</w:t>
+              <w:t>☐</w:t>
             </w:r>
             <w:r>
               <w:rPr>
@@ -2227,7 +2227,7 @@
                 <w:szCs w:val="18"/>
                 <w:lang w:val="en"/>
               </w:rPr>
-              <w:t>☒</w:t>
+              <w:t>☐</w:t>
             </w:r>
             <w:r>
               <w:rPr>

</xml_diff>